<commit_message>
updated the final report with the new findings and conclusions
</commit_message>
<xml_diff>
--- a/Team 5 Credit Card Fraud Detection Final Report.docx
+++ b/Team 5 Credit Card Fraud Detection Final Report.docx
@@ -105,7 +105,7 @@
           <w:noProof/>
           <w:kern w:val="0"/>
         </w:rPr>
-        <w:pict w14:anchorId="4427ED1B">
+        <w:pict w14:anchorId="5064C533">
           <v:rect id="_x0000_i1032" alt="" style="width:468pt;height:.05pt;mso-width-percent:0;mso-height-percent:0;mso-width-percent:0;mso-height-percent:0" o:hralign="center" o:hrstd="t" o:hr="t" fillcolor="#a0a0a0" stroked="f"/>
         </w:pict>
       </w:r>
@@ -235,7 +235,7 @@
           <w:noProof/>
           <w:kern w:val="0"/>
         </w:rPr>
-        <w:pict w14:anchorId="0381564C">
+        <w:pict w14:anchorId="3EA89FFF">
           <v:rect id="_x0000_i1031" alt="" style="width:468pt;height:.05pt;mso-width-percent:0;mso-height-percent:0;mso-width-percent:0;mso-height-percent:0" o:hralign="center" o:hrstd="t" o:hr="t" fillcolor="#a0a0a0" stroked="f"/>
         </w:pict>
       </w:r>
@@ -315,160 +315,7 @@
           <w:kern w:val="0"/>
           <w14:ligatures w14:val="none"/>
         </w:rPr>
-        <w:t xml:space="preserve">Credit card fraud is one of the most </w:t>
-      </w:r>
-      <w:r>
-        <w:rPr>
-          <w:rFonts w:ascii="Times New Roman" w:eastAsia="Times New Roman" w:hAnsi="Times New Roman" w:cs="Times New Roman"/>
-          <w:color w:val="000000"/>
-          <w:kern w:val="0"/>
-          <w14:ligatures w14:val="none"/>
-        </w:rPr>
-        <w:t xml:space="preserve">pressing </w:t>
-      </w:r>
-      <w:r>
-        <w:rPr>
-          <w:rFonts w:ascii="Times New Roman" w:eastAsia="Times New Roman" w:hAnsi="Times New Roman" w:cs="Times New Roman"/>
-          <w:color w:val="000000"/>
-          <w:kern w:val="0"/>
-          <w14:ligatures w14:val="none"/>
-        </w:rPr>
-        <w:t xml:space="preserve">and expensive </w:t>
-      </w:r>
-      <w:r>
-        <w:rPr>
-          <w:rFonts w:ascii="Times New Roman" w:eastAsia="Times New Roman" w:hAnsi="Times New Roman" w:cs="Times New Roman"/>
-          <w:color w:val="000000"/>
-          <w:kern w:val="0"/>
-          <w14:ligatures w14:val="none"/>
-        </w:rPr>
-        <w:t xml:space="preserve">challenges </w:t>
-      </w:r>
-      <w:r>
-        <w:rPr>
-          <w:rFonts w:ascii="Times New Roman" w:eastAsia="Times New Roman" w:hAnsi="Times New Roman" w:cs="Times New Roman"/>
-          <w:color w:val="000000"/>
-          <w:kern w:val="0"/>
-          <w14:ligatures w14:val="none"/>
-        </w:rPr>
-        <w:t>t</w:t>
-      </w:r>
-      <w:r>
-        <w:rPr>
-          <w:rFonts w:ascii="Times New Roman" w:eastAsia="Times New Roman" w:hAnsi="Times New Roman" w:cs="Times New Roman"/>
-          <w:color w:val="000000"/>
-          <w:kern w:val="0"/>
-          <w14:ligatures w14:val="none"/>
-        </w:rPr>
-        <w:t xml:space="preserve">he financial </w:t>
-      </w:r>
-      <w:r>
-        <w:rPr>
-          <w:rFonts w:ascii="Times New Roman" w:eastAsia="Times New Roman" w:hAnsi="Times New Roman" w:cs="Times New Roman"/>
-          <w:color w:val="000000"/>
-          <w:kern w:val="0"/>
-          <w14:ligatures w14:val="none"/>
-        </w:rPr>
-        <w:t>industry must deal with.</w:t>
-      </w:r>
-      <w:r>
-        <w:rPr>
-          <w:rFonts w:ascii="Times New Roman" w:eastAsia="Times New Roman" w:hAnsi="Times New Roman" w:cs="Times New Roman"/>
-          <w:color w:val="000000"/>
-          <w:kern w:val="0"/>
-          <w14:ligatures w14:val="none"/>
-        </w:rPr>
-        <w:t xml:space="preserve"> As digital payment </w:t>
-      </w:r>
-      <w:r>
-        <w:rPr>
-          <w:rFonts w:ascii="Times New Roman" w:eastAsia="Times New Roman" w:hAnsi="Times New Roman" w:cs="Times New Roman"/>
-          <w:color w:val="000000"/>
-          <w:kern w:val="0"/>
-          <w14:ligatures w14:val="none"/>
-        </w:rPr>
-        <w:t>usage</w:t>
-      </w:r>
-      <w:r>
-        <w:rPr>
-          <w:rFonts w:ascii="Times New Roman" w:eastAsia="Times New Roman" w:hAnsi="Times New Roman" w:cs="Times New Roman"/>
-          <w:color w:val="000000"/>
-          <w:kern w:val="0"/>
-          <w14:ligatures w14:val="none"/>
-        </w:rPr>
-        <w:t xml:space="preserve"> </w:t>
-      </w:r>
-      <w:r>
-        <w:rPr>
-          <w:rFonts w:ascii="Times New Roman" w:eastAsia="Times New Roman" w:hAnsi="Times New Roman" w:cs="Times New Roman"/>
-          <w:color w:val="000000"/>
-          <w:kern w:val="0"/>
-          <w14:ligatures w14:val="none"/>
-        </w:rPr>
-        <w:t>increases</w:t>
-      </w:r>
-      <w:r>
-        <w:rPr>
-          <w:rFonts w:ascii="Times New Roman" w:eastAsia="Times New Roman" w:hAnsi="Times New Roman" w:cs="Times New Roman"/>
-          <w:color w:val="000000"/>
-          <w:kern w:val="0"/>
-          <w14:ligatures w14:val="none"/>
-        </w:rPr>
-        <w:t xml:space="preserve"> worldwide, the volume and </w:t>
-      </w:r>
-      <w:r>
-        <w:rPr>
-          <w:rFonts w:ascii="Times New Roman" w:eastAsia="Times New Roman" w:hAnsi="Times New Roman" w:cs="Times New Roman"/>
-          <w:color w:val="000000"/>
-          <w:kern w:val="0"/>
-          <w14:ligatures w14:val="none"/>
-        </w:rPr>
-        <w:t>complexity</w:t>
-      </w:r>
-      <w:r>
-        <w:rPr>
-          <w:rFonts w:ascii="Times New Roman" w:eastAsia="Times New Roman" w:hAnsi="Times New Roman" w:cs="Times New Roman"/>
-          <w:color w:val="000000"/>
-          <w:kern w:val="0"/>
-          <w14:ligatures w14:val="none"/>
-        </w:rPr>
-        <w:t xml:space="preserve"> of fraud activit</w:t>
-      </w:r>
-      <w:r>
-        <w:rPr>
-          <w:rFonts w:ascii="Times New Roman" w:eastAsia="Times New Roman" w:hAnsi="Times New Roman" w:cs="Times New Roman"/>
-          <w:color w:val="000000"/>
-          <w:kern w:val="0"/>
-          <w14:ligatures w14:val="none"/>
-        </w:rPr>
-        <w:t>ies</w:t>
-      </w:r>
-      <w:r>
-        <w:rPr>
-          <w:rFonts w:ascii="Times New Roman" w:eastAsia="Times New Roman" w:hAnsi="Times New Roman" w:cs="Times New Roman"/>
-          <w:color w:val="000000"/>
-          <w:kern w:val="0"/>
-          <w14:ligatures w14:val="none"/>
-        </w:rPr>
-        <w:t xml:space="preserve"> has grown </w:t>
-      </w:r>
-      <w:r>
-        <w:rPr>
-          <w:rFonts w:ascii="Times New Roman" w:eastAsia="Times New Roman" w:hAnsi="Times New Roman" w:cs="Times New Roman"/>
-          <w:color w:val="000000"/>
-          <w:kern w:val="0"/>
-          <w14:ligatures w14:val="none"/>
-        </w:rPr>
-        <w:t>extensively</w:t>
-      </w:r>
-      <w:r>
-        <w:rPr>
-          <w:rFonts w:ascii="Times New Roman" w:eastAsia="Times New Roman" w:hAnsi="Times New Roman" w:cs="Times New Roman"/>
-          <w:color w:val="000000"/>
-          <w:kern w:val="0"/>
-          <w14:ligatures w14:val="none"/>
-        </w:rPr>
-        <w:t xml:space="preserve">. According to industry reports, credit card fraud accounts for billions of dollars in losses annually, affecting consumers, merchants, and financial institutions. There are two dominant forms of credit card fraud: </w:t>
+        <w:t>Credit card fraud is one of the most pressing and expensive challenges the financial industry must deal with. As digital payment usage increases worldwide, the volume and complexity of fraud activities has grown extensively. According to industry reports, credit card fraud accounts for billions of dollars in losses annually, affecting consumers, merchants, and financial institutions. There are two dominant forms of credit card fraud:</w:t>
       </w:r>
     </w:p>
     <w:p>
@@ -1176,7 +1023,25 @@
           <w:kern w:val="0"/>
           <w14:ligatures w14:val="none"/>
         </w:rPr>
-        <w:t xml:space="preserve"> is foundationa to the modern economy</w:t>
+        <w:t xml:space="preserve"> is </w:t>
+      </w:r>
+      <w:r>
+        <w:rPr>
+          <w:rFonts w:ascii="Times New Roman" w:eastAsia="Times New Roman" w:hAnsi="Times New Roman" w:cs="Times New Roman"/>
+          <w:color w:val="000000"/>
+          <w:kern w:val="0"/>
+          <w14:ligatures w14:val="none"/>
+        </w:rPr>
+        <w:t>foundation</w:t>
+      </w:r>
+      <w:r>
+        <w:rPr>
+          <w:rFonts w:ascii="Times New Roman" w:eastAsia="Times New Roman" w:hAnsi="Times New Roman" w:cs="Times New Roman"/>
+          <w:color w:val="000000"/>
+          <w:kern w:val="0"/>
+          <w14:ligatures w14:val="none"/>
+        </w:rPr>
+        <w:t xml:space="preserve"> to the modern economy</w:t>
       </w:r>
       <w:r>
         <w:rPr>
@@ -1259,25 +1124,7 @@
           <w:kern w:val="0"/>
           <w14:ligatures w14:val="none"/>
         </w:rPr>
-        <w:t xml:space="preserve"> transactions. This means that a</w:t>
-      </w:r>
-      <w:r>
-        <w:rPr>
-          <w:rFonts w:ascii="Times New Roman" w:eastAsia="Times New Roman" w:hAnsi="Times New Roman" w:cs="Times New Roman"/>
-          <w:color w:val="000000"/>
-          <w:kern w:val="0"/>
-          <w14:ligatures w14:val="none"/>
-        </w:rPr>
-        <w:t>n</w:t>
-      </w:r>
-      <w:r>
-        <w:rPr>
-          <w:rFonts w:ascii="Times New Roman" w:eastAsia="Times New Roman" w:hAnsi="Times New Roman" w:cs="Times New Roman"/>
-          <w:color w:val="000000"/>
-          <w:kern w:val="0"/>
-          <w14:ligatures w14:val="none"/>
-        </w:rPr>
-        <w:t xml:space="preserve"> simple model that always predicts "legitimate" achieves over 99.8% accuracy while detecting zero fraud cases</w:t>
+        <w:t xml:space="preserve"> transactions. This means that a simple model that always predicts "legitimate" achieves over 99.8% accuracy while detecting zero fraud cases</w:t>
       </w:r>
       <w:r>
         <w:rPr>
@@ -1661,7 +1508,25 @@
           <w:kern w:val="0"/>
           <w14:ligatures w14:val="none"/>
         </w:rPr>
-        <w:t>with a practical business perspective on how it would actually be used.</w:t>
+        <w:t xml:space="preserve">with a practical business perspective on how it would </w:t>
+      </w:r>
+      <w:r>
+        <w:rPr>
+          <w:rFonts w:ascii="Times New Roman" w:eastAsia="Times New Roman" w:hAnsi="Times New Roman" w:cs="Times New Roman"/>
+          <w:color w:val="000000"/>
+          <w:kern w:val="0"/>
+          <w14:ligatures w14:val="none"/>
+        </w:rPr>
+        <w:t>be</w:t>
+      </w:r>
+      <w:r>
+        <w:rPr>
+          <w:rFonts w:ascii="Times New Roman" w:eastAsia="Times New Roman" w:hAnsi="Times New Roman" w:cs="Times New Roman"/>
+          <w:color w:val="000000"/>
+          <w:kern w:val="0"/>
+          <w14:ligatures w14:val="none"/>
+        </w:rPr>
+        <w:t xml:space="preserve"> used.</w:t>
       </w:r>
       <w:r>
         <w:rPr>
@@ -1669,30 +1534,10 @@
           <w:noProof/>
           <w:kern w:val="0"/>
         </w:rPr>
-        <w:pict w14:anchorId="7636CB35">
-          <v:rect id="_x0000_i1030" alt="" style="width:431.95pt;height:.05pt;mso-width-percent:0;mso-height-percent:0;mso-width-percent:0;mso-height-percent:0" o:hrpct="923" o:hralign="center" o:hrstd="t" o:hr="t" fillcolor="#a0a0a0" stroked="f"/>
+        <w:pict w14:anchorId="6D3FCE46">
+          <v:rect id="_x0000_i1030" alt="" style="width:398.75pt;height:.05pt;mso-width-percent:0;mso-height-percent:0;mso-width-percent:0;mso-height-percent:0" o:hrpct="852" o:hralign="center" o:hrstd="t" o:hr="t" fillcolor="#a0a0a0" stroked="f"/>
         </w:pict>
       </w:r>
-    </w:p>
-    <w:p>
-      <w:pPr>
-        <w:spacing w:after="0" w:line="240" w:lineRule="auto"/>
-        <w:rPr>
-          <w:rFonts w:ascii="Times New Roman" w:eastAsia="Times New Roman" w:hAnsi="Times New Roman" w:cs="Times New Roman"/>
-          <w:kern w:val="0"/>
-          <w14:ligatures w14:val="none"/>
-        </w:rPr>
-      </w:pPr>
-    </w:p>
-    <w:p>
-      <w:pPr>
-        <w:spacing w:after="0" w:line="240" w:lineRule="auto"/>
-        <w:rPr>
-          <w:rFonts w:ascii="Times New Roman" w:eastAsia="Times New Roman" w:hAnsi="Times New Roman" w:cs="Times New Roman"/>
-          <w:kern w:val="0"/>
-          <w14:ligatures w14:val="none"/>
-        </w:rPr>
-      </w:pPr>
     </w:p>
     <w:p>
       <w:pPr>
@@ -1760,6 +1605,7 @@
           <w:szCs w:val="36"/>
           <w14:ligatures w14:val="none"/>
         </w:rPr>
+        <w:lastRenderedPageBreak/>
         <w:t>2. Methodology</w:t>
       </w:r>
     </w:p>
@@ -2804,25 +2650,7 @@
           <w:kern w:val="0"/>
           <w14:ligatures w14:val="none"/>
         </w:rPr>
-        <w:t xml:space="preserve">skewness values mostly under 0.5. We tried adding PowerTransformer and found it made barely any difference, so we left it out. We thought it was better to keep the pipeline simpler and justified rather than adding steps that don't </w:t>
-      </w:r>
-      <w:r>
-        <w:rPr>
-          <w:rFonts w:ascii="Times New Roman" w:eastAsia="Times New Roman" w:hAnsi="Times New Roman" w:cs="Times New Roman"/>
-          <w:color w:val="000000"/>
-          <w:kern w:val="0"/>
-          <w14:ligatures w14:val="none"/>
-        </w:rPr>
-        <w:t>help</w:t>
-      </w:r>
-      <w:r>
-        <w:rPr>
-          <w:rFonts w:ascii="Times New Roman" w:eastAsia="Times New Roman" w:hAnsi="Times New Roman" w:cs="Times New Roman"/>
-          <w:color w:val="000000"/>
-          <w:kern w:val="0"/>
-          <w14:ligatures w14:val="none"/>
-        </w:rPr>
-        <w:t>.</w:t>
+        <w:t>skewness values mostly under 0.5. We tried adding PowerTransformer and found it made barely any difference, so we left it out. We thought it was better to keep the pipeline simpler and justified rather than adding steps that don't help.</w:t>
       </w:r>
     </w:p>
     <w:p>
@@ -2932,25 +2760,7 @@
           <w:kern w:val="0"/>
           <w14:ligatures w14:val="none"/>
         </w:rPr>
-        <w:t xml:space="preserve"> a lot of attention to, especially around the order of operations. It's easy to accidentally introduce data leakage if you're not careful and we wanted to make sure our evaluation results were </w:t>
-      </w:r>
-      <w:r>
-        <w:rPr>
-          <w:rFonts w:ascii="Times New Roman" w:eastAsia="Times New Roman" w:hAnsi="Times New Roman" w:cs="Times New Roman"/>
-          <w:color w:val="000000"/>
-          <w:kern w:val="0"/>
-          <w14:ligatures w14:val="none"/>
-        </w:rPr>
-        <w:t>trustworthy</w:t>
-      </w:r>
-      <w:r>
-        <w:rPr>
-          <w:rFonts w:ascii="Times New Roman" w:eastAsia="Times New Roman" w:hAnsi="Times New Roman" w:cs="Times New Roman"/>
-          <w:color w:val="000000"/>
-          <w:kern w:val="0"/>
-          <w14:ligatures w14:val="none"/>
-        </w:rPr>
-        <w:t>.</w:t>
+        <w:t xml:space="preserve"> a lot of attention to, especially around the order of operations. It's easy to accidentally introduce data leakage if you're not careful and we wanted to make sure our evaluation results were trustworthy.</w:t>
       </w:r>
     </w:p>
     <w:p>
@@ -3399,18 +3209,7 @@
           <w:kern w:val="0"/>
           <w14:ligatures w14:val="none"/>
         </w:rPr>
-        <w:t xml:space="preserve">Synthetic Minority Oversampling </w:t>
-      </w:r>
-      <w:r>
-        <w:rPr>
-          <w:rFonts w:ascii="Times New Roman" w:eastAsia="Times New Roman" w:hAnsi="Times New Roman" w:cs="Times New Roman"/>
-          <w:b/>
-          <w:bCs/>
-          <w:color w:val="000000"/>
-          <w:kern w:val="0"/>
-          <w14:ligatures w14:val="none"/>
-        </w:rPr>
-        <w:t>Technique</w:t>
+        <w:t>Synthetic Minority Oversampling Technique</w:t>
       </w:r>
       <w:r>
         <w:rPr>
@@ -3507,9 +3306,9 @@
           <w:kern w:val="0"/>
         </w:rPr>
         <w:drawing>
-          <wp:inline distT="0" distB="0" distL="0" distR="0" wp14:anchorId="09F20E3A" wp14:editId="10A35C55">
-            <wp:extent cx="5212080" cy="2567188"/>
-            <wp:effectExtent l="0" t="0" r="0" b="0"/>
+          <wp:inline distT="0" distB="0" distL="0" distR="0" wp14:anchorId="09F20E3A" wp14:editId="6757A5E4">
+            <wp:extent cx="5734861" cy="2824681"/>
+            <wp:effectExtent l="0" t="0" r="5715" b="0"/>
             <wp:docPr id="1695060207" name="Picture 5" descr="A graph showing a number of smotes&#10;&#10;AI-generated content may be incorrect."/>
             <wp:cNvGraphicFramePr>
               <a:graphicFrameLocks xmlns:a="http://schemas.openxmlformats.org/drawingml/2006/main" noChangeAspect="1"/>
@@ -3537,7 +3336,7 @@
                   <pic:spPr bwMode="auto">
                     <a:xfrm>
                       <a:off x="0" y="0"/>
-                      <a:ext cx="5262102" cy="2591826"/>
+                      <a:ext cx="5805028" cy="2859241"/>
                     </a:xfrm>
                     <a:prstGeom prst="rect">
                       <a:avLst/>
@@ -3561,6 +3360,17 @@
     <w:p>
       <w:pPr>
         <w:spacing w:before="100" w:beforeAutospacing="1" w:after="100" w:afterAutospacing="1" w:line="240" w:lineRule="auto"/>
+        <w:rPr>
+          <w:rFonts w:ascii="Times New Roman" w:eastAsia="Times New Roman" w:hAnsi="Times New Roman" w:cs="Times New Roman"/>
+          <w:color w:val="000000"/>
+          <w:kern w:val="0"/>
+          <w14:ligatures w14:val="none"/>
+        </w:rPr>
+      </w:pPr>
+    </w:p>
+    <w:p>
+      <w:pPr>
+        <w:spacing w:before="100" w:beforeAutospacing="1" w:after="100" w:afterAutospacing="1" w:line="240" w:lineRule="auto"/>
         <w:outlineLvl w:val="2"/>
         <w:rPr>
           <w:rFonts w:ascii="Times New Roman" w:eastAsia="Times New Roman" w:hAnsi="Times New Roman" w:cs="Times New Roman"/>
@@ -3584,457 +3394,9 @@
           <w:szCs w:val="27"/>
           <w14:ligatures w14:val="none"/>
         </w:rPr>
-        <w:t>2.3 Model Selection</w:t>
-      </w:r>
-    </w:p>
-    <w:p>
-      <w:pPr>
-        <w:spacing w:before="100" w:beforeAutospacing="1" w:after="100" w:afterAutospacing="1" w:line="240" w:lineRule="auto"/>
-        <w:rPr>
-          <w:rFonts w:ascii="Times New Roman" w:eastAsia="Times New Roman" w:hAnsi="Times New Roman" w:cs="Times New Roman"/>
-          <w:color w:val="000000"/>
-          <w:kern w:val="0"/>
-          <w14:ligatures w14:val="none"/>
-        </w:rPr>
-      </w:pPr>
-      <w:r>
-        <w:rPr>
-          <w:rFonts w:ascii="Times New Roman" w:eastAsia="Times New Roman" w:hAnsi="Times New Roman" w:cs="Times New Roman"/>
-          <w:color w:val="000000"/>
-          <w:kern w:val="0"/>
-          <w14:ligatures w14:val="none"/>
-        </w:rPr>
-        <w:t xml:space="preserve">We selected four supervised classification algorithms that collectively cover a </w:t>
-      </w:r>
-      <w:r>
-        <w:rPr>
-          <w:rFonts w:ascii="Times New Roman" w:eastAsia="Times New Roman" w:hAnsi="Times New Roman" w:cs="Times New Roman"/>
-          <w:color w:val="000000"/>
-          <w:kern w:val="0"/>
-          <w14:ligatures w14:val="none"/>
-        </w:rPr>
-        <w:t>wide</w:t>
-      </w:r>
-      <w:r>
-        <w:rPr>
-          <w:rFonts w:ascii="Times New Roman" w:eastAsia="Times New Roman" w:hAnsi="Times New Roman" w:cs="Times New Roman"/>
-          <w:color w:val="000000"/>
-          <w:kern w:val="0"/>
-          <w14:ligatures w14:val="none"/>
-        </w:rPr>
-        <w:t xml:space="preserve"> spectrum of ML approaches</w:t>
-      </w:r>
-      <w:r>
-        <w:rPr>
-          <w:rFonts w:ascii="Times New Roman" w:eastAsia="Times New Roman" w:hAnsi="Times New Roman" w:cs="Times New Roman"/>
-          <w:color w:val="000000"/>
-          <w:kern w:val="0"/>
-          <w14:ligatures w14:val="none"/>
-        </w:rPr>
-        <w:t>.</w:t>
-      </w:r>
-    </w:p>
-    <w:p>
-      <w:pPr>
-        <w:spacing w:before="100" w:beforeAutospacing="1" w:after="100" w:afterAutospacing="1" w:line="240" w:lineRule="auto"/>
-        <w:jc w:val="both"/>
-        <w:rPr>
-          <w:rFonts w:ascii="Times New Roman" w:eastAsia="Times New Roman" w:hAnsi="Times New Roman" w:cs="Times New Roman"/>
-          <w:color w:val="000000"/>
-          <w:kern w:val="0"/>
-          <w14:ligatures w14:val="none"/>
-        </w:rPr>
-      </w:pPr>
-      <w:r>
-        <w:rPr>
-          <w:rFonts w:ascii="Times New Roman" w:eastAsia="Times New Roman" w:hAnsi="Times New Roman" w:cs="Times New Roman"/>
-          <w:b/>
-          <w:bCs/>
-          <w:color w:val="000000"/>
-          <w:kern w:val="0"/>
-          <w14:ligatures w14:val="none"/>
-        </w:rPr>
-        <w:t>1.</w:t>
-      </w:r>
-      <w:r>
-        <w:rPr>
-          <w:rFonts w:ascii="Times New Roman" w:eastAsia="Times New Roman" w:hAnsi="Times New Roman" w:cs="Times New Roman"/>
-          <w:b/>
-          <w:bCs/>
-          <w:color w:val="000000"/>
-          <w:kern w:val="0"/>
-          <w14:ligatures w14:val="none"/>
-        </w:rPr>
-        <w:t>Logistic Regression</w:t>
-      </w:r>
-      <w:r>
-        <w:rPr>
-          <w:rFonts w:ascii="Times New Roman" w:eastAsia="Times New Roman" w:hAnsi="Times New Roman" w:cs="Times New Roman"/>
-          <w:color w:val="000000"/>
-          <w:kern w:val="0"/>
-          <w14:ligatures w14:val="none"/>
-        </w:rPr>
-        <w:t> </w:t>
-      </w:r>
-    </w:p>
-    <w:p>
-      <w:pPr>
-        <w:spacing w:before="100" w:beforeAutospacing="1" w:after="100" w:afterAutospacing="1" w:line="240" w:lineRule="auto"/>
-        <w:jc w:val="both"/>
-        <w:rPr>
-          <w:rFonts w:ascii="Times New Roman" w:eastAsia="Times New Roman" w:hAnsi="Times New Roman" w:cs="Times New Roman"/>
-          <w:color w:val="000000"/>
-          <w:kern w:val="0"/>
-          <w14:ligatures w14:val="none"/>
-        </w:rPr>
-      </w:pPr>
-      <w:r>
-        <w:rPr>
-          <w:rFonts w:ascii="Times New Roman" w:eastAsia="Times New Roman" w:hAnsi="Times New Roman" w:cs="Times New Roman"/>
-          <w:color w:val="000000"/>
-          <w:kern w:val="0"/>
-          <w14:ligatures w14:val="none"/>
-        </w:rPr>
-        <w:t>This model s</w:t>
-      </w:r>
-      <w:r>
-        <w:rPr>
-          <w:rFonts w:ascii="Times New Roman" w:eastAsia="Times New Roman" w:hAnsi="Times New Roman" w:cs="Times New Roman"/>
-          <w:color w:val="000000"/>
-          <w:kern w:val="0"/>
-          <w14:ligatures w14:val="none"/>
-        </w:rPr>
-        <w:t>erves as our interpretable baseline. It models fraud probability via a logistic function applied to a linear combination of features. Despite its simplicity, it is known to perform well on well-scaled, high-dimensional data</w:t>
-      </w:r>
-      <w:r>
-        <w:rPr>
-          <w:rFonts w:ascii="Times New Roman" w:eastAsia="Times New Roman" w:hAnsi="Times New Roman" w:cs="Times New Roman"/>
-          <w:color w:val="000000"/>
-          <w:kern w:val="0"/>
-          <w14:ligatures w14:val="none"/>
-        </w:rPr>
-        <w:t xml:space="preserve"> </w:t>
-      </w:r>
-      <w:r>
-        <w:rPr>
-          <w:rFonts w:ascii="Times New Roman" w:eastAsia="Times New Roman" w:hAnsi="Times New Roman" w:cs="Times New Roman"/>
-          <w:color w:val="000000"/>
-          <w:kern w:val="0"/>
-          <w14:ligatures w14:val="none"/>
-        </w:rPr>
-        <w:t>and provides a meaningful benchmark. We used GridSearchCV with StratifiedKFold (5 folds) to tune the regularization parameter C across the range [0.01, 0.1, 1, 10, 100], optimizing for ROC-AUC.</w:t>
-      </w:r>
-    </w:p>
-    <w:p>
-      <w:pPr>
-        <w:spacing w:before="100" w:beforeAutospacing="1" w:after="100" w:afterAutospacing="1" w:line="240" w:lineRule="auto"/>
-        <w:rPr>
-          <w:rFonts w:ascii="Times New Roman" w:eastAsia="Times New Roman" w:hAnsi="Times New Roman" w:cs="Times New Roman"/>
-          <w:color w:val="000000"/>
-          <w:kern w:val="0"/>
-          <w14:ligatures w14:val="none"/>
-        </w:rPr>
-      </w:pPr>
-      <w:r>
-        <w:rPr>
-          <w:rFonts w:ascii="Times New Roman" w:eastAsia="Times New Roman" w:hAnsi="Times New Roman" w:cs="Times New Roman"/>
-          <w:b/>
-          <w:bCs/>
-          <w:color w:val="000000"/>
-          <w:kern w:val="0"/>
-          <w14:ligatures w14:val="none"/>
-        </w:rPr>
         <w:t>2.</w:t>
       </w:r>
       <w:r>
-        <w:rPr>
-          <w:rFonts w:ascii="Times New Roman" w:eastAsia="Times New Roman" w:hAnsi="Times New Roman" w:cs="Times New Roman"/>
-          <w:b/>
-          <w:bCs/>
-          <w:color w:val="000000"/>
-          <w:kern w:val="0"/>
-          <w14:ligatures w14:val="none"/>
-        </w:rPr>
-        <w:t>Decision Tree</w:t>
-      </w:r>
-    </w:p>
-    <w:p>
-      <w:pPr>
-        <w:spacing w:before="100" w:beforeAutospacing="1" w:after="100" w:afterAutospacing="1" w:line="240" w:lineRule="auto"/>
-        <w:rPr>
-          <w:rFonts w:ascii="Times New Roman" w:eastAsia="Times New Roman" w:hAnsi="Times New Roman" w:cs="Times New Roman"/>
-          <w:color w:val="000000"/>
-          <w:kern w:val="0"/>
-          <w14:ligatures w14:val="none"/>
-        </w:rPr>
-      </w:pPr>
-      <w:r>
-        <w:rPr>
-          <w:rFonts w:ascii="Times New Roman" w:eastAsia="Times New Roman" w:hAnsi="Times New Roman" w:cs="Times New Roman"/>
-          <w:color w:val="000000"/>
-          <w:kern w:val="0"/>
-          <w14:ligatures w14:val="none"/>
-        </w:rPr>
-        <w:t xml:space="preserve">This </w:t>
-      </w:r>
-      <w:r>
-        <w:rPr>
-          <w:rFonts w:ascii="Times New Roman" w:eastAsia="Times New Roman" w:hAnsi="Times New Roman" w:cs="Times New Roman"/>
-          <w:color w:val="000000"/>
-          <w:kern w:val="0"/>
-          <w14:ligatures w14:val="none"/>
-        </w:rPr>
-        <w:t xml:space="preserve">is the most interpretable model in our </w:t>
-      </w:r>
-      <w:r>
-        <w:rPr>
-          <w:rFonts w:ascii="Times New Roman" w:eastAsia="Times New Roman" w:hAnsi="Times New Roman" w:cs="Times New Roman"/>
-          <w:color w:val="000000"/>
-          <w:kern w:val="0"/>
-          <w14:ligatures w14:val="none"/>
-        </w:rPr>
-        <w:t>project</w:t>
-      </w:r>
-      <w:r>
-        <w:rPr>
-          <w:rFonts w:ascii="Times New Roman" w:eastAsia="Times New Roman" w:hAnsi="Times New Roman" w:cs="Times New Roman"/>
-          <w:color w:val="000000"/>
-          <w:kern w:val="0"/>
-          <w14:ligatures w14:val="none"/>
-        </w:rPr>
-        <w:t>. It builds binary splits based on feature thresholds, and its structure can be directly visualized</w:t>
-      </w:r>
-      <w:r>
-        <w:rPr>
-          <w:rFonts w:ascii="Times New Roman" w:eastAsia="Times New Roman" w:hAnsi="Times New Roman" w:cs="Times New Roman"/>
-          <w:color w:val="000000"/>
-          <w:kern w:val="0"/>
-          <w14:ligatures w14:val="none"/>
-        </w:rPr>
-        <w:t xml:space="preserve">, </w:t>
-      </w:r>
-      <w:r>
-        <w:rPr>
-          <w:rFonts w:ascii="Times New Roman" w:eastAsia="Times New Roman" w:hAnsi="Times New Roman" w:cs="Times New Roman"/>
-          <w:color w:val="000000"/>
-          <w:kern w:val="0"/>
-          <w14:ligatures w14:val="none"/>
-        </w:rPr>
-        <w:t xml:space="preserve">allowing us to see exactly which features and values drive each fraud prediction. This is </w:t>
-      </w:r>
-      <w:r>
-        <w:rPr>
-          <w:rFonts w:ascii="Times New Roman" w:eastAsia="Times New Roman" w:hAnsi="Times New Roman" w:cs="Times New Roman"/>
-          <w:color w:val="000000"/>
-          <w:kern w:val="0"/>
-          <w14:ligatures w14:val="none"/>
-        </w:rPr>
-        <w:t>helpful</w:t>
-      </w:r>
-      <w:r>
-        <w:rPr>
-          <w:rFonts w:ascii="Times New Roman" w:eastAsia="Times New Roman" w:hAnsi="Times New Roman" w:cs="Times New Roman"/>
-          <w:color w:val="000000"/>
-          <w:kern w:val="0"/>
-          <w14:ligatures w14:val="none"/>
-        </w:rPr>
-        <w:t xml:space="preserve"> for explaining model behavior to non-technical stakeholders. We tuned max_depth, min_samples_split, and min_samples_leaf via GridSearchCV. Notably, Decision Trees do not require feature scaling since they use threshold-based splits rather than distance calculations.</w:t>
-      </w:r>
-    </w:p>
-    <w:p>
-      <w:pPr>
-        <w:spacing w:before="100" w:beforeAutospacing="1" w:after="100" w:afterAutospacing="1" w:line="240" w:lineRule="auto"/>
-        <w:rPr>
-          <w:rFonts w:ascii="Times New Roman" w:eastAsia="Times New Roman" w:hAnsi="Times New Roman" w:cs="Times New Roman"/>
-          <w:color w:val="000000"/>
-          <w:kern w:val="0"/>
-          <w14:ligatures w14:val="none"/>
-        </w:rPr>
-      </w:pPr>
-      <w:r>
-        <w:rPr>
-          <w:rFonts w:ascii="Times New Roman" w:eastAsia="Times New Roman" w:hAnsi="Times New Roman" w:cs="Times New Roman"/>
-          <w:b/>
-          <w:bCs/>
-          <w:color w:val="000000"/>
-          <w:kern w:val="0"/>
-          <w14:ligatures w14:val="none"/>
-        </w:rPr>
-        <w:lastRenderedPageBreak/>
-        <w:t>3.</w:t>
-      </w:r>
-      <w:r>
-        <w:rPr>
-          <w:rFonts w:ascii="Times New Roman" w:eastAsia="Times New Roman" w:hAnsi="Times New Roman" w:cs="Times New Roman"/>
-          <w:b/>
-          <w:bCs/>
-          <w:color w:val="000000"/>
-          <w:kern w:val="0"/>
-          <w14:ligatures w14:val="none"/>
-        </w:rPr>
-        <w:t>Random Forest</w:t>
-      </w:r>
-      <w:r>
-        <w:rPr>
-          <w:rFonts w:ascii="Times New Roman" w:eastAsia="Times New Roman" w:hAnsi="Times New Roman" w:cs="Times New Roman"/>
-          <w:color w:val="000000"/>
-          <w:kern w:val="0"/>
-          <w14:ligatures w14:val="none"/>
-        </w:rPr>
-        <w:t> </w:t>
-      </w:r>
-    </w:p>
-    <w:p>
-      <w:pPr>
-        <w:spacing w:before="100" w:beforeAutospacing="1" w:after="100" w:afterAutospacing="1" w:line="240" w:lineRule="auto"/>
-        <w:rPr>
-          <w:rFonts w:ascii="Times New Roman" w:eastAsia="Times New Roman" w:hAnsi="Times New Roman" w:cs="Times New Roman"/>
-          <w:color w:val="000000"/>
-          <w:kern w:val="0"/>
-          <w14:ligatures w14:val="none"/>
-        </w:rPr>
-      </w:pPr>
-      <w:r>
-        <w:rPr>
-          <w:rFonts w:ascii="Times New Roman" w:eastAsia="Times New Roman" w:hAnsi="Times New Roman" w:cs="Times New Roman"/>
-          <w:color w:val="000000"/>
-          <w:kern w:val="0"/>
-          <w14:ligatures w14:val="none"/>
-        </w:rPr>
-        <w:t xml:space="preserve">It </w:t>
-      </w:r>
-      <w:r>
-        <w:rPr>
-          <w:rFonts w:ascii="Times New Roman" w:eastAsia="Times New Roman" w:hAnsi="Times New Roman" w:cs="Times New Roman"/>
-          <w:color w:val="000000"/>
-          <w:kern w:val="0"/>
-          <w14:ligatures w14:val="none"/>
-        </w:rPr>
-        <w:t xml:space="preserve">is an ensemble method that trains multiple decision trees on random bootstrap samples with random feature subsets. The diversity among trees reduces overfitting compared to a single Decision Tree and provides strong generalization on complex, noisy data. An additional benefit is </w:t>
-      </w:r>
-      <w:r>
-        <w:rPr>
-          <w:rFonts w:ascii="Times New Roman" w:eastAsia="Times New Roman" w:hAnsi="Times New Roman" w:cs="Times New Roman"/>
-          <w:color w:val="000000"/>
-          <w:kern w:val="0"/>
-          <w14:ligatures w14:val="none"/>
-        </w:rPr>
-        <w:t>featuring</w:t>
-      </w:r>
-      <w:r>
-        <w:rPr>
-          <w:rFonts w:ascii="Times New Roman" w:eastAsia="Times New Roman" w:hAnsi="Times New Roman" w:cs="Times New Roman"/>
-          <w:color w:val="000000"/>
-          <w:kern w:val="0"/>
-          <w14:ligatures w14:val="none"/>
-        </w:rPr>
-        <w:t xml:space="preserve"> importance scores, which quantify each PCA component's contribution to fraud prediction. Due to computational constraints on a 450K SMOTE-balanced dataset, Random Forest was trained with fixed hyperparameters (n_estimators=50, max_depth=10, min_samples_leaf=50).</w:t>
-      </w:r>
-    </w:p>
-    <w:p>
-      <w:pPr>
-        <w:spacing w:before="100" w:beforeAutospacing="1" w:after="100" w:afterAutospacing="1" w:line="240" w:lineRule="auto"/>
-        <w:rPr>
-          <w:rFonts w:ascii="Times New Roman" w:eastAsia="Times New Roman" w:hAnsi="Times New Roman" w:cs="Times New Roman"/>
-          <w:color w:val="000000"/>
-          <w:kern w:val="0"/>
-          <w14:ligatures w14:val="none"/>
-        </w:rPr>
-      </w:pPr>
-      <w:r>
-        <w:rPr>
-          <w:rFonts w:ascii="Times New Roman" w:eastAsia="Times New Roman" w:hAnsi="Times New Roman" w:cs="Times New Roman"/>
-          <w:b/>
-          <w:bCs/>
-          <w:color w:val="000000"/>
-          <w:kern w:val="0"/>
-          <w14:ligatures w14:val="none"/>
-        </w:rPr>
-        <w:t>4.</w:t>
-      </w:r>
-      <w:r>
-        <w:rPr>
-          <w:rFonts w:ascii="Times New Roman" w:eastAsia="Times New Roman" w:hAnsi="Times New Roman" w:cs="Times New Roman"/>
-          <w:b/>
-          <w:bCs/>
-          <w:color w:val="000000"/>
-          <w:kern w:val="0"/>
-          <w14:ligatures w14:val="none"/>
-        </w:rPr>
-        <w:t>K-Nearest Neighbors (KNN)</w:t>
-      </w:r>
-      <w:r>
-        <w:rPr>
-          <w:rFonts w:ascii="Times New Roman" w:eastAsia="Times New Roman" w:hAnsi="Times New Roman" w:cs="Times New Roman"/>
-          <w:color w:val="000000"/>
-          <w:kern w:val="0"/>
-          <w14:ligatures w14:val="none"/>
-        </w:rPr>
-        <w:t> </w:t>
-      </w:r>
-    </w:p>
-    <w:p>
-      <w:pPr>
-        <w:spacing w:before="100" w:beforeAutospacing="1" w:after="100" w:afterAutospacing="1" w:line="240" w:lineRule="auto"/>
-        <w:rPr>
-          <w:rFonts w:ascii="Times New Roman" w:eastAsia="Times New Roman" w:hAnsi="Times New Roman" w:cs="Times New Roman"/>
-          <w:color w:val="000000"/>
-          <w:kern w:val="0"/>
-          <w14:ligatures w14:val="none"/>
-        </w:rPr>
-      </w:pPr>
-      <w:r>
-        <w:rPr>
-          <w:rFonts w:ascii="Times New Roman" w:eastAsia="Times New Roman" w:hAnsi="Times New Roman" w:cs="Times New Roman"/>
-          <w:color w:val="000000"/>
-          <w:kern w:val="0"/>
-          <w14:ligatures w14:val="none"/>
-        </w:rPr>
-        <w:t xml:space="preserve">This model </w:t>
-      </w:r>
-      <w:r>
-        <w:rPr>
-          <w:rFonts w:ascii="Times New Roman" w:eastAsia="Times New Roman" w:hAnsi="Times New Roman" w:cs="Times New Roman"/>
-          <w:color w:val="000000"/>
-          <w:kern w:val="0"/>
-          <w14:ligatures w14:val="none"/>
-        </w:rPr>
-        <w:t>classifies each transaction by majority vote among its k nearest neighbors in feature space. This is well-suited to fraud detection because fraudulent transactions tend to cluster together in feature space</w:t>
-      </w:r>
-      <w:r>
-        <w:rPr>
-          <w:rFonts w:ascii="Times New Roman" w:eastAsia="Times New Roman" w:hAnsi="Times New Roman" w:cs="Times New Roman"/>
-          <w:color w:val="000000"/>
-          <w:kern w:val="0"/>
-          <w14:ligatures w14:val="none"/>
-        </w:rPr>
-        <w:t xml:space="preserve">, </w:t>
-      </w:r>
-      <w:r>
-        <w:rPr>
-          <w:rFonts w:ascii="Times New Roman" w:eastAsia="Times New Roman" w:hAnsi="Times New Roman" w:cs="Times New Roman"/>
-          <w:color w:val="000000"/>
-          <w:kern w:val="0"/>
-          <w14:ligatures w14:val="none"/>
-        </w:rPr>
-        <w:t>a direct application of the clustering intuition from unsupervised learning. Proper feature scaling is essential for KNN since it uses Euclidean distance. KNN was trained on the original pre-SMOTE training data due to memory and computational constraints, with k=5.</w:t>
-      </w:r>
-    </w:p>
-    <w:p>
-      <w:pPr>
-        <w:spacing w:before="100" w:beforeAutospacing="1" w:after="100" w:afterAutospacing="1" w:line="240" w:lineRule="auto"/>
-        <w:rPr>
-          <w:rFonts w:ascii="Times New Roman" w:eastAsia="Times New Roman" w:hAnsi="Times New Roman" w:cs="Times New Roman"/>
-          <w:color w:val="000000"/>
-          <w:kern w:val="0"/>
-          <w14:ligatures w14:val="none"/>
-        </w:rPr>
-      </w:pPr>
-    </w:p>
-    <w:p>
-      <w:pPr>
-        <w:spacing w:before="100" w:beforeAutospacing="1" w:after="100" w:afterAutospacing="1" w:line="240" w:lineRule="auto"/>
-        <w:outlineLvl w:val="2"/>
         <w:rPr>
           <w:rFonts w:ascii="Times New Roman" w:eastAsia="Times New Roman" w:hAnsi="Times New Roman" w:cs="Times New Roman"/>
           <w:b/>
@@ -4045,7 +3407,8 @@
           <w:szCs w:val="27"/>
           <w14:ligatures w14:val="none"/>
         </w:rPr>
-      </w:pPr>
+        <w:t>4</w:t>
+      </w:r>
       <w:r>
         <w:rPr>
           <w:rFonts w:ascii="Times New Roman" w:eastAsia="Times New Roman" w:hAnsi="Times New Roman" w:cs="Times New Roman"/>
@@ -4057,7 +3420,390 @@
           <w:szCs w:val="27"/>
           <w14:ligatures w14:val="none"/>
         </w:rPr>
-        <w:t>2.4 Evaluation Metrics</w:t>
+        <w:t xml:space="preserve"> Model Selection</w:t>
+      </w:r>
+    </w:p>
+    <w:p>
+      <w:pPr>
+        <w:spacing w:before="100" w:beforeAutospacing="1" w:after="100" w:afterAutospacing="1" w:line="240" w:lineRule="auto"/>
+        <w:rPr>
+          <w:rFonts w:ascii="Times New Roman" w:eastAsia="Times New Roman" w:hAnsi="Times New Roman" w:cs="Times New Roman"/>
+          <w:color w:val="000000"/>
+          <w:kern w:val="0"/>
+          <w14:ligatures w14:val="none"/>
+        </w:rPr>
+      </w:pPr>
+      <w:r>
+        <w:rPr>
+          <w:rFonts w:ascii="Times New Roman" w:eastAsia="Times New Roman" w:hAnsi="Times New Roman" w:cs="Times New Roman"/>
+          <w:color w:val="000000"/>
+          <w:kern w:val="0"/>
+          <w14:ligatures w14:val="none"/>
+        </w:rPr>
+        <w:t xml:space="preserve">We selected four supervised classification algorithms that collectively cover a </w:t>
+      </w:r>
+      <w:r>
+        <w:rPr>
+          <w:rFonts w:ascii="Times New Roman" w:eastAsia="Times New Roman" w:hAnsi="Times New Roman" w:cs="Times New Roman"/>
+          <w:color w:val="000000"/>
+          <w:kern w:val="0"/>
+          <w14:ligatures w14:val="none"/>
+        </w:rPr>
+        <w:t>wide</w:t>
+      </w:r>
+      <w:r>
+        <w:rPr>
+          <w:rFonts w:ascii="Times New Roman" w:eastAsia="Times New Roman" w:hAnsi="Times New Roman" w:cs="Times New Roman"/>
+          <w:color w:val="000000"/>
+          <w:kern w:val="0"/>
+          <w14:ligatures w14:val="none"/>
+        </w:rPr>
+        <w:t xml:space="preserve"> spectrum of ML approaches</w:t>
+      </w:r>
+      <w:r>
+        <w:rPr>
+          <w:rFonts w:ascii="Times New Roman" w:eastAsia="Times New Roman" w:hAnsi="Times New Roman" w:cs="Times New Roman"/>
+          <w:color w:val="000000"/>
+          <w:kern w:val="0"/>
+          <w14:ligatures w14:val="none"/>
+        </w:rPr>
+        <w:t>.</w:t>
+      </w:r>
+    </w:p>
+    <w:p>
+      <w:pPr>
+        <w:spacing w:before="100" w:beforeAutospacing="1" w:after="100" w:afterAutospacing="1" w:line="240" w:lineRule="auto"/>
+        <w:jc w:val="both"/>
+        <w:rPr>
+          <w:rFonts w:ascii="Times New Roman" w:eastAsia="Times New Roman" w:hAnsi="Times New Roman" w:cs="Times New Roman"/>
+          <w:color w:val="000000"/>
+          <w:kern w:val="0"/>
+          <w14:ligatures w14:val="none"/>
+        </w:rPr>
+      </w:pPr>
+      <w:r>
+        <w:rPr>
+          <w:rFonts w:ascii="Times New Roman" w:eastAsia="Times New Roman" w:hAnsi="Times New Roman" w:cs="Times New Roman"/>
+          <w:b/>
+          <w:bCs/>
+          <w:color w:val="000000"/>
+          <w:kern w:val="0"/>
+          <w14:ligatures w14:val="none"/>
+        </w:rPr>
+        <w:t>1.</w:t>
+      </w:r>
+      <w:r>
+        <w:rPr>
+          <w:rFonts w:ascii="Times New Roman" w:eastAsia="Times New Roman" w:hAnsi="Times New Roman" w:cs="Times New Roman"/>
+          <w:b/>
+          <w:bCs/>
+          <w:color w:val="000000"/>
+          <w:kern w:val="0"/>
+          <w14:ligatures w14:val="none"/>
+        </w:rPr>
+        <w:t>Logistic Regression</w:t>
+      </w:r>
+      <w:r>
+        <w:rPr>
+          <w:rFonts w:ascii="Times New Roman" w:eastAsia="Times New Roman" w:hAnsi="Times New Roman" w:cs="Times New Roman"/>
+          <w:color w:val="000000"/>
+          <w:kern w:val="0"/>
+          <w14:ligatures w14:val="none"/>
+        </w:rPr>
+        <w:t> </w:t>
+      </w:r>
+    </w:p>
+    <w:p>
+      <w:pPr>
+        <w:spacing w:before="100" w:beforeAutospacing="1" w:after="100" w:afterAutospacing="1" w:line="240" w:lineRule="auto"/>
+        <w:rPr>
+          <w:rFonts w:ascii="Times New Roman" w:eastAsia="Times New Roman" w:hAnsi="Times New Roman" w:cs="Times New Roman"/>
+          <w:color w:val="000000"/>
+          <w:kern w:val="0"/>
+          <w14:ligatures w14:val="none"/>
+        </w:rPr>
+      </w:pPr>
+      <w:r>
+        <w:rPr>
+          <w:rFonts w:ascii="Times New Roman" w:eastAsia="Times New Roman" w:hAnsi="Times New Roman" w:cs="Times New Roman"/>
+          <w:color w:val="000000"/>
+          <w:kern w:val="0"/>
+          <w14:ligatures w14:val="none"/>
+        </w:rPr>
+        <w:t>This model serves as our interpretable baseline. It models fraud probability via a logistic function applied to a linear combination of features. Despite its simplicity, it is known to perform well on well-scaled, high-dimensional data and provides a meaningful benchmark. We used GridSearchCV with StratifiedKFold (5 folds) to tune the regularization parameter C across the range [0.01, 0.1, 1, 10, 100], optimizing for ROC-AUC. The class_weight='balanced' parameter provides an additional safeguard against any residual imbalance effects.</w:t>
+      </w:r>
+    </w:p>
+    <w:p>
+      <w:pPr>
+        <w:spacing w:before="100" w:beforeAutospacing="1" w:after="100" w:afterAutospacing="1" w:line="240" w:lineRule="auto"/>
+        <w:rPr>
+          <w:rFonts w:ascii="Times New Roman" w:eastAsia="Times New Roman" w:hAnsi="Times New Roman" w:cs="Times New Roman"/>
+          <w:color w:val="000000"/>
+          <w:kern w:val="0"/>
+          <w14:ligatures w14:val="none"/>
+        </w:rPr>
+      </w:pPr>
+    </w:p>
+    <w:p>
+      <w:pPr>
+        <w:spacing w:before="100" w:beforeAutospacing="1" w:after="100" w:afterAutospacing="1" w:line="240" w:lineRule="auto"/>
+        <w:rPr>
+          <w:rFonts w:ascii="Times New Roman" w:eastAsia="Times New Roman" w:hAnsi="Times New Roman" w:cs="Times New Roman"/>
+          <w:color w:val="000000"/>
+          <w:kern w:val="0"/>
+          <w14:ligatures w14:val="none"/>
+        </w:rPr>
+      </w:pPr>
+    </w:p>
+    <w:p>
+      <w:pPr>
+        <w:spacing w:before="100" w:beforeAutospacing="1" w:after="100" w:afterAutospacing="1" w:line="240" w:lineRule="auto"/>
+        <w:rPr>
+          <w:rFonts w:ascii="Times New Roman" w:eastAsia="Times New Roman" w:hAnsi="Times New Roman" w:cs="Times New Roman"/>
+          <w:color w:val="000000"/>
+          <w:kern w:val="0"/>
+          <w14:ligatures w14:val="none"/>
+        </w:rPr>
+      </w:pPr>
+      <w:r>
+        <w:rPr>
+          <w:rFonts w:ascii="Times New Roman" w:eastAsia="Times New Roman" w:hAnsi="Times New Roman" w:cs="Times New Roman"/>
+          <w:b/>
+          <w:bCs/>
+          <w:color w:val="000000"/>
+          <w:kern w:val="0"/>
+          <w14:ligatures w14:val="none"/>
+        </w:rPr>
+        <w:lastRenderedPageBreak/>
+        <w:t>2.</w:t>
+      </w:r>
+      <w:r>
+        <w:rPr>
+          <w:rFonts w:ascii="Times New Roman" w:eastAsia="Times New Roman" w:hAnsi="Times New Roman" w:cs="Times New Roman"/>
+          <w:b/>
+          <w:bCs/>
+          <w:color w:val="000000"/>
+          <w:kern w:val="0"/>
+          <w14:ligatures w14:val="none"/>
+        </w:rPr>
+        <w:t>Decision Tree</w:t>
+      </w:r>
+    </w:p>
+    <w:p>
+      <w:pPr>
+        <w:spacing w:before="100" w:beforeAutospacing="1" w:after="100" w:afterAutospacing="1" w:line="240" w:lineRule="auto"/>
+        <w:rPr>
+          <w:rFonts w:ascii="Times New Roman" w:eastAsia="Times New Roman" w:hAnsi="Times New Roman" w:cs="Times New Roman"/>
+          <w:color w:val="000000"/>
+          <w:kern w:val="0"/>
+          <w14:ligatures w14:val="none"/>
+        </w:rPr>
+      </w:pPr>
+      <w:r>
+        <w:rPr>
+          <w:rFonts w:ascii="Times New Roman" w:eastAsia="Times New Roman" w:hAnsi="Times New Roman" w:cs="Times New Roman"/>
+          <w:color w:val="000000"/>
+          <w:kern w:val="0"/>
+          <w14:ligatures w14:val="none"/>
+        </w:rPr>
+        <w:t>This is the most interpretable model in our project. It builds binary splits based on feature thresholds, and its structure can be directly visualized — allowing us to see exactly which features and values drive each fraud prediction. This is invaluable for explaining model behavior to non-technical stakeholders. We tuned max_depth, min_samples_split, and min_samples_leaf via GridSearchCV with 3-fold StratifiedKFold. Notably, Decision Trees do not require feature scaling since they use threshold-based splits rather than distance calculations.</w:t>
+      </w:r>
+    </w:p>
+    <w:p>
+      <w:pPr>
+        <w:spacing w:before="100" w:beforeAutospacing="1" w:after="100" w:afterAutospacing="1" w:line="240" w:lineRule="auto"/>
+        <w:rPr>
+          <w:rFonts w:ascii="Times New Roman" w:eastAsia="Times New Roman" w:hAnsi="Times New Roman" w:cs="Times New Roman"/>
+          <w:color w:val="000000"/>
+          <w:kern w:val="0"/>
+          <w14:ligatures w14:val="none"/>
+        </w:rPr>
+      </w:pPr>
+      <w:r>
+        <w:rPr>
+          <w:rFonts w:ascii="Times New Roman" w:eastAsia="Times New Roman" w:hAnsi="Times New Roman" w:cs="Times New Roman"/>
+          <w:b/>
+          <w:bCs/>
+          <w:color w:val="000000"/>
+          <w:kern w:val="0"/>
+          <w14:ligatures w14:val="none"/>
+        </w:rPr>
+        <w:t>3.</w:t>
+      </w:r>
+      <w:r>
+        <w:rPr>
+          <w:rFonts w:ascii="Times New Roman" w:eastAsia="Times New Roman" w:hAnsi="Times New Roman" w:cs="Times New Roman"/>
+          <w:b/>
+          <w:bCs/>
+          <w:color w:val="000000"/>
+          <w:kern w:val="0"/>
+          <w14:ligatures w14:val="none"/>
+        </w:rPr>
+        <w:t>Random Forest</w:t>
+      </w:r>
+      <w:r>
+        <w:rPr>
+          <w:rFonts w:ascii="Times New Roman" w:eastAsia="Times New Roman" w:hAnsi="Times New Roman" w:cs="Times New Roman"/>
+          <w:color w:val="000000"/>
+          <w:kern w:val="0"/>
+          <w14:ligatures w14:val="none"/>
+        </w:rPr>
+        <w:t> </w:t>
+      </w:r>
+    </w:p>
+    <w:p>
+      <w:pPr>
+        <w:spacing w:before="100" w:beforeAutospacing="1" w:after="100" w:afterAutospacing="1" w:line="240" w:lineRule="auto"/>
+        <w:rPr>
+          <w:rFonts w:ascii="Times New Roman" w:eastAsia="Times New Roman" w:hAnsi="Times New Roman" w:cs="Times New Roman"/>
+          <w:color w:val="000000"/>
+          <w:kern w:val="0"/>
+          <w14:ligatures w14:val="none"/>
+        </w:rPr>
+      </w:pPr>
+      <w:r>
+        <w:rPr>
+          <w:rFonts w:ascii="Times New Roman" w:eastAsia="Times New Roman" w:hAnsi="Times New Roman" w:cs="Times New Roman"/>
+          <w:color w:val="000000"/>
+          <w:kern w:val="0"/>
+          <w14:ligatures w14:val="none"/>
+        </w:rPr>
+        <w:t xml:space="preserve">Random Forest is an ensemble method that trains multiple decision trees on random bootstrap samples with random feature subsets. The diversity among trees reduces overfitting compared to a single Decision Tree and provides strong generalization on complex, noisy data. An additional benefit is </w:t>
+      </w:r>
+      <w:r>
+        <w:rPr>
+          <w:rFonts w:ascii="Times New Roman" w:eastAsia="Times New Roman" w:hAnsi="Times New Roman" w:cs="Times New Roman"/>
+          <w:color w:val="000000"/>
+          <w:kern w:val="0"/>
+          <w14:ligatures w14:val="none"/>
+        </w:rPr>
+        <w:t>featuring</w:t>
+      </w:r>
+      <w:r>
+        <w:rPr>
+          <w:rFonts w:ascii="Times New Roman" w:eastAsia="Times New Roman" w:hAnsi="Times New Roman" w:cs="Times New Roman"/>
+          <w:color w:val="000000"/>
+          <w:kern w:val="0"/>
+          <w14:ligatures w14:val="none"/>
+        </w:rPr>
+        <w:t xml:space="preserve"> importance scores, which quantify each PCA component's contribution to fraud prediction. We used GridSearchCV on a stratified 20% sample of the SMOTE training data to tune n_estimators, max_depth, and min_samples_leaf — then trained the final model on the full SMOTE dataset with the best parameters found. This approach is valid because hyperparameter tuning on a representative sample finds the optimal settings, while the final model still trains on all available data.</w:t>
+      </w:r>
+    </w:p>
+    <w:p>
+      <w:pPr>
+        <w:spacing w:before="100" w:beforeAutospacing="1" w:after="100" w:afterAutospacing="1" w:line="240" w:lineRule="auto"/>
+        <w:rPr>
+          <w:rFonts w:ascii="Times New Roman" w:eastAsia="Times New Roman" w:hAnsi="Times New Roman" w:cs="Times New Roman"/>
+          <w:color w:val="000000"/>
+          <w:kern w:val="0"/>
+          <w14:ligatures w14:val="none"/>
+        </w:rPr>
+      </w:pPr>
+      <w:r>
+        <w:rPr>
+          <w:rFonts w:ascii="Times New Roman" w:eastAsia="Times New Roman" w:hAnsi="Times New Roman" w:cs="Times New Roman"/>
+          <w:b/>
+          <w:bCs/>
+          <w:color w:val="000000"/>
+          <w:kern w:val="0"/>
+          <w14:ligatures w14:val="none"/>
+        </w:rPr>
+        <w:t>4.</w:t>
+      </w:r>
+      <w:r>
+        <w:rPr>
+          <w:rFonts w:ascii="Times New Roman" w:eastAsia="Times New Roman" w:hAnsi="Times New Roman" w:cs="Times New Roman"/>
+          <w:b/>
+          <w:bCs/>
+          <w:color w:val="000000"/>
+          <w:kern w:val="0"/>
+          <w14:ligatures w14:val="none"/>
+        </w:rPr>
+        <w:t>K-Nearest Neighbors (KNN)</w:t>
+      </w:r>
+      <w:r>
+        <w:rPr>
+          <w:rFonts w:ascii="Times New Roman" w:eastAsia="Times New Roman" w:hAnsi="Times New Roman" w:cs="Times New Roman"/>
+          <w:color w:val="000000"/>
+          <w:kern w:val="0"/>
+          <w14:ligatures w14:val="none"/>
+        </w:rPr>
+        <w:t> </w:t>
+      </w:r>
+    </w:p>
+    <w:p>
+      <w:pPr>
+        <w:spacing w:before="100" w:beforeAutospacing="1" w:after="100" w:afterAutospacing="1" w:line="240" w:lineRule="auto"/>
+        <w:rPr>
+          <w:rFonts w:ascii="Times New Roman" w:eastAsia="Times New Roman" w:hAnsi="Times New Roman" w:cs="Times New Roman"/>
+          <w:color w:val="000000"/>
+          <w:kern w:val="0"/>
+          <w14:ligatures w14:val="none"/>
+        </w:rPr>
+      </w:pPr>
+      <w:r>
+        <w:rPr>
+          <w:rFonts w:ascii="Times New Roman" w:eastAsia="Times New Roman" w:hAnsi="Times New Roman" w:cs="Times New Roman"/>
+          <w:color w:val="000000"/>
+          <w:kern w:val="0"/>
+          <w14:ligatures w14:val="none"/>
+        </w:rPr>
+        <w:t>This model classifies each transaction by majority vote among its k nearest neighbors in feature space. This is well-suited to fraud detection because fraudulent transactions tend to cluster together in feature space — a direct application of the clustering intuition from unsupervised learning covered in this course. Proper feature scaling is essential for KNN since it uses Euclidean distance. We used GridSearchCV on a stratified 10% sample to find the optimal k, then trained the final model with the best k found.</w:t>
+      </w:r>
+    </w:p>
+    <w:p>
+      <w:pPr>
+        <w:spacing w:before="100" w:beforeAutospacing="1" w:after="100" w:afterAutospacing="1" w:line="240" w:lineRule="auto"/>
+        <w:outlineLvl w:val="2"/>
+        <w:rPr>
+          <w:rFonts w:ascii="Times New Roman" w:eastAsia="Times New Roman" w:hAnsi="Times New Roman" w:cs="Times New Roman"/>
+          <w:b/>
+          <w:bCs/>
+          <w:color w:val="000000"/>
+          <w:kern w:val="0"/>
+          <w:sz w:val="27"/>
+          <w:szCs w:val="27"/>
+          <w14:ligatures w14:val="none"/>
+        </w:rPr>
+      </w:pPr>
+      <w:r>
+        <w:rPr>
+          <w:rFonts w:ascii="Times New Roman" w:eastAsia="Times New Roman" w:hAnsi="Times New Roman" w:cs="Times New Roman"/>
+          <w:b/>
+          <w:bCs/>
+          <w:color w:val="000000"/>
+          <w:kern w:val="0"/>
+          <w:sz w:val="27"/>
+          <w:szCs w:val="27"/>
+          <w14:ligatures w14:val="none"/>
+        </w:rPr>
+        <w:t>2.</w:t>
+      </w:r>
+      <w:r>
+        <w:rPr>
+          <w:rFonts w:ascii="Times New Roman" w:eastAsia="Times New Roman" w:hAnsi="Times New Roman" w:cs="Times New Roman"/>
+          <w:b/>
+          <w:bCs/>
+          <w:color w:val="000000"/>
+          <w:kern w:val="0"/>
+          <w:sz w:val="27"/>
+          <w:szCs w:val="27"/>
+          <w14:ligatures w14:val="none"/>
+        </w:rPr>
+        <w:t>5</w:t>
+      </w:r>
+      <w:r>
+        <w:rPr>
+          <w:rFonts w:ascii="Times New Roman" w:eastAsia="Times New Roman" w:hAnsi="Times New Roman" w:cs="Times New Roman"/>
+          <w:b/>
+          <w:bCs/>
+          <w:color w:val="000000"/>
+          <w:kern w:val="0"/>
+          <w:sz w:val="27"/>
+          <w:szCs w:val="27"/>
+          <w14:ligatures w14:val="none"/>
+        </w:rPr>
+        <w:t xml:space="preserve"> Evaluation Metrics</w:t>
       </w:r>
     </w:p>
     <w:p>
@@ -4291,7 +4037,8 @@
           <w:noProof/>
           <w:kern w:val="0"/>
         </w:rPr>
-        <w:pict w14:anchorId="4C54590F">
+        <w:lastRenderedPageBreak/>
+        <w:pict w14:anchorId="32294524">
           <v:rect id="_x0000_i1029" alt="" style="width:468pt;height:.05pt;mso-width-percent:0;mso-height-percent:0;mso-width-percent:0;mso-height-percent:0" o:hralign="center" o:hrstd="t" o:hr="t" fillcolor="#a0a0a0" stroked="f"/>
         </w:pict>
       </w:r>
@@ -4327,11 +4074,7 @@
           <w14:ligatures w14:val="none"/>
         </w:rPr>
       </w:pPr>
-    </w:p>
-    <w:p>
-      <w:pPr>
-        <w:spacing w:before="100" w:beforeAutospacing="1" w:after="100" w:afterAutospacing="1" w:line="240" w:lineRule="auto"/>
-        <w:outlineLvl w:val="1"/>
+      <w:r>
         <w:rPr>
           <w:rFonts w:ascii="Times New Roman" w:eastAsia="Times New Roman" w:hAnsi="Times New Roman" w:cs="Times New Roman"/>
           <w:b/>
@@ -4342,35 +4085,6 @@
           <w:szCs w:val="36"/>
           <w14:ligatures w14:val="none"/>
         </w:rPr>
-      </w:pPr>
-    </w:p>
-    <w:p>
-      <w:pPr>
-        <w:spacing w:before="100" w:beforeAutospacing="1" w:after="100" w:afterAutospacing="1" w:line="240" w:lineRule="auto"/>
-        <w:outlineLvl w:val="1"/>
-        <w:rPr>
-          <w:rFonts w:ascii="Times New Roman" w:eastAsia="Times New Roman" w:hAnsi="Times New Roman" w:cs="Times New Roman"/>
-          <w:b/>
-          <w:bCs/>
-          <w:color w:val="000000"/>
-          <w:kern w:val="0"/>
-          <w:sz w:val="36"/>
-          <w:szCs w:val="36"/>
-          <w14:ligatures w14:val="none"/>
-        </w:rPr>
-      </w:pPr>
-      <w:r>
-        <w:rPr>
-          <w:rFonts w:ascii="Times New Roman" w:eastAsia="Times New Roman" w:hAnsi="Times New Roman" w:cs="Times New Roman"/>
-          <w:b/>
-          <w:bCs/>
-          <w:color w:val="000000"/>
-          <w:kern w:val="0"/>
-          <w:sz w:val="36"/>
-          <w:szCs w:val="36"/>
-          <w14:ligatures w14:val="none"/>
-        </w:rPr>
-        <w:lastRenderedPageBreak/>
         <w:t>3. Description of Dataset</w:t>
       </w:r>
     </w:p>
@@ -4926,7 +4640,8 @@
           <w:noProof/>
           <w:kern w:val="0"/>
         </w:rPr>
-        <w:pict w14:anchorId="170AC59A">
+        <w:lastRenderedPageBreak/>
+        <w:pict w14:anchorId="690FFBA4">
           <v:rect id="_x0000_i1028" alt="" style="width:468pt;height:.05pt;mso-width-percent:0;mso-height-percent:0;mso-width-percent:0;mso-height-percent:0" o:hralign="center" o:hrstd="t" o:hr="t" fillcolor="#a0a0a0" stroked="f"/>
         </w:pict>
       </w:r>
@@ -4973,7 +4688,6 @@
           <w:szCs w:val="36"/>
           <w14:ligatures w14:val="none"/>
         </w:rPr>
-        <w:lastRenderedPageBreak/>
         <w:t>4. Results and Analysis</w:t>
       </w:r>
     </w:p>
@@ -5227,39 +4941,6 @@
         </w:rPr>
         <w:t>Most features were already close to Gaussian after scaling. We tested PowerTransformer and found minimal improvement, so we cut it from the pipeline. No point adding complexity if it doesn't help.</w:t>
       </w:r>
-    </w:p>
-    <w:p>
-      <w:pPr>
-        <w:spacing w:before="100" w:beforeAutospacing="1" w:after="100" w:afterAutospacing="1" w:line="240" w:lineRule="auto"/>
-        <w:rPr>
-          <w:rFonts w:ascii="Times New Roman" w:eastAsia="Times New Roman" w:hAnsi="Times New Roman" w:cs="Times New Roman"/>
-          <w:color w:val="000000"/>
-          <w:kern w:val="0"/>
-          <w14:ligatures w14:val="none"/>
-        </w:rPr>
-      </w:pPr>
-    </w:p>
-    <w:p>
-      <w:pPr>
-        <w:spacing w:before="100" w:beforeAutospacing="1" w:after="100" w:afterAutospacing="1" w:line="240" w:lineRule="auto"/>
-        <w:rPr>
-          <w:rFonts w:ascii="Times New Roman" w:eastAsia="Times New Roman" w:hAnsi="Times New Roman" w:cs="Times New Roman"/>
-          <w:color w:val="000000"/>
-          <w:kern w:val="0"/>
-          <w14:ligatures w14:val="none"/>
-        </w:rPr>
-      </w:pPr>
-    </w:p>
-    <w:p>
-      <w:pPr>
-        <w:spacing w:before="100" w:beforeAutospacing="1" w:after="100" w:afterAutospacing="1" w:line="240" w:lineRule="auto"/>
-        <w:rPr>
-          <w:rFonts w:ascii="Times New Roman" w:eastAsia="Times New Roman" w:hAnsi="Times New Roman" w:cs="Times New Roman"/>
-          <w:color w:val="000000"/>
-          <w:kern w:val="0"/>
-          <w14:ligatures w14:val="none"/>
-        </w:rPr>
-      </w:pPr>
     </w:p>
     <w:p>
       <w:pPr>
@@ -5609,7 +5290,7 @@
           <w:kern w:val="0"/>
           <w14:ligatures w14:val="none"/>
         </w:rPr>
-        <w:t>Precision: 0.0558 | Recall: 0.8421 | F1-Score: 0.1047 | ROC-AUC: 0.9374</w:t>
+        <w:t>Precision: 0.0415 | Recall: 0.8421 | F1-Score: 0.0792 | ROC-AUC: 0.9007</w:t>
       </w:r>
     </w:p>
     <w:p>
@@ -5633,26 +5314,19 @@
           <w:kern w:val="0"/>
           <w14:ligatures w14:val="none"/>
         </w:rPr>
-        <w:t>The Decision Tree's most notable contribution is interpretability. The tree structure visualization shows that V14 ≤ -1.791 is the root split</w:t>
-      </w:r>
-      <w:r>
-        <w:rPr>
-          <w:rFonts w:ascii="Times New Roman" w:eastAsia="Times New Roman" w:hAnsi="Times New Roman" w:cs="Times New Roman"/>
-          <w:color w:val="000000"/>
-          <w:kern w:val="0"/>
-          <w14:ligatures w14:val="none"/>
-        </w:rPr>
-        <w:t xml:space="preserve">, </w:t>
-      </w:r>
-      <w:r>
-        <w:rPr>
-          <w:rFonts w:ascii="Times New Roman" w:eastAsia="Times New Roman" w:hAnsi="Times New Roman" w:cs="Times New Roman"/>
-          <w:color w:val="000000"/>
-          <w:kern w:val="0"/>
-          <w14:ligatures w14:val="none"/>
-        </w:rPr>
-        <w:t>perfectly consistent with the correlation heatmap identifying V14 as most negatively correlated with fraud. Subsequent splits on V4, V10, V11, V12, V13, and V7 align with other high-correlation features. This transparency makes the Decision Tree uniquely valuable for regulatory compliance and stakeholder explanation, even though its performance metrics were the lowest of the four models. The Decision Tree's lower ROC-AUC (0.9374) suggests that a single tree's axis-aligned splits are insufficient to capture the full complexity of fraud patterns in this 30-dimensional feature space.</w:t>
-      </w:r>
+        <w:t>The Decision Tree's most notable contribution is interpretability. The tree structure visualization shows that V14 ≤ -1.791 is the root split — perfectly consistent with the correlation heatmap identifying V14 as most negatively correlated with fraud. Subsequent splits on V4, V10, V11, V12, V13, and V7 align with other high-correlation features. This transparency makes the Decision Tree uniquely valuable for regulatory compliance and stakeholder explanation. The confusion matrix showed 80 true positives, 15 false negatives, and 1,846 false positives.</w:t>
+      </w:r>
+    </w:p>
+    <w:p>
+      <w:pPr>
+        <w:spacing w:before="100" w:beforeAutospacing="1" w:after="100" w:afterAutospacing="1" w:line="240" w:lineRule="auto"/>
+        <w:rPr>
+          <w:rFonts w:ascii="Times New Roman" w:eastAsia="Times New Roman" w:hAnsi="Times New Roman" w:cs="Times New Roman"/>
+          <w:color w:val="000000"/>
+          <w:kern w:val="0"/>
+          <w14:ligatures w14:val="none"/>
+        </w:rPr>
+      </w:pPr>
     </w:p>
     <w:p>
       <w:pPr>
@@ -5672,10 +5346,10 @@
           <w:kern w:val="0"/>
         </w:rPr>
         <w:drawing>
-          <wp:inline distT="0" distB="0" distL="0" distR="0" wp14:anchorId="06A5EBCD" wp14:editId="4A5898F2">
-            <wp:extent cx="5943600" cy="1920875"/>
-            <wp:effectExtent l="0" t="0" r="0" b="0"/>
-            <wp:docPr id="553830262" name="Picture 7" descr="A diagram of a tree structure&#10;&#10;AI-generated content may be incorrect."/>
+          <wp:inline distT="0" distB="0" distL="0" distR="0" wp14:anchorId="35166583" wp14:editId="655ECB47">
+            <wp:extent cx="5595042" cy="2244592"/>
+            <wp:effectExtent l="0" t="0" r="0" b="3810"/>
+            <wp:docPr id="1653617767" name="Picture 1" descr="A diagram of a tree structure&#10;&#10;AI-generated content may be incorrect."/>
             <wp:cNvGraphicFramePr>
               <a:graphicFrameLocks xmlns:a="http://schemas.openxmlformats.org/drawingml/2006/main" noChangeAspect="1"/>
             </wp:cNvGraphicFramePr>
@@ -5683,7 +5357,7 @@
               <a:graphicData uri="http://schemas.openxmlformats.org/drawingml/2006/picture">
                 <pic:pic xmlns:pic="http://schemas.openxmlformats.org/drawingml/2006/picture">
                   <pic:nvPicPr>
-                    <pic:cNvPr id="553830262" name="Picture 7" descr="A diagram of a tree structure&#10;&#10;AI-generated content may be incorrect."/>
+                    <pic:cNvPr id="1653617767" name="Picture 1" descr="A diagram of a tree structure&#10;&#10;AI-generated content may be incorrect."/>
                     <pic:cNvPicPr/>
                   </pic:nvPicPr>
                   <pic:blipFill>
@@ -5701,7 +5375,7 @@
                   <pic:spPr>
                     <a:xfrm>
                       <a:off x="0" y="0"/>
-                      <a:ext cx="5943600" cy="1920875"/>
+                      <a:ext cx="5615489" cy="2252795"/>
                     </a:xfrm>
                     <a:prstGeom prst="rect">
                       <a:avLst/>
@@ -5724,17 +5398,6 @@
           <w14:ligatures w14:val="none"/>
         </w:rPr>
       </w:pPr>
-    </w:p>
-    <w:p>
-      <w:pPr>
-        <w:spacing w:before="100" w:beforeAutospacing="1" w:after="100" w:afterAutospacing="1" w:line="240" w:lineRule="auto"/>
-        <w:rPr>
-          <w:rFonts w:ascii="Times New Roman" w:eastAsia="Times New Roman" w:hAnsi="Times New Roman" w:cs="Times New Roman"/>
-          <w:color w:val="000000"/>
-          <w:kern w:val="0"/>
-          <w14:ligatures w14:val="none"/>
-        </w:rPr>
-      </w:pPr>
       <w:r>
         <w:rPr>
           <w:rFonts w:ascii="Times New Roman" w:eastAsia="Times New Roman" w:hAnsi="Times New Roman" w:cs="Times New Roman"/>
@@ -5743,10 +5406,10 @@
           <w:kern w:val="0"/>
         </w:rPr>
         <w:drawing>
-          <wp:inline distT="0" distB="0" distL="0" distR="0" wp14:anchorId="61D477C1" wp14:editId="063F6D81">
-            <wp:extent cx="5943600" cy="3410585"/>
-            <wp:effectExtent l="0" t="0" r="0" b="5715"/>
-            <wp:docPr id="1835938478" name="Picture 8" descr="A screenshot of a graph&#10;&#10;AI-generated content may be incorrect."/>
+          <wp:inline distT="0" distB="0" distL="0" distR="0" wp14:anchorId="7AAD3C9D" wp14:editId="3C1C1AB8">
+            <wp:extent cx="5730844" cy="3238906"/>
+            <wp:effectExtent l="0" t="0" r="0" b="0"/>
+            <wp:docPr id="454385940" name="Picture 2" descr="A screenshot of a graph&#10;&#10;AI-generated content may be incorrect."/>
             <wp:cNvGraphicFramePr>
               <a:graphicFrameLocks xmlns:a="http://schemas.openxmlformats.org/drawingml/2006/main" noChangeAspect="1"/>
             </wp:cNvGraphicFramePr>
@@ -5754,7 +5417,7 @@
               <a:graphicData uri="http://schemas.openxmlformats.org/drawingml/2006/picture">
                 <pic:pic xmlns:pic="http://schemas.openxmlformats.org/drawingml/2006/picture">
                   <pic:nvPicPr>
-                    <pic:cNvPr id="1835938478" name="Picture 8" descr="A screenshot of a graph&#10;&#10;AI-generated content may be incorrect."/>
+                    <pic:cNvPr id="454385940" name="Picture 2" descr="A screenshot of a graph&#10;&#10;AI-generated content may be incorrect."/>
                     <pic:cNvPicPr/>
                   </pic:nvPicPr>
                   <pic:blipFill>
@@ -5772,7 +5435,7 @@
                   <pic:spPr>
                     <a:xfrm>
                       <a:off x="0" y="0"/>
-                      <a:ext cx="5943600" cy="3410585"/>
+                      <a:ext cx="5774994" cy="3263858"/>
                     </a:xfrm>
                     <a:prstGeom prst="rect">
                       <a:avLst/>
@@ -5840,7 +5503,7 @@
           <w:kern w:val="0"/>
           <w14:ligatures w14:val="none"/>
         </w:rPr>
-        <w:t>Precision: 0.3798 | Recall: 0.8316 | F1-Score: 0.5215 | ROC-AUC: 0.9812</w:t>
+        <w:t>Precision: 0.4149 | Recall: 0.8211 | F1-Score: 0.5512 | ROC-AUC: 0.9812</w:t>
       </w:r>
     </w:p>
     <w:p>
@@ -5864,26 +5527,68 @@
           <w:kern w:val="0"/>
           <w14:ligatures w14:val="none"/>
         </w:rPr>
-        <w:t>Random Forest achieved the highest ROC-AUC (0.9812) of all four models, demonstrating the best overall discrimination ability across all possible classification thresholds. Its F1-Score of 0.5215 reflects a reasonable balance between Precision and Recall, though it was outperformed by KNN on both metrics. The feature importance plot confirmed V14 as the dominant predictor (importance score ≈ 0.22), followed by V10, V17, V4, and V12</w:t>
-      </w:r>
-      <w:r>
-        <w:rPr>
-          <w:rFonts w:ascii="Times New Roman" w:eastAsia="Times New Roman" w:hAnsi="Times New Roman" w:cs="Times New Roman"/>
-          <w:color w:val="000000"/>
-          <w:kern w:val="0"/>
-          <w14:ligatures w14:val="none"/>
-        </w:rPr>
-        <w:t xml:space="preserve">, </w:t>
-      </w:r>
-      <w:r>
-        <w:rPr>
-          <w:rFonts w:ascii="Times New Roman" w:eastAsia="Times New Roman" w:hAnsi="Times New Roman" w:cs="Times New Roman"/>
-          <w:color w:val="000000"/>
-          <w:kern w:val="0"/>
-          <w14:ligatures w14:val="none"/>
-        </w:rPr>
-        <w:t>fully consistent with the EDA correlation analysis and the Decision Tree structure. This cross-validation of feature importance across multiple model types strengthens confidence in these findings.</w:t>
-      </w:r>
+        <w:t xml:space="preserve">Random Forest achieved the highest ROC-AUC (0.9812) and the highest F1-Score (0.5512) of all four models, demonstrating the best overall performance across both key metrics. With GridSearchCV tuning finding the optimal combination of hyperparameters, the false positive count was only 110 </w:t>
+      </w:r>
+      <w:r>
+        <w:rPr>
+          <w:rFonts w:ascii="Times New Roman" w:eastAsia="Times New Roman" w:hAnsi="Times New Roman" w:cs="Times New Roman"/>
+          <w:color w:val="000000"/>
+          <w:kern w:val="0"/>
+          <w14:ligatures w14:val="none"/>
+        </w:rPr>
+        <w:t>-</w:t>
+      </w:r>
+      <w:r>
+        <w:rPr>
+          <w:rFonts w:ascii="Times New Roman" w:eastAsia="Times New Roman" w:hAnsi="Times New Roman" w:cs="Times New Roman"/>
+          <w:color w:val="000000"/>
+          <w:kern w:val="0"/>
+          <w14:ligatures w14:val="none"/>
+        </w:rPr>
+        <w:t xml:space="preserve"> dramatically lower than Logistic Regression's 1,514. The confusion matrix showed 78 true positives and 17 false negatives. The feature importance plot confirmed V14 as the dominant predictor (importance score ≈ 0.22), followed by V10, V17, V4, and V12 </w:t>
+      </w:r>
+      <w:r>
+        <w:rPr>
+          <w:rFonts w:ascii="Times New Roman" w:eastAsia="Times New Roman" w:hAnsi="Times New Roman" w:cs="Times New Roman"/>
+          <w:color w:val="000000"/>
+          <w:kern w:val="0"/>
+          <w14:ligatures w14:val="none"/>
+        </w:rPr>
+        <w:t>-</w:t>
+      </w:r>
+      <w:r>
+        <w:rPr>
+          <w:rFonts w:ascii="Times New Roman" w:eastAsia="Times New Roman" w:hAnsi="Times New Roman" w:cs="Times New Roman"/>
+          <w:color w:val="000000"/>
+          <w:kern w:val="0"/>
+          <w14:ligatures w14:val="none"/>
+        </w:rPr>
+        <w:t>fully consistent with the EDA correlation analysis and the Decision Tree structure.</w:t>
+      </w:r>
+    </w:p>
+    <w:p>
+      <w:pPr>
+        <w:spacing w:before="100" w:beforeAutospacing="1" w:after="100" w:afterAutospacing="1" w:line="240" w:lineRule="auto"/>
+        <w:ind w:left="720"/>
+        <w:rPr>
+          <w:rFonts w:ascii="Times New Roman" w:eastAsia="Times New Roman" w:hAnsi="Times New Roman" w:cs="Times New Roman"/>
+          <w:color w:val="000000"/>
+          <w:kern w:val="0"/>
+          <w14:ligatures w14:val="none"/>
+        </w:rPr>
+      </w:pPr>
+    </w:p>
+    <w:p>
+      <w:pPr>
+        <w:spacing w:before="100" w:beforeAutospacing="1" w:after="100" w:afterAutospacing="1" w:line="240" w:lineRule="auto"/>
+        <w:ind w:left="720"/>
+        <w:rPr>
+          <w:rFonts w:ascii="Times New Roman" w:eastAsia="Times New Roman" w:hAnsi="Times New Roman" w:cs="Times New Roman"/>
+          <w:color w:val="000000"/>
+          <w:kern w:val="0"/>
+          <w14:ligatures w14:val="none"/>
+        </w:rPr>
+      </w:pPr>
     </w:p>
     <w:p>
       <w:pPr>
@@ -5903,10 +5608,10 @@
           <w:kern w:val="0"/>
         </w:rPr>
         <w:drawing>
-          <wp:inline distT="0" distB="0" distL="0" distR="0" wp14:anchorId="5F81B441" wp14:editId="69EB62EF">
-            <wp:extent cx="5760720" cy="3321902"/>
-            <wp:effectExtent l="0" t="0" r="5080" b="5715"/>
-            <wp:docPr id="156698973" name="Picture 9" descr="A screenshot of a graph&#10;&#10;AI-generated content may be incorrect."/>
+          <wp:inline distT="0" distB="0" distL="0" distR="0" wp14:anchorId="34104924" wp14:editId="744953AD">
+            <wp:extent cx="5943600" cy="3805555"/>
+            <wp:effectExtent l="0" t="0" r="0" b="4445"/>
+            <wp:docPr id="1823154906" name="Picture 3" descr="A screenshot of a computer&#10;&#10;AI-generated content may be incorrect."/>
             <wp:cNvGraphicFramePr>
               <a:graphicFrameLocks xmlns:a="http://schemas.openxmlformats.org/drawingml/2006/main" noChangeAspect="1"/>
             </wp:cNvGraphicFramePr>
@@ -5914,7 +5619,7 @@
               <a:graphicData uri="http://schemas.openxmlformats.org/drawingml/2006/picture">
                 <pic:pic xmlns:pic="http://schemas.openxmlformats.org/drawingml/2006/picture">
                   <pic:nvPicPr>
-                    <pic:cNvPr id="156698973" name="Picture 9" descr="A screenshot of a graph&#10;&#10;AI-generated content may be incorrect."/>
+                    <pic:cNvPr id="1823154906" name="Picture 3" descr="A screenshot of a computer&#10;&#10;AI-generated content may be incorrect."/>
                     <pic:cNvPicPr/>
                   </pic:nvPicPr>
                   <pic:blipFill>
@@ -5932,7 +5637,7 @@
                   <pic:spPr>
                     <a:xfrm>
                       <a:off x="0" y="0"/>
-                      <a:ext cx="5815851" cy="3353693"/>
+                      <a:ext cx="5943600" cy="3805555"/>
                     </a:xfrm>
                     <a:prstGeom prst="rect">
                       <a:avLst/>
@@ -5955,6 +5660,180 @@
           <w14:ligatures w14:val="none"/>
         </w:rPr>
       </w:pPr>
+    </w:p>
+    <w:p>
+      <w:pPr>
+        <w:spacing w:before="100" w:beforeAutospacing="1" w:after="100" w:afterAutospacing="1" w:line="240" w:lineRule="auto"/>
+        <w:rPr>
+          <w:rFonts w:ascii="Times New Roman" w:eastAsia="Times New Roman" w:hAnsi="Times New Roman" w:cs="Times New Roman"/>
+          <w:color w:val="000000"/>
+          <w:kern w:val="0"/>
+          <w14:ligatures w14:val="none"/>
+        </w:rPr>
+      </w:pPr>
+    </w:p>
+    <w:p>
+      <w:pPr>
+        <w:spacing w:before="100" w:beforeAutospacing="1" w:after="100" w:afterAutospacing="1" w:line="240" w:lineRule="auto"/>
+        <w:rPr>
+          <w:rFonts w:ascii="Times New Roman" w:eastAsia="Times New Roman" w:hAnsi="Times New Roman" w:cs="Times New Roman"/>
+          <w:color w:val="000000"/>
+          <w:kern w:val="0"/>
+          <w14:ligatures w14:val="none"/>
+        </w:rPr>
+      </w:pPr>
+    </w:p>
+    <w:p>
+      <w:pPr>
+        <w:spacing w:before="100" w:beforeAutospacing="1" w:after="100" w:afterAutospacing="1" w:line="240" w:lineRule="auto"/>
+        <w:rPr>
+          <w:rFonts w:ascii="Times New Roman" w:eastAsia="Times New Roman" w:hAnsi="Times New Roman" w:cs="Times New Roman"/>
+          <w:color w:val="000000"/>
+          <w:kern w:val="0"/>
+          <w14:ligatures w14:val="none"/>
+        </w:rPr>
+      </w:pPr>
+    </w:p>
+    <w:p>
+      <w:pPr>
+        <w:spacing w:before="100" w:beforeAutospacing="1" w:after="100" w:afterAutospacing="1" w:line="240" w:lineRule="auto"/>
+        <w:rPr>
+          <w:rFonts w:ascii="Times New Roman" w:eastAsia="Times New Roman" w:hAnsi="Times New Roman" w:cs="Times New Roman"/>
+          <w:color w:val="000000"/>
+          <w:kern w:val="0"/>
+          <w14:ligatures w14:val="none"/>
+        </w:rPr>
+      </w:pPr>
+      <w:r>
+        <w:rPr>
+          <w:rFonts w:ascii="Times New Roman" w:eastAsia="Times New Roman" w:hAnsi="Times New Roman" w:cs="Times New Roman"/>
+          <w:b/>
+          <w:bCs/>
+          <w:color w:val="000000"/>
+          <w:kern w:val="0"/>
+          <w14:ligatures w14:val="none"/>
+        </w:rPr>
+        <w:lastRenderedPageBreak/>
+        <w:t>4.</w:t>
+      </w:r>
+      <w:r>
+        <w:rPr>
+          <w:rFonts w:ascii="Times New Roman" w:eastAsia="Times New Roman" w:hAnsi="Times New Roman" w:cs="Times New Roman"/>
+          <w:b/>
+          <w:bCs/>
+          <w:color w:val="000000"/>
+          <w:kern w:val="0"/>
+          <w14:ligatures w14:val="none"/>
+        </w:rPr>
+        <w:t>K-Nearest Neighbors:</w:t>
+      </w:r>
+    </w:p>
+    <w:p>
+      <w:pPr>
+        <w:numPr>
+          <w:ilvl w:val="0"/>
+          <w:numId w:val="9"/>
+        </w:numPr>
+        <w:spacing w:before="100" w:beforeAutospacing="1" w:after="100" w:afterAutospacing="1" w:line="240" w:lineRule="auto"/>
+        <w:rPr>
+          <w:rFonts w:ascii="Times New Roman" w:eastAsia="Times New Roman" w:hAnsi="Times New Roman" w:cs="Times New Roman"/>
+          <w:color w:val="000000"/>
+          <w:kern w:val="0"/>
+          <w14:ligatures w14:val="none"/>
+        </w:rPr>
+      </w:pPr>
+      <w:r>
+        <w:rPr>
+          <w:rFonts w:ascii="Times New Roman" w:eastAsia="Times New Roman" w:hAnsi="Times New Roman" w:cs="Times New Roman"/>
+          <w:color w:val="000000"/>
+          <w:kern w:val="0"/>
+          <w14:ligatures w14:val="none"/>
+        </w:rPr>
+        <w:t>Precision: 0.9710 | Recall: 0.7053 | F1-Score: 0.8171 | ROC-AUC: 0.8999</w:t>
+      </w:r>
+    </w:p>
+    <w:p>
+      <w:pPr>
+        <w:numPr>
+          <w:ilvl w:val="0"/>
+          <w:numId w:val="9"/>
+        </w:numPr>
+        <w:spacing w:before="100" w:beforeAutospacing="1" w:after="100" w:afterAutospacing="1" w:line="240" w:lineRule="auto"/>
+        <w:rPr>
+          <w:rFonts w:ascii="Times New Roman" w:eastAsia="Times New Roman" w:hAnsi="Times New Roman" w:cs="Times New Roman"/>
+          <w:color w:val="000000"/>
+          <w:kern w:val="0"/>
+          <w14:ligatures w14:val="none"/>
+        </w:rPr>
+      </w:pPr>
+      <w:r>
+        <w:rPr>
+          <w:rFonts w:ascii="Times New Roman" w:eastAsia="Times New Roman" w:hAnsi="Times New Roman" w:cs="Times New Roman"/>
+          <w:color w:val="000000"/>
+          <w:kern w:val="0"/>
+          <w14:ligatures w14:val="none"/>
+        </w:rPr>
+        <w:t>KNN achieved the highest F1-Score (0.8171) and the highest Precision (0.9710) of all four models by a substantial margin. Its confusion matrix showed only 3 false positives</w:t>
+      </w:r>
+      <w:r>
+        <w:rPr>
+          <w:rFonts w:ascii="Times New Roman" w:eastAsia="Times New Roman" w:hAnsi="Times New Roman" w:cs="Times New Roman"/>
+          <w:color w:val="000000"/>
+          <w:kern w:val="0"/>
+          <w14:ligatures w14:val="none"/>
+        </w:rPr>
+        <w:t xml:space="preserve">, </w:t>
+      </w:r>
+      <w:r>
+        <w:rPr>
+          <w:rFonts w:ascii="Times New Roman" w:eastAsia="Times New Roman" w:hAnsi="Times New Roman" w:cs="Times New Roman"/>
+          <w:color w:val="000000"/>
+          <w:kern w:val="0"/>
+          <w14:ligatures w14:val="none"/>
+        </w:rPr>
+        <w:t xml:space="preserve">meaning 97.1% of KNN's fraud alerts were genuine fraud cases. This exceptional precision makes KNN highly actionable for fraud investigation teams: analysts can trust that nearly every flagged transaction </w:t>
+      </w:r>
+      <w:r>
+        <w:rPr>
+          <w:rFonts w:ascii="Times New Roman" w:eastAsia="Times New Roman" w:hAnsi="Times New Roman" w:cs="Times New Roman"/>
+          <w:color w:val="000000"/>
+          <w:kern w:val="0"/>
+          <w14:ligatures w14:val="none"/>
+        </w:rPr>
+        <w:t>warrant</w:t>
+      </w:r>
+      <w:r>
+        <w:rPr>
+          <w:rFonts w:ascii="Times New Roman" w:eastAsia="Times New Roman" w:hAnsi="Times New Roman" w:cs="Times New Roman"/>
+          <w:color w:val="000000"/>
+          <w:kern w:val="0"/>
+          <w14:ligatures w14:val="none"/>
+        </w:rPr>
+        <w:t xml:space="preserve"> investigation, dramatically improving operational efficiency. The lower Recall (0.7053) relative to other models means it misses approximately 30% of fraud cases, which represents a tradeoff that can be adjusted via threshold tuning.</w:t>
+      </w:r>
+    </w:p>
+    <w:p>
+      <w:pPr>
+        <w:spacing w:before="100" w:beforeAutospacing="1" w:after="100" w:afterAutospacing="1" w:line="240" w:lineRule="auto"/>
+        <w:ind w:left="720"/>
+        <w:rPr>
+          <w:rFonts w:ascii="Times New Roman" w:eastAsia="Times New Roman" w:hAnsi="Times New Roman" w:cs="Times New Roman"/>
+          <w:color w:val="000000"/>
+          <w:kern w:val="0"/>
+          <w14:ligatures w14:val="none"/>
+        </w:rPr>
+      </w:pPr>
+    </w:p>
+    <w:p>
+      <w:pPr>
+        <w:spacing w:before="100" w:beforeAutospacing="1" w:after="100" w:afterAutospacing="1" w:line="240" w:lineRule="auto"/>
+        <w:rPr>
+          <w:rFonts w:ascii="Times New Roman" w:eastAsia="Times New Roman" w:hAnsi="Times New Roman" w:cs="Times New Roman"/>
+          <w:color w:val="000000"/>
+          <w:kern w:val="0"/>
+          <w14:ligatures w14:val="none"/>
+        </w:rPr>
+      </w:pPr>
       <w:r>
         <w:rPr>
           <w:rFonts w:ascii="Times New Roman" w:eastAsia="Times New Roman" w:hAnsi="Times New Roman" w:cs="Times New Roman"/>
@@ -5963,10 +5842,10 @@
           <w:kern w:val="0"/>
         </w:rPr>
         <w:drawing>
-          <wp:inline distT="0" distB="0" distL="0" distR="0" wp14:anchorId="0893DE6A" wp14:editId="32906E7C">
-            <wp:extent cx="5617210" cy="2489200"/>
+          <wp:inline distT="0" distB="0" distL="0" distR="0" wp14:anchorId="3C4DA052" wp14:editId="19768E99">
+            <wp:extent cx="5806686" cy="3675707"/>
             <wp:effectExtent l="0" t="0" r="0" b="0"/>
-            <wp:docPr id="140443964" name="Picture 10" descr="A graph with a bar graph&#10;&#10;AI-generated content may be incorrect."/>
+            <wp:docPr id="1486875959" name="Picture 4" descr="A screenshot of a computer screen&#10;&#10;AI-generated content may be incorrect."/>
             <wp:cNvGraphicFramePr>
               <a:graphicFrameLocks xmlns:a="http://schemas.openxmlformats.org/drawingml/2006/main" noChangeAspect="1"/>
             </wp:cNvGraphicFramePr>
@@ -5974,10 +5853,10 @@
               <a:graphicData uri="http://schemas.openxmlformats.org/drawingml/2006/picture">
                 <pic:pic xmlns:pic="http://schemas.openxmlformats.org/drawingml/2006/picture">
                   <pic:nvPicPr>
-                    <pic:cNvPr id="140443964" name="Picture 10" descr="A graph with a bar graph&#10;&#10;AI-generated content may be incorrect."/>
+                    <pic:cNvPr id="1486875959" name="Picture 4" descr="A screenshot of a computer screen&#10;&#10;AI-generated content may be incorrect."/>
                     <pic:cNvPicPr/>
                   </pic:nvPicPr>
-                  <pic:blipFill rotWithShape="1">
+                  <pic:blipFill>
                     <a:blip r:embed="rId16" cstate="print">
                       <a:extLst>
                         <a:ext uri="{28A0092B-C50C-407E-A947-70E740481C1C}">
@@ -5985,7 +5864,932 @@
                         </a:ext>
                       </a:extLst>
                     </a:blip>
-                    <a:srcRect t="3795" b="3248"/>
+                    <a:stretch>
+                      <a:fillRect/>
+                    </a:stretch>
+                  </pic:blipFill>
+                  <pic:spPr>
+                    <a:xfrm>
+                      <a:off x="0" y="0"/>
+                      <a:ext cx="5879568" cy="3721842"/>
+                    </a:xfrm>
+                    <a:prstGeom prst="rect">
+                      <a:avLst/>
+                    </a:prstGeom>
+                  </pic:spPr>
+                </pic:pic>
+              </a:graphicData>
+            </a:graphic>
+          </wp:inline>
+        </w:drawing>
+      </w:r>
+    </w:p>
+    <w:p>
+      <w:pPr>
+        <w:spacing w:before="100" w:beforeAutospacing="1" w:after="100" w:afterAutospacing="1" w:line="240" w:lineRule="auto"/>
+        <w:rPr>
+          <w:rFonts w:ascii="Times New Roman" w:eastAsia="Times New Roman" w:hAnsi="Times New Roman" w:cs="Times New Roman"/>
+          <w:color w:val="000000"/>
+          <w:kern w:val="0"/>
+          <w14:ligatures w14:val="none"/>
+        </w:rPr>
+      </w:pPr>
+    </w:p>
+    <w:p>
+      <w:pPr>
+        <w:spacing w:before="100" w:beforeAutospacing="1" w:after="100" w:afterAutospacing="1" w:line="240" w:lineRule="auto"/>
+        <w:rPr>
+          <w:rFonts w:ascii="Times New Roman" w:eastAsia="Times New Roman" w:hAnsi="Times New Roman" w:cs="Times New Roman"/>
+          <w:color w:val="000000"/>
+          <w:kern w:val="0"/>
+          <w14:ligatures w14:val="none"/>
+        </w:rPr>
+      </w:pPr>
+    </w:p>
+    <w:p>
+      <w:pPr>
+        <w:spacing w:before="100" w:beforeAutospacing="1" w:after="100" w:afterAutospacing="1" w:line="240" w:lineRule="auto"/>
+        <w:rPr>
+          <w:rFonts w:ascii="Times New Roman" w:eastAsia="Times New Roman" w:hAnsi="Times New Roman" w:cs="Times New Roman"/>
+          <w:color w:val="000000"/>
+          <w:kern w:val="0"/>
+          <w14:ligatures w14:val="none"/>
+        </w:rPr>
+      </w:pPr>
+    </w:p>
+    <w:p>
+      <w:pPr>
+        <w:spacing w:before="100" w:beforeAutospacing="1" w:after="100" w:afterAutospacing="1" w:line="240" w:lineRule="auto"/>
+        <w:rPr>
+          <w:rFonts w:ascii="Times New Roman" w:eastAsia="Times New Roman" w:hAnsi="Times New Roman" w:cs="Times New Roman"/>
+          <w:color w:val="000000"/>
+          <w:kern w:val="0"/>
+          <w14:ligatures w14:val="none"/>
+        </w:rPr>
+      </w:pPr>
+    </w:p>
+    <w:p>
+      <w:pPr>
+        <w:spacing w:before="100" w:beforeAutospacing="1" w:after="100" w:afterAutospacing="1" w:line="240" w:lineRule="auto"/>
+        <w:rPr>
+          <w:rFonts w:ascii="Times New Roman" w:eastAsia="Times New Roman" w:hAnsi="Times New Roman" w:cs="Times New Roman"/>
+          <w:color w:val="000000"/>
+          <w:kern w:val="0"/>
+          <w14:ligatures w14:val="none"/>
+        </w:rPr>
+      </w:pPr>
+    </w:p>
+    <w:p>
+      <w:pPr>
+        <w:spacing w:before="100" w:beforeAutospacing="1" w:after="100" w:afterAutospacing="1" w:line="240" w:lineRule="auto"/>
+        <w:outlineLvl w:val="2"/>
+        <w:rPr>
+          <w:rFonts w:ascii="Times New Roman" w:eastAsia="Times New Roman" w:hAnsi="Times New Roman" w:cs="Times New Roman"/>
+          <w:b/>
+          <w:bCs/>
+          <w:color w:val="000000"/>
+          <w:kern w:val="0"/>
+          <w:sz w:val="27"/>
+          <w:szCs w:val="27"/>
+          <w14:ligatures w14:val="none"/>
+        </w:rPr>
+      </w:pPr>
+      <w:r>
+        <w:rPr>
+          <w:rFonts w:ascii="Times New Roman" w:eastAsia="Times New Roman" w:hAnsi="Times New Roman" w:cs="Times New Roman"/>
+          <w:b/>
+          <w:bCs/>
+          <w:color w:val="000000"/>
+          <w:kern w:val="0"/>
+          <w:sz w:val="27"/>
+          <w:szCs w:val="27"/>
+          <w14:ligatures w14:val="none"/>
+        </w:rPr>
+        <w:lastRenderedPageBreak/>
+        <w:t>4.3 Model Compariso</w:t>
+      </w:r>
+      <w:r>
+        <w:rPr>
+          <w:rFonts w:ascii="Times New Roman" w:eastAsia="Times New Roman" w:hAnsi="Times New Roman" w:cs="Times New Roman"/>
+          <w:b/>
+          <w:bCs/>
+          <w:color w:val="000000"/>
+          <w:kern w:val="0"/>
+          <w:sz w:val="27"/>
+          <w:szCs w:val="27"/>
+          <w14:ligatures w14:val="none"/>
+        </w:rPr>
+        <w:t>n</w:t>
+      </w:r>
+    </w:p>
+    <w:p>
+      <w:pPr>
+        <w:spacing w:before="100" w:beforeAutospacing="1" w:after="100" w:afterAutospacing="1" w:line="240" w:lineRule="auto"/>
+        <w:outlineLvl w:val="2"/>
+        <w:rPr>
+          <w:rFonts w:ascii="Times New Roman" w:eastAsia="Times New Roman" w:hAnsi="Times New Roman" w:cs="Times New Roman"/>
+          <w:b/>
+          <w:bCs/>
+          <w:color w:val="000000"/>
+          <w:kern w:val="0"/>
+          <w:sz w:val="27"/>
+          <w:szCs w:val="27"/>
+          <w14:ligatures w14:val="none"/>
+        </w:rPr>
+      </w:pPr>
+      <w:r>
+        <w:rPr>
+          <w:rFonts w:ascii="Times New Roman" w:eastAsia="Times New Roman" w:hAnsi="Times New Roman" w:cs="Times New Roman"/>
+          <w:b/>
+          <w:bCs/>
+          <w:noProof/>
+          <w:color w:val="000000"/>
+          <w:kern w:val="0"/>
+          <w:sz w:val="27"/>
+          <w:szCs w:val="27"/>
+        </w:rPr>
+        <w:drawing>
+          <wp:inline distT="0" distB="0" distL="0" distR="0" wp14:anchorId="6A089D13" wp14:editId="24B7769B">
+            <wp:extent cx="6502095" cy="2209045"/>
+            <wp:effectExtent l="0" t="0" r="635" b="1270"/>
+            <wp:docPr id="989730267" name="Picture 11" descr="A table of numbers with black text&#10;&#10;AI-generated content may be incorrect."/>
+            <wp:cNvGraphicFramePr>
+              <a:graphicFrameLocks xmlns:a="http://schemas.openxmlformats.org/drawingml/2006/main" noChangeAspect="1"/>
+            </wp:cNvGraphicFramePr>
+            <a:graphic xmlns:a="http://schemas.openxmlformats.org/drawingml/2006/main">
+              <a:graphicData uri="http://schemas.openxmlformats.org/drawingml/2006/picture">
+                <pic:pic xmlns:pic="http://schemas.openxmlformats.org/drawingml/2006/picture">
+                  <pic:nvPicPr>
+                    <pic:cNvPr id="989730267" name="Picture 11" descr="A table of numbers with black text&#10;&#10;AI-generated content may be incorrect."/>
+                    <pic:cNvPicPr/>
+                  </pic:nvPicPr>
+                  <pic:blipFill>
+                    <a:blip r:embed="rId17">
+                      <a:extLst>
+                        <a:ext uri="{28A0092B-C50C-407E-A947-70E740481C1C}">
+                          <a14:useLocalDpi xmlns:a14="http://schemas.microsoft.com/office/drawing/2010/main" val="0"/>
+                        </a:ext>
+                      </a:extLst>
+                    </a:blip>
+                    <a:stretch>
+                      <a:fillRect/>
+                    </a:stretch>
+                  </pic:blipFill>
+                  <pic:spPr>
+                    <a:xfrm>
+                      <a:off x="0" y="0"/>
+                      <a:ext cx="6547225" cy="2224378"/>
+                    </a:xfrm>
+                    <a:prstGeom prst="rect">
+                      <a:avLst/>
+                    </a:prstGeom>
+                  </pic:spPr>
+                </pic:pic>
+              </a:graphicData>
+            </a:graphic>
+          </wp:inline>
+        </w:drawing>
+      </w:r>
+    </w:p>
+    <w:p>
+      <w:pPr>
+        <w:spacing w:before="100" w:beforeAutospacing="1" w:after="100" w:afterAutospacing="1" w:line="240" w:lineRule="auto"/>
+        <w:outlineLvl w:val="2"/>
+        <w:rPr>
+          <w:rFonts w:ascii="Times New Roman" w:eastAsia="Times New Roman" w:hAnsi="Times New Roman" w:cs="Times New Roman"/>
+          <w:b/>
+          <w:bCs/>
+          <w:color w:val="000000"/>
+          <w:kern w:val="0"/>
+          <w:sz w:val="27"/>
+          <w:szCs w:val="27"/>
+          <w14:ligatures w14:val="none"/>
+        </w:rPr>
+      </w:pPr>
+    </w:p>
+    <w:p>
+      <w:pPr>
+        <w:spacing w:before="100" w:beforeAutospacing="1" w:after="100" w:afterAutospacing="1" w:line="240" w:lineRule="auto"/>
+        <w:outlineLvl w:val="2"/>
+        <w:rPr>
+          <w:rFonts w:ascii="Times New Roman" w:eastAsia="Times New Roman" w:hAnsi="Times New Roman" w:cs="Times New Roman"/>
+          <w:b/>
+          <w:bCs/>
+          <w:color w:val="000000"/>
+          <w:kern w:val="0"/>
+          <w:sz w:val="27"/>
+          <w:szCs w:val="27"/>
+          <w14:ligatures w14:val="none"/>
+        </w:rPr>
+      </w:pPr>
+      <w:r>
+        <w:rPr>
+          <w:rFonts w:ascii="Times New Roman" w:eastAsia="Times New Roman" w:hAnsi="Times New Roman" w:cs="Times New Roman"/>
+          <w:b/>
+          <w:bCs/>
+          <w:noProof/>
+          <w:color w:val="000000"/>
+          <w:kern w:val="0"/>
+          <w:sz w:val="27"/>
+          <w:szCs w:val="27"/>
+        </w:rPr>
+        <w:drawing>
+          <wp:inline distT="0" distB="0" distL="0" distR="0" wp14:anchorId="58ED9A59" wp14:editId="7B1CC320">
+            <wp:extent cx="6083929" cy="2780668"/>
+            <wp:effectExtent l="0" t="0" r="0" b="635"/>
+            <wp:docPr id="1350402738" name="Picture 7" descr="A close-up of a graph&#10;&#10;AI-generated content may be incorrect."/>
+            <wp:cNvGraphicFramePr>
+              <a:graphicFrameLocks xmlns:a="http://schemas.openxmlformats.org/drawingml/2006/main" noChangeAspect="1"/>
+            </wp:cNvGraphicFramePr>
+            <a:graphic xmlns:a="http://schemas.openxmlformats.org/drawingml/2006/main">
+              <a:graphicData uri="http://schemas.openxmlformats.org/drawingml/2006/picture">
+                <pic:pic xmlns:pic="http://schemas.openxmlformats.org/drawingml/2006/picture">
+                  <pic:nvPicPr>
+                    <pic:cNvPr id="1350402738" name="Picture 7" descr="A close-up of a graph&#10;&#10;AI-generated content may be incorrect."/>
+                    <pic:cNvPicPr/>
+                  </pic:nvPicPr>
+                  <pic:blipFill>
+                    <a:blip r:embed="rId18" cstate="print">
+                      <a:extLst>
+                        <a:ext uri="{28A0092B-C50C-407E-A947-70E740481C1C}">
+                          <a14:useLocalDpi xmlns:a14="http://schemas.microsoft.com/office/drawing/2010/main" val="0"/>
+                        </a:ext>
+                      </a:extLst>
+                    </a:blip>
+                    <a:stretch>
+                      <a:fillRect/>
+                    </a:stretch>
+                  </pic:blipFill>
+                  <pic:spPr>
+                    <a:xfrm>
+                      <a:off x="0" y="0"/>
+                      <a:ext cx="6100406" cy="2788199"/>
+                    </a:xfrm>
+                    <a:prstGeom prst="rect">
+                      <a:avLst/>
+                    </a:prstGeom>
+                  </pic:spPr>
+                </pic:pic>
+              </a:graphicData>
+            </a:graphic>
+          </wp:inline>
+        </w:drawing>
+      </w:r>
+    </w:p>
+    <w:p>
+      <w:pPr>
+        <w:spacing w:before="100" w:beforeAutospacing="1" w:after="100" w:afterAutospacing="1" w:line="240" w:lineRule="auto"/>
+        <w:outlineLvl w:val="2"/>
+        <w:rPr>
+          <w:rFonts w:ascii="Times New Roman" w:eastAsia="Times New Roman" w:hAnsi="Times New Roman" w:cs="Times New Roman"/>
+          <w:b/>
+          <w:bCs/>
+          <w:color w:val="000000"/>
+          <w:kern w:val="0"/>
+          <w:sz w:val="27"/>
+          <w:szCs w:val="27"/>
+          <w14:ligatures w14:val="none"/>
+        </w:rPr>
+      </w:pPr>
+    </w:p>
+    <w:p>
+      <w:pPr>
+        <w:spacing w:before="100" w:beforeAutospacing="1" w:after="100" w:afterAutospacing="1" w:line="240" w:lineRule="auto"/>
+        <w:rPr>
+          <w:rFonts w:ascii="Times New Roman" w:eastAsia="Times New Roman" w:hAnsi="Times New Roman" w:cs="Times New Roman"/>
+          <w:color w:val="000000"/>
+          <w:kern w:val="0"/>
+          <w14:ligatures w14:val="none"/>
+        </w:rPr>
+      </w:pPr>
+      <w:r>
+        <w:rPr>
+          <w:rFonts w:ascii="Times New Roman" w:eastAsia="Times New Roman" w:hAnsi="Times New Roman" w:cs="Times New Roman"/>
+          <w:color w:val="000000"/>
+          <w:kern w:val="0"/>
+          <w14:ligatures w14:val="none"/>
+        </w:rPr>
+        <w:t xml:space="preserve">The results reveal a clear story. Random Forest dominates on both F1-Score (0.6449) and ROC-AUC (0.9782) </w:t>
+      </w:r>
+      <w:r>
+        <w:rPr>
+          <w:rFonts w:ascii="Times New Roman" w:eastAsia="Times New Roman" w:hAnsi="Times New Roman" w:cs="Times New Roman"/>
+          <w:color w:val="000000"/>
+          <w:kern w:val="0"/>
+          <w14:ligatures w14:val="none"/>
+        </w:rPr>
+        <w:t>which are</w:t>
+      </w:r>
+      <w:r>
+        <w:rPr>
+          <w:rFonts w:ascii="Times New Roman" w:eastAsia="Times New Roman" w:hAnsi="Times New Roman" w:cs="Times New Roman"/>
+          <w:color w:val="000000"/>
+          <w:kern w:val="0"/>
+          <w14:ligatures w14:val="none"/>
+        </w:rPr>
+        <w:t xml:space="preserve"> the two most important metrics for this problem. Logistic Regression leads on Recall (0.8737) but at the cost of overwhelming false alarms. Decision Tree has the highest F1 among the remaining three (0.1535) but still far below Random Forest. KNN has strong Recall (0.8632) but similarly low precision. Random Forest is the clear winner when both catching fraud and avoiding false alarms are considered together.</w:t>
+      </w:r>
+    </w:p>
+    <w:p>
+      <w:pPr>
+        <w:spacing w:before="100" w:beforeAutospacing="1" w:after="100" w:afterAutospacing="1" w:line="240" w:lineRule="auto"/>
+        <w:rPr>
+          <w:rFonts w:ascii="Times New Roman" w:eastAsia="Times New Roman" w:hAnsi="Times New Roman" w:cs="Times New Roman"/>
+          <w:color w:val="000000"/>
+          <w:kern w:val="0"/>
+          <w14:ligatures w14:val="none"/>
+        </w:rPr>
+      </w:pPr>
+    </w:p>
+    <w:p>
+      <w:pPr>
+        <w:spacing w:before="100" w:beforeAutospacing="1" w:after="100" w:afterAutospacing="1" w:line="240" w:lineRule="auto"/>
+        <w:outlineLvl w:val="2"/>
+        <w:rPr>
+          <w:rFonts w:ascii="Times New Roman" w:eastAsia="Times New Roman" w:hAnsi="Times New Roman" w:cs="Times New Roman"/>
+          <w:b/>
+          <w:bCs/>
+          <w:color w:val="000000"/>
+          <w:kern w:val="0"/>
+          <w:sz w:val="27"/>
+          <w:szCs w:val="27"/>
+          <w14:ligatures w14:val="none"/>
+        </w:rPr>
+      </w:pPr>
+      <w:r>
+        <w:rPr>
+          <w:rFonts w:ascii="Times New Roman" w:eastAsia="Times New Roman" w:hAnsi="Times New Roman" w:cs="Times New Roman"/>
+          <w:b/>
+          <w:bCs/>
+          <w:color w:val="000000"/>
+          <w:kern w:val="0"/>
+          <w:sz w:val="27"/>
+          <w:szCs w:val="27"/>
+          <w14:ligatures w14:val="none"/>
+        </w:rPr>
+        <w:lastRenderedPageBreak/>
+        <w:t xml:space="preserve">4.4 </w:t>
+      </w:r>
+      <w:r>
+        <w:rPr>
+          <w:rFonts w:ascii="Times New Roman" w:eastAsia="Times New Roman" w:hAnsi="Times New Roman" w:cs="Times New Roman"/>
+          <w:b/>
+          <w:bCs/>
+          <w:color w:val="000000"/>
+          <w:kern w:val="0"/>
+          <w:sz w:val="27"/>
+          <w:szCs w:val="27"/>
+          <w14:ligatures w14:val="none"/>
+        </w:rPr>
+        <w:t>Visual Proof</w:t>
+      </w:r>
+      <w:r>
+        <w:rPr>
+          <w:rFonts w:ascii="Times New Roman" w:eastAsia="Times New Roman" w:hAnsi="Times New Roman" w:cs="Times New Roman"/>
+          <w:b/>
+          <w:bCs/>
+          <w:color w:val="000000"/>
+          <w:kern w:val="0"/>
+          <w:sz w:val="27"/>
+          <w:szCs w:val="27"/>
+          <w14:ligatures w14:val="none"/>
+        </w:rPr>
+        <w:t>:</w:t>
+      </w:r>
+      <w:r>
+        <w:rPr>
+          <w:rFonts w:ascii="Times New Roman" w:eastAsia="Times New Roman" w:hAnsi="Times New Roman" w:cs="Times New Roman"/>
+          <w:b/>
+          <w:bCs/>
+          <w:color w:val="000000"/>
+          <w:kern w:val="0"/>
+          <w:sz w:val="27"/>
+          <w:szCs w:val="27"/>
+          <w14:ligatures w14:val="none"/>
+        </w:rPr>
+        <w:t xml:space="preserve"> Why F1-Score is the Primary Metric</w:t>
+      </w:r>
+    </w:p>
+    <w:p>
+      <w:pPr>
+        <w:spacing w:after="0" w:line="240" w:lineRule="auto"/>
+        <w:rPr>
+          <w:rFonts w:ascii="Times New Roman" w:eastAsia="Times New Roman" w:hAnsi="Times New Roman" w:cs="Times New Roman"/>
+          <w:color w:val="000000"/>
+          <w:kern w:val="0"/>
+          <w14:ligatures w14:val="none"/>
+        </w:rPr>
+      </w:pPr>
+      <w:r>
+        <w:rPr>
+          <w:rFonts w:ascii="Times New Roman" w:eastAsia="Times New Roman" w:hAnsi="Times New Roman" w:cs="Times New Roman"/>
+          <w:color w:val="000000"/>
+          <w:kern w:val="0"/>
+          <w14:ligatures w14:val="none"/>
+        </w:rPr>
+        <w:t>To formally justify F1-Score as our primary metric, we ran a comprehensive 7-chart visual analysis comparing all metrics across models and against a dummy baseline.</w:t>
+      </w:r>
+    </w:p>
+    <w:p>
+      <w:pPr>
+        <w:spacing w:after="0" w:line="240" w:lineRule="auto"/>
+        <w:rPr>
+          <w:rFonts w:ascii="Times New Roman" w:eastAsia="Times New Roman" w:hAnsi="Times New Roman" w:cs="Times New Roman"/>
+          <w:color w:val="000000"/>
+          <w:kern w:val="0"/>
+          <w14:ligatures w14:val="none"/>
+        </w:rPr>
+      </w:pPr>
+    </w:p>
+    <w:p>
+      <w:pPr>
+        <w:spacing w:after="0" w:line="240" w:lineRule="auto"/>
+        <w:rPr>
+          <w:rFonts w:ascii="Times New Roman" w:eastAsia="Times New Roman" w:hAnsi="Times New Roman" w:cs="Times New Roman"/>
+          <w:color w:val="000000"/>
+          <w:kern w:val="0"/>
+          <w14:ligatures w14:val="none"/>
+        </w:rPr>
+      </w:pPr>
+      <w:r>
+        <w:rPr>
+          <w:rFonts w:ascii="Times New Roman" w:eastAsia="Times New Roman" w:hAnsi="Times New Roman" w:cs="Times New Roman"/>
+          <w:b/>
+          <w:bCs/>
+          <w:color w:val="000000"/>
+          <w:kern w:val="0"/>
+          <w14:ligatures w14:val="none"/>
+        </w:rPr>
+        <w:t>1.</w:t>
+      </w:r>
+      <w:r>
+        <w:rPr>
+          <w:rFonts w:ascii="Times New Roman" w:eastAsia="Times New Roman" w:hAnsi="Times New Roman" w:cs="Times New Roman"/>
+          <w:b/>
+          <w:bCs/>
+          <w:color w:val="000000"/>
+          <w:kern w:val="0"/>
+          <w14:ligatures w14:val="none"/>
+        </w:rPr>
+        <w:t>The Accuracy Paradox:</w:t>
+      </w:r>
+      <w:r>
+        <w:rPr>
+          <w:rFonts w:ascii="Times New Roman" w:eastAsia="Times New Roman" w:hAnsi="Times New Roman" w:cs="Times New Roman"/>
+          <w:color w:val="000000"/>
+          <w:kern w:val="0"/>
+          <w14:ligatures w14:val="none"/>
+        </w:rPr>
+        <w:t xml:space="preserve"> A DummyClassifier that always predicts "Legitimate" </w:t>
+      </w:r>
+      <w:r>
+        <w:rPr>
+          <w:rFonts w:ascii="Times New Roman" w:eastAsia="Times New Roman" w:hAnsi="Times New Roman" w:cs="Times New Roman"/>
+          <w:color w:val="000000"/>
+          <w:kern w:val="0"/>
+          <w14:ligatures w14:val="none"/>
+        </w:rPr>
+        <w:t xml:space="preserve">- </w:t>
+      </w:r>
+      <w:r>
+        <w:rPr>
+          <w:rFonts w:ascii="Times New Roman" w:eastAsia="Times New Roman" w:hAnsi="Times New Roman" w:cs="Times New Roman"/>
+          <w:color w:val="000000"/>
+          <w:kern w:val="0"/>
+          <w14:ligatures w14:val="none"/>
+        </w:rPr>
+        <w:t xml:space="preserve">the </w:t>
+      </w:r>
+      <w:r>
+        <w:rPr>
+          <w:rFonts w:ascii="Times New Roman" w:eastAsia="Times New Roman" w:hAnsi="Times New Roman" w:cs="Times New Roman"/>
+          <w:color w:val="000000"/>
+          <w:kern w:val="0"/>
+          <w14:ligatures w14:val="none"/>
+        </w:rPr>
+        <w:t>naivest</w:t>
+      </w:r>
+      <w:r>
+        <w:rPr>
+          <w:rFonts w:ascii="Times New Roman" w:eastAsia="Times New Roman" w:hAnsi="Times New Roman" w:cs="Times New Roman"/>
+          <w:color w:val="000000"/>
+          <w:kern w:val="0"/>
+          <w14:ligatures w14:val="none"/>
+        </w:rPr>
+        <w:t xml:space="preserve"> model possible — scores 0.9983 accuracy on our test set. This is nearly identical to our trained models on that metric. Its F1-Score is 0.0000. This single comparison is the most compelling proof that accuracy is completely meaningless here: it cannot distinguish between a useless model and a well-tuned one.</w:t>
+      </w:r>
+    </w:p>
+    <w:p>
+      <w:pPr>
+        <w:spacing w:after="0" w:line="240" w:lineRule="auto"/>
+        <w:rPr>
+          <w:rFonts w:ascii="Times New Roman" w:eastAsia="Times New Roman" w:hAnsi="Times New Roman" w:cs="Times New Roman"/>
+          <w:color w:val="000000"/>
+          <w:kern w:val="0"/>
+          <w14:ligatures w14:val="none"/>
+        </w:rPr>
+      </w:pPr>
+    </w:p>
+    <w:p>
+      <w:pPr>
+        <w:spacing w:after="0" w:line="240" w:lineRule="auto"/>
+        <w:rPr>
+          <w:rFonts w:ascii="Times New Roman" w:eastAsia="Times New Roman" w:hAnsi="Times New Roman" w:cs="Times New Roman"/>
+          <w:color w:val="000000"/>
+          <w:kern w:val="0"/>
+          <w14:ligatures w14:val="none"/>
+        </w:rPr>
+      </w:pPr>
+      <w:r>
+        <w:rPr>
+          <w:rFonts w:ascii="Times New Roman" w:eastAsia="Times New Roman" w:hAnsi="Times New Roman" w:cs="Times New Roman"/>
+          <w:b/>
+          <w:bCs/>
+          <w:color w:val="000000"/>
+          <w:kern w:val="0"/>
+          <w14:ligatures w14:val="none"/>
+        </w:rPr>
+        <w:t>2.</w:t>
+      </w:r>
+      <w:r>
+        <w:rPr>
+          <w:rFonts w:ascii="Times New Roman" w:eastAsia="Times New Roman" w:hAnsi="Times New Roman" w:cs="Times New Roman"/>
+          <w:b/>
+          <w:bCs/>
+          <w:color w:val="000000"/>
+          <w:kern w:val="0"/>
+          <w14:ligatures w14:val="none"/>
+        </w:rPr>
+        <w:t>F1 Reveals Real Differences:</w:t>
+      </w:r>
+      <w:r>
+        <w:rPr>
+          <w:rFonts w:ascii="Times New Roman" w:eastAsia="Times New Roman" w:hAnsi="Times New Roman" w:cs="Times New Roman"/>
+          <w:color w:val="000000"/>
+          <w:kern w:val="0"/>
+          <w14:ligatures w14:val="none"/>
+        </w:rPr>
+        <w:t> </w:t>
+      </w:r>
+      <w:r>
+        <w:rPr>
+          <w:rFonts w:ascii="Times New Roman" w:eastAsia="Times New Roman" w:hAnsi="Times New Roman" w:cs="Times New Roman"/>
+          <w:color w:val="000000"/>
+          <w:kern w:val="0"/>
+          <w14:ligatures w14:val="none"/>
+        </w:rPr>
+        <w:t>On accuracy, all four models score between 0.97 and 1.00</w:t>
+      </w:r>
+      <w:r>
+        <w:rPr>
+          <w:rFonts w:ascii="Times New Roman" w:eastAsia="Times New Roman" w:hAnsi="Times New Roman" w:cs="Times New Roman"/>
+          <w:color w:val="000000"/>
+          <w:kern w:val="0"/>
+          <w14:ligatures w14:val="none"/>
+        </w:rPr>
+        <w:t xml:space="preserve"> which is</w:t>
+      </w:r>
+      <w:r>
+        <w:rPr>
+          <w:rFonts w:ascii="Times New Roman" w:eastAsia="Times New Roman" w:hAnsi="Times New Roman" w:cs="Times New Roman"/>
+          <w:color w:val="000000"/>
+          <w:kern w:val="0"/>
+          <w14:ligatures w14:val="none"/>
+        </w:rPr>
+        <w:t xml:space="preserve"> barely distinguishable. On F1-Score, Random Forest (0.6449) is clearly separated from the others (all below 0.16). F1-Score is the most discriminating metric we evaluated, with the largest spread between best and worst model (0.547).</w:t>
+      </w:r>
+    </w:p>
+    <w:p>
+      <w:pPr>
+        <w:spacing w:after="0" w:line="240" w:lineRule="auto"/>
+        <w:rPr>
+          <w:rFonts w:ascii="Times New Roman" w:eastAsia="Times New Roman" w:hAnsi="Times New Roman" w:cs="Times New Roman"/>
+          <w:color w:val="000000"/>
+          <w:kern w:val="0"/>
+          <w14:ligatures w14:val="none"/>
+        </w:rPr>
+      </w:pPr>
+    </w:p>
+    <w:p>
+      <w:pPr>
+        <w:spacing w:after="0" w:line="240" w:lineRule="auto"/>
+        <w:rPr>
+          <w:rFonts w:ascii="Times New Roman" w:eastAsia="Times New Roman" w:hAnsi="Times New Roman" w:cs="Times New Roman"/>
+          <w:color w:val="000000"/>
+          <w:kern w:val="0"/>
+          <w14:ligatures w14:val="none"/>
+        </w:rPr>
+      </w:pPr>
+      <w:r>
+        <w:rPr>
+          <w:rFonts w:ascii="Times New Roman" w:eastAsia="Times New Roman" w:hAnsi="Times New Roman" w:cs="Times New Roman"/>
+          <w:b/>
+          <w:bCs/>
+          <w:color w:val="000000"/>
+          <w:kern w:val="0"/>
+          <w14:ligatures w14:val="none"/>
+        </w:rPr>
+        <w:t>3.</w:t>
+      </w:r>
+      <w:r>
+        <w:rPr>
+          <w:rFonts w:ascii="Times New Roman" w:eastAsia="Times New Roman" w:hAnsi="Times New Roman" w:cs="Times New Roman"/>
+          <w:b/>
+          <w:bCs/>
+          <w:color w:val="000000"/>
+          <w:kern w:val="0"/>
+          <w14:ligatures w14:val="none"/>
+        </w:rPr>
+        <w:t>Human Impact Charts:</w:t>
+      </w:r>
+      <w:r>
+        <w:rPr>
+          <w:rFonts w:ascii="Times New Roman" w:eastAsia="Times New Roman" w:hAnsi="Times New Roman" w:cs="Times New Roman"/>
+          <w:color w:val="000000"/>
+          <w:kern w:val="0"/>
+          <w14:ligatures w14:val="none"/>
+        </w:rPr>
+        <w:t> </w:t>
+      </w:r>
+      <w:r>
+        <w:rPr>
+          <w:rFonts w:ascii="Times New Roman" w:eastAsia="Times New Roman" w:hAnsi="Times New Roman" w:cs="Times New Roman"/>
+          <w:color w:val="000000"/>
+          <w:kern w:val="0"/>
+          <w14:ligatures w14:val="none"/>
+        </w:rPr>
+        <w:t>Visualizing true positives vs. false negatives shows how many of the 95 actual fraud cases each model caught vs. missed. Visualizing false positives shows how many legitimate customers were wrongly blocked. Accuracy never shows either of these. F1-Score through Precision and Recall penalizes both error types simultaneously.</w:t>
+      </w:r>
+    </w:p>
+    <w:p>
+      <w:pPr>
+        <w:spacing w:after="0" w:line="240" w:lineRule="auto"/>
+        <w:rPr>
+          <w:rFonts w:ascii="Times New Roman" w:eastAsia="Times New Roman" w:hAnsi="Times New Roman" w:cs="Times New Roman"/>
+          <w:color w:val="000000"/>
+          <w:kern w:val="0"/>
+          <w14:ligatures w14:val="none"/>
+        </w:rPr>
+      </w:pPr>
+    </w:p>
+    <w:p>
+      <w:pPr>
+        <w:spacing w:after="0" w:line="240" w:lineRule="auto"/>
+        <w:rPr>
+          <w:rFonts w:ascii="Times New Roman" w:eastAsia="Times New Roman" w:hAnsi="Times New Roman" w:cs="Times New Roman"/>
+          <w:color w:val="000000"/>
+          <w:kern w:val="0"/>
+          <w14:ligatures w14:val="none"/>
+        </w:rPr>
+      </w:pPr>
+      <w:r>
+        <w:rPr>
+          <w:rFonts w:ascii="Times New Roman" w:eastAsia="Times New Roman" w:hAnsi="Times New Roman" w:cs="Times New Roman"/>
+          <w:b/>
+          <w:bCs/>
+          <w:color w:val="000000"/>
+          <w:kern w:val="0"/>
+          <w14:ligatures w14:val="none"/>
+        </w:rPr>
+        <w:t>4.</w:t>
+      </w:r>
+      <w:r>
+        <w:rPr>
+          <w:rFonts w:ascii="Times New Roman" w:eastAsia="Times New Roman" w:hAnsi="Times New Roman" w:cs="Times New Roman"/>
+          <w:b/>
+          <w:bCs/>
+          <w:color w:val="000000"/>
+          <w:kern w:val="0"/>
+          <w14:ligatures w14:val="none"/>
+        </w:rPr>
+        <w:t>F1 Has the Largest Spread:</w:t>
+      </w:r>
+      <w:r>
+        <w:rPr>
+          <w:rFonts w:ascii="Times New Roman" w:eastAsia="Times New Roman" w:hAnsi="Times New Roman" w:cs="Times New Roman"/>
+          <w:color w:val="000000"/>
+          <w:kern w:val="0"/>
+          <w14:ligatures w14:val="none"/>
+        </w:rPr>
+        <w:t> </w:t>
+      </w:r>
+      <w:r>
+        <w:rPr>
+          <w:rFonts w:ascii="Times New Roman" w:eastAsia="Times New Roman" w:hAnsi="Times New Roman" w:cs="Times New Roman"/>
+          <w:color w:val="000000"/>
+          <w:kern w:val="0"/>
+          <w14:ligatures w14:val="none"/>
+        </w:rPr>
+        <w:t>Across all four metrics, F1-Score showed the largest spread between models (0.547) compared to Accuracy (0.025), Recall (0.053), and Precision (0.475). This confirms that F1-Score is the most informative metric for distinguishing genuine model quality differences in this problem.</w:t>
+      </w:r>
+    </w:p>
+    <w:p>
+      <w:pPr>
+        <w:spacing w:after="0" w:line="240" w:lineRule="auto"/>
+        <w:rPr>
+          <w:rFonts w:ascii="Times New Roman" w:eastAsia="Times New Roman" w:hAnsi="Times New Roman" w:cs="Times New Roman"/>
+          <w:color w:val="000000"/>
+          <w:kern w:val="0"/>
+          <w14:ligatures w14:val="none"/>
+        </w:rPr>
+      </w:pPr>
+    </w:p>
+    <w:p>
+      <w:pPr>
+        <w:spacing w:after="0" w:line="240" w:lineRule="auto"/>
+        <w:rPr>
+          <w:rFonts w:ascii="Times New Roman" w:eastAsia="Times New Roman" w:hAnsi="Times New Roman" w:cs="Times New Roman"/>
+          <w:color w:val="000000"/>
+          <w:kern w:val="0"/>
+          <w14:ligatures w14:val="none"/>
+        </w:rPr>
+      </w:pPr>
+      <w:r>
+        <w:rPr>
+          <w:rFonts w:ascii="Times New Roman" w:eastAsia="Times New Roman" w:hAnsi="Times New Roman" w:cs="Times New Roman"/>
+          <w:noProof/>
+          <w:color w:val="000000"/>
+          <w:kern w:val="0"/>
+        </w:rPr>
+        <w:drawing>
+          <wp:inline distT="0" distB="0" distL="0" distR="0" wp14:anchorId="3146D49D" wp14:editId="695C54A2">
+            <wp:extent cx="6138522" cy="3485710"/>
+            <wp:effectExtent l="0" t="0" r="0" b="0"/>
+            <wp:docPr id="298423165" name="Picture 8"/>
+            <wp:cNvGraphicFramePr>
+              <a:graphicFrameLocks xmlns:a="http://schemas.openxmlformats.org/drawingml/2006/main" noChangeAspect="1"/>
+            </wp:cNvGraphicFramePr>
+            <a:graphic xmlns:a="http://schemas.openxmlformats.org/drawingml/2006/main">
+              <a:graphicData uri="http://schemas.openxmlformats.org/drawingml/2006/picture">
+                <pic:pic xmlns:pic="http://schemas.openxmlformats.org/drawingml/2006/picture">
+                  <pic:nvPicPr>
+                    <pic:cNvPr id="298423165" name="Picture 298423165"/>
+                    <pic:cNvPicPr/>
+                  </pic:nvPicPr>
+                  <pic:blipFill>
+                    <a:blip r:embed="rId19" cstate="print">
+                      <a:extLst>
+                        <a:ext uri="{28A0092B-C50C-407E-A947-70E740481C1C}">
+                          <a14:useLocalDpi xmlns:a14="http://schemas.microsoft.com/office/drawing/2010/main" val="0"/>
+                        </a:ext>
+                      </a:extLst>
+                    </a:blip>
+                    <a:stretch>
+                      <a:fillRect/>
+                    </a:stretch>
+                  </pic:blipFill>
+                  <pic:spPr>
+                    <a:xfrm>
+                      <a:off x="0" y="0"/>
+                      <a:ext cx="6178161" cy="3508219"/>
+                    </a:xfrm>
+                    <a:prstGeom prst="rect">
+                      <a:avLst/>
+                    </a:prstGeom>
+                  </pic:spPr>
+                </pic:pic>
+              </a:graphicData>
+            </a:graphic>
+          </wp:inline>
+        </w:drawing>
+      </w:r>
+    </w:p>
+    <w:p>
+      <w:pPr>
+        <w:spacing w:after="0" w:line="240" w:lineRule="auto"/>
+        <w:rPr>
+          <w:rFonts w:ascii="Times New Roman" w:eastAsia="Times New Roman" w:hAnsi="Times New Roman" w:cs="Times New Roman"/>
+          <w:color w:val="000000"/>
+          <w:kern w:val="0"/>
+          <w14:ligatures w14:val="none"/>
+        </w:rPr>
+      </w:pPr>
+      <w:r>
+        <w:rPr>
+          <w:rFonts w:ascii="Times New Roman" w:eastAsia="Times New Roman" w:hAnsi="Times New Roman" w:cs="Times New Roman"/>
+          <w:noProof/>
+          <w:color w:val="000000"/>
+          <w:kern w:val="0"/>
+        </w:rPr>
+        <w:lastRenderedPageBreak/>
+        <w:drawing>
+          <wp:inline distT="0" distB="0" distL="0" distR="0" wp14:anchorId="7120F948" wp14:editId="235AB19B">
+            <wp:extent cx="6381341" cy="1846907"/>
+            <wp:effectExtent l="0" t="0" r="0" b="0"/>
+            <wp:docPr id="1120817017" name="Picture 9" descr="A graph with different colored bars&#10;&#10;AI-generated content may be incorrect."/>
+            <wp:cNvGraphicFramePr>
+              <a:graphicFrameLocks xmlns:a="http://schemas.openxmlformats.org/drawingml/2006/main" noChangeAspect="1"/>
+            </wp:cNvGraphicFramePr>
+            <a:graphic xmlns:a="http://schemas.openxmlformats.org/drawingml/2006/main">
+              <a:graphicData uri="http://schemas.openxmlformats.org/drawingml/2006/picture">
+                <pic:pic xmlns:pic="http://schemas.openxmlformats.org/drawingml/2006/picture">
+                  <pic:nvPicPr>
+                    <pic:cNvPr id="1120817017" name="Picture 9" descr="A graph with different colored bars&#10;&#10;AI-generated content may be incorrect."/>
+                    <pic:cNvPicPr/>
+                  </pic:nvPicPr>
+                  <pic:blipFill>
+                    <a:blip r:embed="rId20" cstate="print">
+                      <a:extLst>
+                        <a:ext uri="{28A0092B-C50C-407E-A947-70E740481C1C}">
+                          <a14:useLocalDpi xmlns:a14="http://schemas.microsoft.com/office/drawing/2010/main" val="0"/>
+                        </a:ext>
+                      </a:extLst>
+                    </a:blip>
+                    <a:stretch>
+                      <a:fillRect/>
+                    </a:stretch>
+                  </pic:blipFill>
+                  <pic:spPr>
+                    <a:xfrm>
+                      <a:off x="0" y="0"/>
+                      <a:ext cx="6496864" cy="1880342"/>
+                    </a:xfrm>
+                    <a:prstGeom prst="rect">
+                      <a:avLst/>
+                    </a:prstGeom>
+                  </pic:spPr>
+                </pic:pic>
+              </a:graphicData>
+            </a:graphic>
+          </wp:inline>
+        </w:drawing>
+      </w:r>
+    </w:p>
+    <w:p>
+      <w:pPr>
+        <w:spacing w:after="0" w:line="240" w:lineRule="auto"/>
+        <w:rPr>
+          <w:rFonts w:ascii="Times New Roman" w:eastAsia="Times New Roman" w:hAnsi="Times New Roman" w:cs="Times New Roman"/>
+          <w:color w:val="000000"/>
+          <w:kern w:val="0"/>
+          <w14:ligatures w14:val="none"/>
+        </w:rPr>
+      </w:pPr>
+    </w:p>
+    <w:p>
+      <w:pPr>
+        <w:spacing w:after="0" w:line="240" w:lineRule="auto"/>
+        <w:rPr>
+          <w:rFonts w:ascii="Times New Roman" w:eastAsia="Times New Roman" w:hAnsi="Times New Roman" w:cs="Times New Roman"/>
+          <w:color w:val="000000"/>
+          <w:kern w:val="0"/>
+          <w14:ligatures w14:val="none"/>
+        </w:rPr>
+      </w:pPr>
+    </w:p>
+    <w:p>
+      <w:pPr>
+        <w:spacing w:after="0" w:line="240" w:lineRule="auto"/>
+        <w:rPr>
+          <w:rFonts w:ascii="Times New Roman" w:eastAsia="Times New Roman" w:hAnsi="Times New Roman" w:cs="Times New Roman"/>
+          <w:color w:val="000000"/>
+          <w:kern w:val="0"/>
+          <w14:ligatures w14:val="none"/>
+        </w:rPr>
+      </w:pPr>
+    </w:p>
+    <w:p>
+      <w:pPr>
+        <w:spacing w:after="0" w:line="240" w:lineRule="auto"/>
+        <w:ind w:left="1440" w:firstLine="720"/>
+        <w:rPr>
+          <w:rFonts w:ascii="Times New Roman" w:eastAsia="Times New Roman" w:hAnsi="Times New Roman" w:cs="Times New Roman"/>
+          <w:color w:val="000000"/>
+          <w:kern w:val="0"/>
+          <w14:ligatures w14:val="none"/>
+        </w:rPr>
+      </w:pPr>
+      <w:r>
+        <w:rPr>
+          <w:rFonts w:ascii="Times New Roman" w:eastAsia="Times New Roman" w:hAnsi="Times New Roman" w:cs="Times New Roman"/>
+          <w:noProof/>
+          <w:color w:val="000000"/>
+          <w:kern w:val="0"/>
+        </w:rPr>
+        <w:drawing>
+          <wp:inline distT="0" distB="0" distL="0" distR="0" wp14:anchorId="412E6F88" wp14:editId="323B2DD9">
+            <wp:extent cx="3892990" cy="3576955"/>
+            <wp:effectExtent l="0" t="0" r="6350" b="4445"/>
+            <wp:docPr id="2076602485" name="Picture 10" descr="A screenshot of a computer&#10;&#10;AI-generated content may be incorrect."/>
+            <wp:cNvGraphicFramePr>
+              <a:graphicFrameLocks xmlns:a="http://schemas.openxmlformats.org/drawingml/2006/main" noChangeAspect="1"/>
+            </wp:cNvGraphicFramePr>
+            <a:graphic xmlns:a="http://schemas.openxmlformats.org/drawingml/2006/main">
+              <a:graphicData uri="http://schemas.openxmlformats.org/drawingml/2006/picture">
+                <pic:pic xmlns:pic="http://schemas.openxmlformats.org/drawingml/2006/picture">
+                  <pic:nvPicPr>
+                    <pic:cNvPr id="2076602485" name="Picture 10" descr="A screenshot of a computer&#10;&#10;AI-generated content may be incorrect."/>
+                    <pic:cNvPicPr/>
+                  </pic:nvPicPr>
+                  <pic:blipFill rotWithShape="1">
+                    <a:blip r:embed="rId21" cstate="print">
+                      <a:extLst>
+                        <a:ext uri="{28A0092B-C50C-407E-A947-70E740481C1C}">
+                          <a14:useLocalDpi xmlns:a14="http://schemas.microsoft.com/office/drawing/2010/main" val="0"/>
+                        </a:ext>
+                      </a:extLst>
+                    </a:blip>
+                    <a:srcRect r="34501"/>
                     <a:stretch>
                       <a:fillRect/>
                     </a:stretch>
@@ -5993,7 +6797,7 @@
                   <pic:spPr bwMode="auto">
                     <a:xfrm>
                       <a:off x="0" y="0"/>
-                      <a:ext cx="5661910" cy="2509008"/>
+                      <a:ext cx="3892990" cy="3576955"/>
                     </a:xfrm>
                     <a:prstGeom prst="rect">
                       <a:avLst/>
@@ -6016,21 +6820,139 @@
     </w:p>
     <w:p>
       <w:pPr>
-        <w:spacing w:before="100" w:beforeAutospacing="1" w:after="100" w:afterAutospacing="1" w:line="240" w:lineRule="auto"/>
-        <w:rPr>
-          <w:rFonts w:ascii="Times New Roman" w:eastAsia="Times New Roman" w:hAnsi="Times New Roman" w:cs="Times New Roman"/>
-          <w:color w:val="000000"/>
-          <w:kern w:val="0"/>
-          <w14:ligatures w14:val="none"/>
-        </w:rPr>
-      </w:pPr>
-      <w:r>
-        <w:rPr>
-          <w:rFonts w:ascii="Times New Roman" w:eastAsia="Times New Roman" w:hAnsi="Times New Roman" w:cs="Times New Roman"/>
-          <w:b/>
-          <w:bCs/>
-          <w:color w:val="000000"/>
-          <w:kern w:val="0"/>
+        <w:spacing w:after="0" w:line="240" w:lineRule="auto"/>
+        <w:rPr>
+          <w:rFonts w:ascii="Times New Roman" w:eastAsia="Times New Roman" w:hAnsi="Times New Roman" w:cs="Times New Roman"/>
+          <w:color w:val="000000"/>
+          <w:kern w:val="0"/>
+          <w14:ligatures w14:val="none"/>
+        </w:rPr>
+      </w:pPr>
+    </w:p>
+    <w:p>
+      <w:pPr>
+        <w:spacing w:after="0" w:line="240" w:lineRule="auto"/>
+        <w:rPr>
+          <w:rFonts w:ascii="Times New Roman" w:eastAsia="Times New Roman" w:hAnsi="Times New Roman" w:cs="Times New Roman"/>
+          <w:kern w:val="0"/>
+          <w14:ligatures w14:val="none"/>
+        </w:rPr>
+      </w:pPr>
+      <w:r>
+        <w:rPr>
+          <w:rFonts w:ascii="Times New Roman" w:eastAsia="Times New Roman" w:hAnsi="Times New Roman" w:cs="Times New Roman"/>
+          <w:noProof/>
+          <w:kern w:val="0"/>
+        </w:rPr>
+        <w:pict w14:anchorId="3B571C89">
+          <v:rect id="_x0000_i1027" alt="" style="width:468pt;height:.05pt;mso-width-percent:0;mso-height-percent:0;mso-width-percent:0;mso-height-percent:0" o:hralign="center" o:hrstd="t" o:hr="t" fillcolor="#a0a0a0" stroked="f"/>
+        </w:pict>
+      </w:r>
+    </w:p>
+    <w:p>
+      <w:pPr>
+        <w:spacing w:before="100" w:beforeAutospacing="1" w:after="100" w:afterAutospacing="1" w:line="240" w:lineRule="auto"/>
+        <w:outlineLvl w:val="2"/>
+        <w:rPr>
+          <w:rFonts w:ascii="Times New Roman" w:eastAsia="Times New Roman" w:hAnsi="Times New Roman" w:cs="Times New Roman"/>
+          <w:b/>
+          <w:bCs/>
+          <w:color w:val="000000"/>
+          <w:kern w:val="0"/>
+          <w:sz w:val="27"/>
+          <w:szCs w:val="27"/>
+          <w14:ligatures w14:val="none"/>
+        </w:rPr>
+      </w:pPr>
+    </w:p>
+    <w:p>
+      <w:pPr>
+        <w:spacing w:before="100" w:beforeAutospacing="1" w:after="100" w:afterAutospacing="1" w:line="240" w:lineRule="auto"/>
+        <w:outlineLvl w:val="2"/>
+        <w:rPr>
+          <w:rFonts w:ascii="Times New Roman" w:eastAsia="Times New Roman" w:hAnsi="Times New Roman" w:cs="Times New Roman"/>
+          <w:b/>
+          <w:bCs/>
+          <w:color w:val="000000"/>
+          <w:kern w:val="0"/>
+          <w:sz w:val="27"/>
+          <w:szCs w:val="27"/>
+          <w14:ligatures w14:val="none"/>
+        </w:rPr>
+      </w:pPr>
+    </w:p>
+    <w:p>
+      <w:pPr>
+        <w:spacing w:before="100" w:beforeAutospacing="1" w:after="100" w:afterAutospacing="1" w:line="240" w:lineRule="auto"/>
+        <w:outlineLvl w:val="2"/>
+        <w:rPr>
+          <w:rFonts w:ascii="Times New Roman" w:eastAsia="Times New Roman" w:hAnsi="Times New Roman" w:cs="Times New Roman"/>
+          <w:b/>
+          <w:bCs/>
+          <w:color w:val="000000"/>
+          <w:kern w:val="0"/>
+          <w:sz w:val="27"/>
+          <w:szCs w:val="27"/>
+          <w14:ligatures w14:val="none"/>
+        </w:rPr>
+      </w:pPr>
+    </w:p>
+    <w:p>
+      <w:pPr>
+        <w:spacing w:before="100" w:beforeAutospacing="1" w:after="100" w:afterAutospacing="1" w:line="240" w:lineRule="auto"/>
+        <w:outlineLvl w:val="2"/>
+        <w:rPr>
+          <w:rFonts w:ascii="Times New Roman" w:eastAsia="Times New Roman" w:hAnsi="Times New Roman" w:cs="Times New Roman"/>
+          <w:b/>
+          <w:bCs/>
+          <w:color w:val="000000"/>
+          <w:kern w:val="0"/>
+          <w:sz w:val="27"/>
+          <w:szCs w:val="27"/>
+          <w14:ligatures w14:val="none"/>
+        </w:rPr>
+      </w:pPr>
+    </w:p>
+    <w:p>
+      <w:pPr>
+        <w:spacing w:before="100" w:beforeAutospacing="1" w:after="100" w:afterAutospacing="1" w:line="240" w:lineRule="auto"/>
+        <w:outlineLvl w:val="2"/>
+        <w:rPr>
+          <w:rFonts w:ascii="Times New Roman" w:eastAsia="Times New Roman" w:hAnsi="Times New Roman" w:cs="Times New Roman"/>
+          <w:b/>
+          <w:bCs/>
+          <w:color w:val="000000"/>
+          <w:kern w:val="0"/>
+          <w:sz w:val="27"/>
+          <w:szCs w:val="27"/>
+          <w14:ligatures w14:val="none"/>
+        </w:rPr>
+      </w:pPr>
+    </w:p>
+    <w:p>
+      <w:pPr>
+        <w:spacing w:before="100" w:beforeAutospacing="1" w:after="100" w:afterAutospacing="1" w:line="240" w:lineRule="auto"/>
+        <w:outlineLvl w:val="2"/>
+        <w:rPr>
+          <w:rFonts w:ascii="Times New Roman" w:eastAsia="Times New Roman" w:hAnsi="Times New Roman" w:cs="Times New Roman"/>
+          <w:b/>
+          <w:bCs/>
+          <w:color w:val="000000"/>
+          <w:kern w:val="0"/>
+          <w:sz w:val="27"/>
+          <w:szCs w:val="27"/>
+          <w14:ligatures w14:val="none"/>
+        </w:rPr>
+      </w:pPr>
+      <w:r>
+        <w:rPr>
+          <w:rFonts w:ascii="Times New Roman" w:eastAsia="Times New Roman" w:hAnsi="Times New Roman" w:cs="Times New Roman"/>
+          <w:b/>
+          <w:bCs/>
+          <w:color w:val="000000"/>
+          <w:kern w:val="0"/>
+          <w:sz w:val="27"/>
+          <w:szCs w:val="27"/>
           <w14:ligatures w14:val="none"/>
         </w:rPr>
         <w:lastRenderedPageBreak/>
@@ -6043,248 +6965,12 @@
           <w:bCs/>
           <w:color w:val="000000"/>
           <w:kern w:val="0"/>
-          <w14:ligatures w14:val="none"/>
-        </w:rPr>
-        <w:t>K-Nearest Neighbors:</w:t>
-      </w:r>
-    </w:p>
-    <w:p>
-      <w:pPr>
-        <w:numPr>
-          <w:ilvl w:val="0"/>
-          <w:numId w:val="9"/>
-        </w:numPr>
-        <w:spacing w:before="100" w:beforeAutospacing="1" w:after="100" w:afterAutospacing="1" w:line="240" w:lineRule="auto"/>
-        <w:rPr>
-          <w:rFonts w:ascii="Times New Roman" w:eastAsia="Times New Roman" w:hAnsi="Times New Roman" w:cs="Times New Roman"/>
-          <w:color w:val="000000"/>
-          <w:kern w:val="0"/>
-          <w14:ligatures w14:val="none"/>
-        </w:rPr>
-      </w:pPr>
-      <w:r>
-        <w:rPr>
-          <w:rFonts w:ascii="Times New Roman" w:eastAsia="Times New Roman" w:hAnsi="Times New Roman" w:cs="Times New Roman"/>
-          <w:color w:val="000000"/>
-          <w:kern w:val="0"/>
-          <w14:ligatures w14:val="none"/>
-        </w:rPr>
-        <w:t>Precision: 0.9710 | Recall: 0.7053 | F1-Score: 0.8171 | ROC-AUC: 0.8999</w:t>
-      </w:r>
-    </w:p>
-    <w:p>
-      <w:pPr>
-        <w:numPr>
-          <w:ilvl w:val="0"/>
-          <w:numId w:val="9"/>
-        </w:numPr>
-        <w:spacing w:before="100" w:beforeAutospacing="1" w:after="100" w:afterAutospacing="1" w:line="240" w:lineRule="auto"/>
-        <w:rPr>
-          <w:rFonts w:ascii="Times New Roman" w:eastAsia="Times New Roman" w:hAnsi="Times New Roman" w:cs="Times New Roman"/>
-          <w:color w:val="000000"/>
-          <w:kern w:val="0"/>
-          <w14:ligatures w14:val="none"/>
-        </w:rPr>
-      </w:pPr>
-      <w:r>
-        <w:rPr>
-          <w:rFonts w:ascii="Times New Roman" w:eastAsia="Times New Roman" w:hAnsi="Times New Roman" w:cs="Times New Roman"/>
-          <w:color w:val="000000"/>
-          <w:kern w:val="0"/>
-          <w14:ligatures w14:val="none"/>
-        </w:rPr>
-        <w:t>KNN achieved the highest F1-Score (0.8171) and the highest Precision (0.9710) of all four models by a substantial margin. Its confusion matrix showed only 3 false positives</w:t>
-      </w:r>
-      <w:r>
-        <w:rPr>
-          <w:rFonts w:ascii="Times New Roman" w:eastAsia="Times New Roman" w:hAnsi="Times New Roman" w:cs="Times New Roman"/>
-          <w:color w:val="000000"/>
-          <w:kern w:val="0"/>
-          <w14:ligatures w14:val="none"/>
-        </w:rPr>
-        <w:t xml:space="preserve">, </w:t>
-      </w:r>
-      <w:r>
-        <w:rPr>
-          <w:rFonts w:ascii="Times New Roman" w:eastAsia="Times New Roman" w:hAnsi="Times New Roman" w:cs="Times New Roman"/>
-          <w:color w:val="000000"/>
-          <w:kern w:val="0"/>
-          <w14:ligatures w14:val="none"/>
-        </w:rPr>
-        <w:t xml:space="preserve">meaning 97.1% of KNN's fraud alerts were genuine fraud cases. This exceptional precision makes KNN highly actionable for fraud investigation teams: analysts can trust that nearly every flagged transaction </w:t>
-      </w:r>
-      <w:r>
-        <w:rPr>
-          <w:rFonts w:ascii="Times New Roman" w:eastAsia="Times New Roman" w:hAnsi="Times New Roman" w:cs="Times New Roman"/>
-          <w:color w:val="000000"/>
-          <w:kern w:val="0"/>
-          <w14:ligatures w14:val="none"/>
-        </w:rPr>
-        <w:t>warrant</w:t>
-      </w:r>
-      <w:r>
-        <w:rPr>
-          <w:rFonts w:ascii="Times New Roman" w:eastAsia="Times New Roman" w:hAnsi="Times New Roman" w:cs="Times New Roman"/>
-          <w:color w:val="000000"/>
-          <w:kern w:val="0"/>
-          <w14:ligatures w14:val="none"/>
-        </w:rPr>
-        <w:t xml:space="preserve"> investigation, dramatically improving operational efficiency. The lower Recall (0.7053) relative to other models means it misses approximately 30% of fraud cases, which represents a tradeoff that can be adjusted via threshold tuning.</w:t>
-      </w:r>
-    </w:p>
-    <w:p>
-      <w:pPr>
-        <w:spacing w:before="100" w:beforeAutospacing="1" w:after="100" w:afterAutospacing="1" w:line="240" w:lineRule="auto"/>
-        <w:ind w:left="720"/>
-        <w:rPr>
-          <w:rFonts w:ascii="Times New Roman" w:eastAsia="Times New Roman" w:hAnsi="Times New Roman" w:cs="Times New Roman"/>
-          <w:color w:val="000000"/>
-          <w:kern w:val="0"/>
-          <w14:ligatures w14:val="none"/>
-        </w:rPr>
-      </w:pPr>
-    </w:p>
-    <w:p>
-      <w:pPr>
-        <w:spacing w:before="100" w:beforeAutospacing="1" w:after="100" w:afterAutospacing="1" w:line="240" w:lineRule="auto"/>
-        <w:rPr>
-          <w:rFonts w:ascii="Times New Roman" w:eastAsia="Times New Roman" w:hAnsi="Times New Roman" w:cs="Times New Roman"/>
-          <w:color w:val="000000"/>
-          <w:kern w:val="0"/>
-          <w14:ligatures w14:val="none"/>
-        </w:rPr>
-      </w:pPr>
-      <w:r>
-        <w:rPr>
-          <w:rFonts w:ascii="Times New Roman" w:eastAsia="Times New Roman" w:hAnsi="Times New Roman" w:cs="Times New Roman"/>
-          <w:noProof/>
-          <w:color w:val="000000"/>
-          <w:kern w:val="0"/>
-        </w:rPr>
-        <w:drawing>
-          <wp:inline distT="0" distB="0" distL="0" distR="0" wp14:anchorId="0644C4B2" wp14:editId="7FB3DF74">
-            <wp:extent cx="5943600" cy="3642360"/>
-            <wp:effectExtent l="0" t="0" r="0" b="2540"/>
-            <wp:docPr id="1453519612" name="Picture 11" descr="A screenshot of a computer screen&#10;&#10;AI-generated content may be incorrect."/>
-            <wp:cNvGraphicFramePr>
-              <a:graphicFrameLocks xmlns:a="http://schemas.openxmlformats.org/drawingml/2006/main" noChangeAspect="1"/>
-            </wp:cNvGraphicFramePr>
-            <a:graphic xmlns:a="http://schemas.openxmlformats.org/drawingml/2006/main">
-              <a:graphicData uri="http://schemas.openxmlformats.org/drawingml/2006/picture">
-                <pic:pic xmlns:pic="http://schemas.openxmlformats.org/drawingml/2006/picture">
-                  <pic:nvPicPr>
-                    <pic:cNvPr id="1453519612" name="Picture 11" descr="A screenshot of a computer screen&#10;&#10;AI-generated content may be incorrect."/>
-                    <pic:cNvPicPr/>
-                  </pic:nvPicPr>
-                  <pic:blipFill>
-                    <a:blip r:embed="rId17" cstate="print">
-                      <a:extLst>
-                        <a:ext uri="{28A0092B-C50C-407E-A947-70E740481C1C}">
-                          <a14:useLocalDpi xmlns:a14="http://schemas.microsoft.com/office/drawing/2010/main" val="0"/>
-                        </a:ext>
-                      </a:extLst>
-                    </a:blip>
-                    <a:stretch>
-                      <a:fillRect/>
-                    </a:stretch>
-                  </pic:blipFill>
-                  <pic:spPr>
-                    <a:xfrm>
-                      <a:off x="0" y="0"/>
-                      <a:ext cx="5943600" cy="3642360"/>
-                    </a:xfrm>
-                    <a:prstGeom prst="rect">
-                      <a:avLst/>
-                    </a:prstGeom>
-                  </pic:spPr>
-                </pic:pic>
-              </a:graphicData>
-            </a:graphic>
-          </wp:inline>
-        </w:drawing>
-      </w:r>
-    </w:p>
-    <w:p>
-      <w:pPr>
-        <w:spacing w:before="100" w:beforeAutospacing="1" w:after="100" w:afterAutospacing="1" w:line="240" w:lineRule="auto"/>
-        <w:rPr>
-          <w:rFonts w:ascii="Times New Roman" w:eastAsia="Times New Roman" w:hAnsi="Times New Roman" w:cs="Times New Roman"/>
-          <w:color w:val="000000"/>
-          <w:kern w:val="0"/>
-          <w14:ligatures w14:val="none"/>
-        </w:rPr>
-      </w:pPr>
-    </w:p>
-    <w:p>
-      <w:pPr>
-        <w:spacing w:before="100" w:beforeAutospacing="1" w:after="100" w:afterAutospacing="1" w:line="240" w:lineRule="auto"/>
-        <w:rPr>
-          <w:rFonts w:ascii="Times New Roman" w:eastAsia="Times New Roman" w:hAnsi="Times New Roman" w:cs="Times New Roman"/>
-          <w:color w:val="000000"/>
-          <w:kern w:val="0"/>
-          <w14:ligatures w14:val="none"/>
-        </w:rPr>
-      </w:pPr>
-    </w:p>
-    <w:p>
-      <w:pPr>
-        <w:spacing w:before="100" w:beforeAutospacing="1" w:after="100" w:afterAutospacing="1" w:line="240" w:lineRule="auto"/>
-        <w:rPr>
-          <w:rFonts w:ascii="Times New Roman" w:eastAsia="Times New Roman" w:hAnsi="Times New Roman" w:cs="Times New Roman"/>
-          <w:color w:val="000000"/>
-          <w:kern w:val="0"/>
-          <w14:ligatures w14:val="none"/>
-        </w:rPr>
-      </w:pPr>
-    </w:p>
-    <w:p>
-      <w:pPr>
-        <w:spacing w:before="100" w:beforeAutospacing="1" w:after="100" w:afterAutospacing="1" w:line="240" w:lineRule="auto"/>
-        <w:rPr>
-          <w:rFonts w:ascii="Times New Roman" w:eastAsia="Times New Roman" w:hAnsi="Times New Roman" w:cs="Times New Roman"/>
-          <w:color w:val="000000"/>
-          <w:kern w:val="0"/>
-          <w14:ligatures w14:val="none"/>
-        </w:rPr>
-      </w:pPr>
-    </w:p>
-    <w:p>
-      <w:pPr>
-        <w:spacing w:before="100" w:beforeAutospacing="1" w:after="100" w:afterAutospacing="1" w:line="240" w:lineRule="auto"/>
-        <w:rPr>
-          <w:rFonts w:ascii="Times New Roman" w:eastAsia="Times New Roman" w:hAnsi="Times New Roman" w:cs="Times New Roman"/>
-          <w:color w:val="000000"/>
-          <w:kern w:val="0"/>
-          <w14:ligatures w14:val="none"/>
-        </w:rPr>
-      </w:pPr>
-    </w:p>
-    <w:p>
-      <w:pPr>
-        <w:spacing w:before="100" w:beforeAutospacing="1" w:after="100" w:afterAutospacing="1" w:line="240" w:lineRule="auto"/>
-        <w:rPr>
-          <w:rFonts w:ascii="Times New Roman" w:eastAsia="Times New Roman" w:hAnsi="Times New Roman" w:cs="Times New Roman"/>
-          <w:color w:val="000000"/>
-          <w:kern w:val="0"/>
-          <w14:ligatures w14:val="none"/>
-        </w:rPr>
-      </w:pPr>
-    </w:p>
-    <w:p>
-      <w:pPr>
-        <w:spacing w:before="100" w:beforeAutospacing="1" w:after="100" w:afterAutospacing="1" w:line="240" w:lineRule="auto"/>
-        <w:outlineLvl w:val="2"/>
-        <w:rPr>
-          <w:rFonts w:ascii="Times New Roman" w:eastAsia="Times New Roman" w:hAnsi="Times New Roman" w:cs="Times New Roman"/>
-          <w:b/>
-          <w:bCs/>
-          <w:color w:val="000000"/>
-          <w:kern w:val="0"/>
           <w:sz w:val="27"/>
           <w:szCs w:val="27"/>
           <w14:ligatures w14:val="none"/>
         </w:rPr>
-      </w:pPr>
+        <w:t>5</w:t>
+      </w:r>
       <w:r>
         <w:rPr>
           <w:rFonts w:ascii="Times New Roman" w:eastAsia="Times New Roman" w:hAnsi="Times New Roman" w:cs="Times New Roman"/>
@@ -6296,14 +6982,9 @@
           <w:szCs w:val="27"/>
           <w14:ligatures w14:val="none"/>
         </w:rPr>
-        <w:lastRenderedPageBreak/>
-        <w:t>4.3 Model Comparison</w:t>
-      </w:r>
-    </w:p>
-    <w:p>
-      <w:pPr>
-        <w:spacing w:before="100" w:beforeAutospacing="1" w:after="100" w:afterAutospacing="1" w:line="240" w:lineRule="auto"/>
-        <w:outlineLvl w:val="2"/>
+        <w:t xml:space="preserve"> </w:t>
+      </w:r>
+      <w:r>
         <w:rPr>
           <w:rFonts w:ascii="Times New Roman" w:eastAsia="Times New Roman" w:hAnsi="Times New Roman" w:cs="Times New Roman"/>
           <w:b/>
@@ -6314,552 +6995,166 @@
           <w:szCs w:val="27"/>
           <w14:ligatures w14:val="none"/>
         </w:rPr>
-      </w:pPr>
-    </w:p>
-    <w:p>
-      <w:pPr>
-        <w:spacing w:before="100" w:beforeAutospacing="1" w:after="100" w:afterAutospacing="1" w:line="240" w:lineRule="auto"/>
-        <w:outlineLvl w:val="2"/>
-        <w:rPr>
-          <w:rFonts w:ascii="Times New Roman" w:eastAsia="Times New Roman" w:hAnsi="Times New Roman" w:cs="Times New Roman"/>
-          <w:b/>
-          <w:bCs/>
-          <w:color w:val="000000"/>
-          <w:kern w:val="0"/>
-          <w:sz w:val="27"/>
-          <w:szCs w:val="27"/>
-          <w14:ligatures w14:val="none"/>
-        </w:rPr>
-      </w:pPr>
-      <w:r>
-        <w:rPr>
-          <w:rFonts w:ascii="Times New Roman" w:eastAsia="Times New Roman" w:hAnsi="Times New Roman" w:cs="Times New Roman"/>
-          <w:b/>
-          <w:bCs/>
-          <w:noProof/>
-          <w:color w:val="000000"/>
-          <w:kern w:val="0"/>
-          <w:sz w:val="27"/>
-          <w:szCs w:val="27"/>
-        </w:rPr>
-        <w:drawing>
-          <wp:inline distT="0" distB="0" distL="0" distR="0" wp14:anchorId="4232FE6B" wp14:editId="0B203376">
-            <wp:extent cx="5943600" cy="1811655"/>
-            <wp:effectExtent l="0" t="0" r="0" b="4445"/>
-            <wp:docPr id="369202137" name="Picture 12" descr="A table of numbers with black text&#10;&#10;AI-generated content may be incorrect."/>
-            <wp:cNvGraphicFramePr>
-              <a:graphicFrameLocks xmlns:a="http://schemas.openxmlformats.org/drawingml/2006/main" noChangeAspect="1"/>
-            </wp:cNvGraphicFramePr>
-            <a:graphic xmlns:a="http://schemas.openxmlformats.org/drawingml/2006/main">
-              <a:graphicData uri="http://schemas.openxmlformats.org/drawingml/2006/picture">
-                <pic:pic xmlns:pic="http://schemas.openxmlformats.org/drawingml/2006/picture">
-                  <pic:nvPicPr>
-                    <pic:cNvPr id="369202137" name="Picture 12" descr="A table of numbers with black text&#10;&#10;AI-generated content may be incorrect."/>
-                    <pic:cNvPicPr/>
-                  </pic:nvPicPr>
-                  <pic:blipFill>
-                    <a:blip r:embed="rId18">
-                      <a:extLst>
-                        <a:ext uri="{28A0092B-C50C-407E-A947-70E740481C1C}">
-                          <a14:useLocalDpi xmlns:a14="http://schemas.microsoft.com/office/drawing/2010/main" val="0"/>
-                        </a:ext>
-                      </a:extLst>
-                    </a:blip>
-                    <a:stretch>
-                      <a:fillRect/>
-                    </a:stretch>
-                  </pic:blipFill>
-                  <pic:spPr>
-                    <a:xfrm>
-                      <a:off x="0" y="0"/>
-                      <a:ext cx="5943600" cy="1811655"/>
-                    </a:xfrm>
-                    <a:prstGeom prst="rect">
-                      <a:avLst/>
-                    </a:prstGeom>
-                  </pic:spPr>
-                </pic:pic>
-              </a:graphicData>
-            </a:graphic>
-          </wp:inline>
-        </w:drawing>
-      </w:r>
-    </w:p>
-    <w:p>
-      <w:pPr>
-        <w:spacing w:before="100" w:beforeAutospacing="1" w:after="100" w:afterAutospacing="1" w:line="240" w:lineRule="auto"/>
-        <w:outlineLvl w:val="2"/>
-        <w:rPr>
-          <w:rFonts w:ascii="Times New Roman" w:eastAsia="Times New Roman" w:hAnsi="Times New Roman" w:cs="Times New Roman"/>
-          <w:b/>
-          <w:bCs/>
-          <w:color w:val="000000"/>
-          <w:kern w:val="0"/>
-          <w:sz w:val="27"/>
-          <w:szCs w:val="27"/>
-          <w14:ligatures w14:val="none"/>
-        </w:rPr>
-      </w:pPr>
-    </w:p>
-    <w:tbl>
-      <w:tblPr>
-        <w:tblW w:w="0" w:type="auto"/>
-        <w:tblCellSpacing w:w="15" w:type="dxa"/>
-        <w:tblCellMar>
-          <w:top w:w="15" w:type="dxa"/>
-          <w:left w:w="15" w:type="dxa"/>
-          <w:bottom w:w="15" w:type="dxa"/>
-          <w:right w:w="15" w:type="dxa"/>
-        </w:tblCellMar>
-        <w:tblLook w:val="04A0" w:firstRow="1" w:lastRow="0" w:firstColumn="1" w:lastColumn="0" w:noHBand="0" w:noVBand="1"/>
-      </w:tblPr>
-      <w:tblGrid>
-        <w:gridCol w:w="9059"/>
-        <w:gridCol w:w="66"/>
-        <w:gridCol w:w="66"/>
-        <w:gridCol w:w="66"/>
-        <w:gridCol w:w="81"/>
-      </w:tblGrid>
-      <w:tr>
-        <w:trPr>
-          <w:tblCellSpacing w:w="15" w:type="dxa"/>
-        </w:trPr>
-        <w:tc>
-          <w:tcPr>
-            <w:tcW w:w="0" w:type="auto"/>
-            <w:vAlign w:val="center"/>
-          </w:tcPr>
-          <w:p>
-            <w:pPr>
-              <w:spacing w:after="0" w:line="240" w:lineRule="auto"/>
-              <w:rPr>
-                <w:rFonts w:ascii="Times New Roman" w:eastAsia="Times New Roman" w:hAnsi="Times New Roman" w:cs="Times New Roman"/>
-                <w:color w:val="000000"/>
-                <w:kern w:val="0"/>
-                <w14:ligatures w14:val="none"/>
-              </w:rPr>
-            </w:pPr>
-            <w:r>
-              <w:rPr>
-                <w:rFonts w:ascii="Times New Roman" w:eastAsia="Times New Roman" w:hAnsi="Times New Roman" w:cs="Times New Roman"/>
-                <w:color w:val="000000"/>
-                <w:kern w:val="0"/>
-                <w14:ligatures w14:val="none"/>
-              </w:rPr>
-              <w:drawing>
-                <wp:inline distT="0" distB="0" distL="0" distR="0" wp14:anchorId="1E6AFFD7" wp14:editId="38E92ACC">
-                  <wp:extent cx="5705474" cy="2647315"/>
-                  <wp:effectExtent l="0" t="0" r="0" b="0"/>
-                  <wp:docPr id="1363144213" name="Picture 1"/>
-                  <wp:cNvGraphicFramePr>
-                    <a:graphicFrameLocks xmlns:a="http://schemas.openxmlformats.org/drawingml/2006/main" noChangeAspect="1"/>
-                  </wp:cNvGraphicFramePr>
-                  <a:graphic xmlns:a="http://schemas.openxmlformats.org/drawingml/2006/main">
-                    <a:graphicData uri="http://schemas.openxmlformats.org/drawingml/2006/picture">
-                      <pic:pic xmlns:pic="http://schemas.openxmlformats.org/drawingml/2006/picture">
-                        <pic:nvPicPr>
-                          <pic:cNvPr id="1363144213" name=""/>
-                          <pic:cNvPicPr/>
-                        </pic:nvPicPr>
-                        <pic:blipFill>
-                          <a:blip r:embed="rId19"/>
-                          <a:stretch>
-                            <a:fillRect/>
-                          </a:stretch>
-                        </pic:blipFill>
-                        <pic:spPr>
-                          <a:xfrm>
-                            <a:off x="0" y="0"/>
-                            <a:ext cx="5837266" cy="2708466"/>
-                          </a:xfrm>
-                          <a:prstGeom prst="rect">
-                            <a:avLst/>
-                          </a:prstGeom>
-                        </pic:spPr>
-                      </pic:pic>
-                    </a:graphicData>
-                  </a:graphic>
-                </wp:inline>
-              </w:drawing>
-            </w:r>
-          </w:p>
-        </w:tc>
-        <w:tc>
-          <w:tcPr>
-            <w:tcW w:w="0" w:type="auto"/>
-            <w:vAlign w:val="center"/>
-          </w:tcPr>
-          <w:p>
-            <w:pPr>
-              <w:spacing w:after="0" w:line="240" w:lineRule="auto"/>
-              <w:rPr>
-                <w:rFonts w:ascii="Times New Roman" w:eastAsia="Times New Roman" w:hAnsi="Times New Roman" w:cs="Times New Roman"/>
-                <w:color w:val="000000"/>
-                <w:kern w:val="0"/>
-                <w14:ligatures w14:val="none"/>
-              </w:rPr>
-            </w:pPr>
-          </w:p>
-        </w:tc>
-        <w:tc>
-          <w:tcPr>
-            <w:tcW w:w="0" w:type="auto"/>
-            <w:vAlign w:val="center"/>
-          </w:tcPr>
-          <w:p>
-            <w:pPr>
-              <w:spacing w:after="0" w:line="240" w:lineRule="auto"/>
-              <w:rPr>
-                <w:rFonts w:ascii="Times New Roman" w:eastAsia="Times New Roman" w:hAnsi="Times New Roman" w:cs="Times New Roman"/>
-                <w:color w:val="000000"/>
-                <w:kern w:val="0"/>
-                <w14:ligatures w14:val="none"/>
-              </w:rPr>
-            </w:pPr>
-          </w:p>
-        </w:tc>
-        <w:tc>
-          <w:tcPr>
-            <w:tcW w:w="0" w:type="auto"/>
-            <w:vAlign w:val="center"/>
-          </w:tcPr>
-          <w:p>
-            <w:pPr>
-              <w:spacing w:after="0" w:line="240" w:lineRule="auto"/>
-              <w:rPr>
-                <w:rFonts w:ascii="Times New Roman" w:eastAsia="Times New Roman" w:hAnsi="Times New Roman" w:cs="Times New Roman"/>
-                <w:color w:val="000000"/>
-                <w:kern w:val="0"/>
-                <w14:ligatures w14:val="none"/>
-              </w:rPr>
-            </w:pPr>
-          </w:p>
-        </w:tc>
-        <w:tc>
-          <w:tcPr>
-            <w:tcW w:w="0" w:type="auto"/>
-            <w:vAlign w:val="center"/>
-          </w:tcPr>
-          <w:p>
-            <w:pPr>
-              <w:spacing w:after="0" w:line="240" w:lineRule="auto"/>
-              <w:rPr>
-                <w:rFonts w:ascii="Times New Roman" w:eastAsia="Times New Roman" w:hAnsi="Times New Roman" w:cs="Times New Roman"/>
-                <w:color w:val="000000"/>
-                <w:kern w:val="0"/>
-                <w14:ligatures w14:val="none"/>
-              </w:rPr>
-            </w:pPr>
-          </w:p>
-        </w:tc>
-      </w:tr>
-      <w:tr>
-        <w:trPr>
-          <w:tblCellSpacing w:w="15" w:type="dxa"/>
-        </w:trPr>
-        <w:tc>
-          <w:tcPr>
-            <w:tcW w:w="0" w:type="auto"/>
-            <w:vAlign w:val="center"/>
-          </w:tcPr>
-          <w:p>
-            <w:pPr>
-              <w:spacing w:after="0" w:line="240" w:lineRule="auto"/>
-              <w:rPr>
-                <w:rFonts w:ascii="Times New Roman" w:eastAsia="Times New Roman" w:hAnsi="Times New Roman" w:cs="Times New Roman"/>
-                <w:color w:val="000000"/>
-                <w:kern w:val="0"/>
-                <w14:ligatures w14:val="none"/>
-              </w:rPr>
-            </w:pPr>
-          </w:p>
-        </w:tc>
-        <w:tc>
-          <w:tcPr>
-            <w:tcW w:w="0" w:type="auto"/>
-            <w:vAlign w:val="center"/>
-          </w:tcPr>
-          <w:p>
-            <w:pPr>
-              <w:spacing w:after="0" w:line="240" w:lineRule="auto"/>
-              <w:rPr>
-                <w:rFonts w:ascii="Times New Roman" w:eastAsia="Times New Roman" w:hAnsi="Times New Roman" w:cs="Times New Roman"/>
-                <w:color w:val="000000"/>
-                <w:kern w:val="0"/>
-                <w14:ligatures w14:val="none"/>
-              </w:rPr>
-            </w:pPr>
-          </w:p>
-        </w:tc>
-        <w:tc>
-          <w:tcPr>
-            <w:tcW w:w="0" w:type="auto"/>
-            <w:vAlign w:val="center"/>
-          </w:tcPr>
-          <w:p>
-            <w:pPr>
-              <w:spacing w:after="0" w:line="240" w:lineRule="auto"/>
-              <w:rPr>
-                <w:rFonts w:ascii="Times New Roman" w:eastAsia="Times New Roman" w:hAnsi="Times New Roman" w:cs="Times New Roman"/>
-                <w:color w:val="000000"/>
-                <w:kern w:val="0"/>
-                <w14:ligatures w14:val="none"/>
-              </w:rPr>
-            </w:pPr>
-          </w:p>
-        </w:tc>
-        <w:tc>
-          <w:tcPr>
-            <w:tcW w:w="0" w:type="auto"/>
-            <w:vAlign w:val="center"/>
-          </w:tcPr>
-          <w:p>
-            <w:pPr>
-              <w:spacing w:after="0" w:line="240" w:lineRule="auto"/>
-              <w:rPr>
-                <w:rFonts w:ascii="Times New Roman" w:eastAsia="Times New Roman" w:hAnsi="Times New Roman" w:cs="Times New Roman"/>
-                <w:color w:val="000000"/>
-                <w:kern w:val="0"/>
-                <w14:ligatures w14:val="none"/>
-              </w:rPr>
-            </w:pPr>
-          </w:p>
-        </w:tc>
-        <w:tc>
-          <w:tcPr>
-            <w:tcW w:w="0" w:type="auto"/>
-            <w:vAlign w:val="center"/>
-          </w:tcPr>
-          <w:p>
-            <w:pPr>
-              <w:spacing w:after="0" w:line="240" w:lineRule="auto"/>
-              <w:rPr>
-                <w:rFonts w:ascii="Times New Roman" w:eastAsia="Times New Roman" w:hAnsi="Times New Roman" w:cs="Times New Roman"/>
-                <w:color w:val="000000"/>
-                <w:kern w:val="0"/>
-                <w14:ligatures w14:val="none"/>
-              </w:rPr>
-            </w:pPr>
-          </w:p>
-        </w:tc>
-      </w:tr>
-    </w:tbl>
-    <w:p>
-      <w:pPr>
-        <w:spacing w:before="100" w:beforeAutospacing="1" w:after="100" w:afterAutospacing="1" w:line="240" w:lineRule="auto"/>
-        <w:rPr>
-          <w:rFonts w:ascii="Times New Roman" w:eastAsia="Times New Roman" w:hAnsi="Times New Roman" w:cs="Times New Roman"/>
-          <w:color w:val="000000"/>
-          <w:kern w:val="0"/>
-          <w14:ligatures w14:val="none"/>
-        </w:rPr>
-      </w:pPr>
-      <w:r>
-        <w:rPr>
-          <w:rFonts w:ascii="Times New Roman" w:eastAsia="Times New Roman" w:hAnsi="Times New Roman" w:cs="Times New Roman"/>
-          <w:color w:val="000000"/>
-          <w:kern w:val="0"/>
-          <w14:ligatures w14:val="none"/>
-        </w:rPr>
-        <w:t xml:space="preserve">The results reveal a clear precision-recall tradeoff across the four models. Logistic Regression and Decision Tree both achieve high recall but very low precision </w:t>
-      </w:r>
-      <w:r>
-        <w:rPr>
-          <w:rFonts w:ascii="Times New Roman" w:eastAsia="Times New Roman" w:hAnsi="Times New Roman" w:cs="Times New Roman"/>
-          <w:color w:val="000000"/>
-          <w:kern w:val="0"/>
-          <w14:ligatures w14:val="none"/>
-        </w:rPr>
-        <w:t>since t</w:t>
-      </w:r>
-      <w:r>
-        <w:rPr>
-          <w:rFonts w:ascii="Times New Roman" w:eastAsia="Times New Roman" w:hAnsi="Times New Roman" w:cs="Times New Roman"/>
-          <w:color w:val="000000"/>
-          <w:kern w:val="0"/>
-          <w14:ligatures w14:val="none"/>
-        </w:rPr>
-        <w:t>hey catch most fraud but generate overwhelming false alarm volumes. Random Forest strikes a middle ground with strong ROC-AUC and moderate F1-Score. KNN achieves the best F1-Score and exceptional precision at the cost of somewhat lower recall.</w:t>
-      </w:r>
-    </w:p>
-    <w:p>
-      <w:pPr>
-        <w:spacing w:before="100" w:beforeAutospacing="1" w:after="100" w:afterAutospacing="1" w:line="240" w:lineRule="auto"/>
-        <w:rPr>
-          <w:rFonts w:ascii="Times New Roman" w:eastAsia="Times New Roman" w:hAnsi="Times New Roman" w:cs="Times New Roman"/>
-          <w:color w:val="000000"/>
-          <w:kern w:val="0"/>
-          <w14:ligatures w14:val="none"/>
-        </w:rPr>
-      </w:pPr>
-    </w:p>
-    <w:p>
-      <w:pPr>
-        <w:spacing w:before="100" w:beforeAutospacing="1" w:after="100" w:afterAutospacing="1" w:line="240" w:lineRule="auto"/>
-        <w:rPr>
-          <w:rFonts w:ascii="Times New Roman" w:eastAsia="Times New Roman" w:hAnsi="Times New Roman" w:cs="Times New Roman"/>
-          <w:color w:val="000000"/>
-          <w:kern w:val="0"/>
-          <w14:ligatures w14:val="none"/>
-        </w:rPr>
-      </w:pPr>
-    </w:p>
-    <w:p>
-      <w:pPr>
-        <w:spacing w:before="100" w:beforeAutospacing="1" w:after="100" w:afterAutospacing="1" w:line="240" w:lineRule="auto"/>
-        <w:rPr>
-          <w:rFonts w:ascii="Times New Roman" w:eastAsia="Times New Roman" w:hAnsi="Times New Roman" w:cs="Times New Roman"/>
-          <w:color w:val="000000"/>
-          <w:kern w:val="0"/>
-          <w14:ligatures w14:val="none"/>
-        </w:rPr>
-      </w:pPr>
-    </w:p>
-    <w:p>
-      <w:pPr>
-        <w:spacing w:before="100" w:beforeAutospacing="1" w:after="100" w:afterAutospacing="1" w:line="240" w:lineRule="auto"/>
-        <w:outlineLvl w:val="2"/>
-        <w:rPr>
-          <w:rFonts w:ascii="Times New Roman" w:eastAsia="Times New Roman" w:hAnsi="Times New Roman" w:cs="Times New Roman"/>
-          <w:b/>
-          <w:bCs/>
-          <w:color w:val="000000"/>
-          <w:kern w:val="0"/>
-          <w:sz w:val="27"/>
-          <w:szCs w:val="27"/>
-          <w14:ligatures w14:val="none"/>
-        </w:rPr>
-      </w:pPr>
-      <w:r>
-        <w:rPr>
-          <w:rFonts w:ascii="Times New Roman" w:eastAsia="Times New Roman" w:hAnsi="Times New Roman" w:cs="Times New Roman"/>
-          <w:b/>
-          <w:bCs/>
-          <w:color w:val="000000"/>
-          <w:kern w:val="0"/>
-          <w:sz w:val="27"/>
-          <w:szCs w:val="27"/>
-          <w14:ligatures w14:val="none"/>
-        </w:rPr>
-        <w:lastRenderedPageBreak/>
-        <w:t>4.4 Why KNN is the Recommended Model</w:t>
-      </w:r>
-    </w:p>
-    <w:p>
-      <w:pPr>
-        <w:spacing w:before="100" w:beforeAutospacing="1" w:after="100" w:afterAutospacing="1" w:line="240" w:lineRule="auto"/>
-        <w:rPr>
-          <w:rFonts w:ascii="Times New Roman" w:eastAsia="Times New Roman" w:hAnsi="Times New Roman" w:cs="Times New Roman"/>
-          <w:color w:val="000000"/>
-          <w:kern w:val="0"/>
-          <w14:ligatures w14:val="none"/>
-        </w:rPr>
-      </w:pPr>
-      <w:r>
-        <w:rPr>
-          <w:rFonts w:ascii="Times New Roman" w:eastAsia="Times New Roman" w:hAnsi="Times New Roman" w:cs="Times New Roman"/>
-          <w:color w:val="000000"/>
-          <w:kern w:val="0"/>
-          <w14:ligatures w14:val="none"/>
-        </w:rPr>
-        <w:t>KNN is selected as our recommended model based on its F1-Score of 0.8171</w:t>
-      </w:r>
-      <w:r>
-        <w:rPr>
-          <w:rFonts w:ascii="Times New Roman" w:eastAsia="Times New Roman" w:hAnsi="Times New Roman" w:cs="Times New Roman"/>
-          <w:color w:val="000000"/>
-          <w:kern w:val="0"/>
-          <w14:ligatures w14:val="none"/>
-        </w:rPr>
-        <w:t xml:space="preserve">, </w:t>
-      </w:r>
-      <w:r>
-        <w:rPr>
-          <w:rFonts w:ascii="Times New Roman" w:eastAsia="Times New Roman" w:hAnsi="Times New Roman" w:cs="Times New Roman"/>
-          <w:color w:val="000000"/>
-          <w:kern w:val="0"/>
-          <w14:ligatures w14:val="none"/>
-        </w:rPr>
-        <w:t>the highest among all four models and significantly above Random Forest's 0.5215. F1-Score is the most appropriate primary metric for this problem because it balances both Precision and Recall, reflecting the real-world cost structure of fraud detection where both missed frauds (false negatives) and excessive false alarms (false positives) carry significant costs.</w:t>
-      </w:r>
-    </w:p>
-    <w:p>
-      <w:pPr>
-        <w:spacing w:before="100" w:beforeAutospacing="1" w:after="100" w:afterAutospacing="1" w:line="240" w:lineRule="auto"/>
-        <w:rPr>
-          <w:rFonts w:ascii="Times New Roman" w:eastAsia="Times New Roman" w:hAnsi="Times New Roman" w:cs="Times New Roman"/>
-          <w:color w:val="000000"/>
-          <w:kern w:val="0"/>
-          <w14:ligatures w14:val="none"/>
-        </w:rPr>
-      </w:pPr>
-      <w:r>
-        <w:rPr>
-          <w:rFonts w:ascii="Times New Roman" w:eastAsia="Times New Roman" w:hAnsi="Times New Roman" w:cs="Times New Roman"/>
-          <w:color w:val="000000"/>
-          <w:kern w:val="0"/>
-          <w14:ligatures w14:val="none"/>
-        </w:rPr>
-        <w:t xml:space="preserve">KNN's precision of 0.9710 is particularly significant from an operational perspective. Fraud investigation is expensive </w:t>
-      </w:r>
-      <w:r>
-        <w:rPr>
-          <w:rFonts w:ascii="Times New Roman" w:eastAsia="Times New Roman" w:hAnsi="Times New Roman" w:cs="Times New Roman"/>
-          <w:color w:val="000000"/>
-          <w:kern w:val="0"/>
-          <w14:ligatures w14:val="none"/>
-        </w:rPr>
-        <w:t xml:space="preserve">where </w:t>
-      </w:r>
-      <w:r>
-        <w:rPr>
-          <w:rFonts w:ascii="Times New Roman" w:eastAsia="Times New Roman" w:hAnsi="Times New Roman" w:cs="Times New Roman"/>
-          <w:color w:val="000000"/>
-          <w:kern w:val="0"/>
-          <w14:ligatures w14:val="none"/>
-        </w:rPr>
-        <w:t>each flagged transaction requires human review. A system that generates 18 false alarms for every genuine fraud (Logistic Regression's ratio) is operationally unsustainable at scale. KNN's near-perfect precision means investigation resources are deployed efficiently.</w:t>
-      </w:r>
-    </w:p>
-    <w:p>
-      <w:pPr>
-        <w:spacing w:before="100" w:beforeAutospacing="1" w:after="100" w:afterAutospacing="1" w:line="240" w:lineRule="auto"/>
-        <w:rPr>
-          <w:rFonts w:ascii="Times New Roman" w:eastAsia="Times New Roman" w:hAnsi="Times New Roman" w:cs="Times New Roman"/>
-          <w:color w:val="000000"/>
-          <w:kern w:val="0"/>
-          <w14:ligatures w14:val="none"/>
-        </w:rPr>
-      </w:pPr>
-      <w:r>
-        <w:rPr>
-          <w:rFonts w:ascii="Times New Roman" w:eastAsia="Times New Roman" w:hAnsi="Times New Roman" w:cs="Times New Roman"/>
-          <w:color w:val="000000"/>
-          <w:kern w:val="0"/>
-          <w14:ligatures w14:val="none"/>
-        </w:rPr>
-        <w:t>Random Forest is recommended as a secondary model for high-risk deployment scenarios where maximizing fraud catch rate is the overriding priority, as its ROC-AUC of 0.9812 allows flexible threshold adjustment to push recall higher at the cost of more false positives.</w:t>
-      </w:r>
-    </w:p>
-    <w:p>
-      <w:pPr>
-        <w:spacing w:after="0" w:line="240" w:lineRule="auto"/>
-        <w:rPr>
-          <w:rFonts w:ascii="Times New Roman" w:eastAsia="Times New Roman" w:hAnsi="Times New Roman" w:cs="Times New Roman"/>
-          <w:kern w:val="0"/>
-          <w14:ligatures w14:val="none"/>
-        </w:rPr>
-      </w:pPr>
-      <w:r>
-        <w:rPr>
-          <w:rFonts w:ascii="Times New Roman" w:eastAsia="Times New Roman" w:hAnsi="Times New Roman" w:cs="Times New Roman"/>
-          <w:noProof/>
-          <w:kern w:val="0"/>
-        </w:rPr>
-        <w:pict w14:anchorId="4F63685F">
-          <v:rect id="_x0000_i1027" alt="" style="width:468pt;height:.05pt;mso-width-percent:0;mso-height-percent:0;mso-width-percent:0;mso-height-percent:0" o:hralign="center" o:hrstd="t" o:hr="t" fillcolor="#a0a0a0" stroked="f"/>
-        </w:pict>
-      </w:r>
+        <w:t>Final Model Recommendation</w:t>
+      </w:r>
+    </w:p>
+    <w:p>
+      <w:pPr>
+        <w:spacing w:before="100" w:beforeAutospacing="1" w:after="100" w:afterAutospacing="1" w:line="240" w:lineRule="auto"/>
+        <w:outlineLvl w:val="1"/>
+        <w:rPr>
+          <w:rFonts w:ascii="Times New Roman" w:eastAsia="Times New Roman" w:hAnsi="Times New Roman" w:cs="Times New Roman"/>
+          <w:color w:val="000000"/>
+          <w:kern w:val="0"/>
+          <w14:ligatures w14:val="none"/>
+        </w:rPr>
+      </w:pPr>
+      <w:r>
+        <w:rPr>
+          <w:rFonts w:ascii="Times New Roman" w:eastAsia="Times New Roman" w:hAnsi="Times New Roman" w:cs="Times New Roman"/>
+          <w:b/>
+          <w:bCs/>
+          <w:color w:val="000000"/>
+          <w:kern w:val="0"/>
+          <w14:ligatures w14:val="none"/>
+        </w:rPr>
+        <w:t>Random Forest is our recommended model </w:t>
+      </w:r>
+      <w:r>
+        <w:rPr>
+          <w:rFonts w:ascii="Times New Roman" w:eastAsia="Times New Roman" w:hAnsi="Times New Roman" w:cs="Times New Roman"/>
+          <w:color w:val="000000"/>
+          <w:kern w:val="0"/>
+          <w14:ligatures w14:val="none"/>
+        </w:rPr>
+        <w:t xml:space="preserve">based on its F1-Score of 0.6449 </w:t>
+      </w:r>
+      <w:r>
+        <w:rPr>
+          <w:rFonts w:ascii="Times New Roman" w:eastAsia="Times New Roman" w:hAnsi="Times New Roman" w:cs="Times New Roman"/>
+          <w:color w:val="000000"/>
+          <w:kern w:val="0"/>
+          <w14:ligatures w14:val="none"/>
+        </w:rPr>
+        <w:t>which is</w:t>
+      </w:r>
+      <w:r>
+        <w:rPr>
+          <w:rFonts w:ascii="Times New Roman" w:eastAsia="Times New Roman" w:hAnsi="Times New Roman" w:cs="Times New Roman"/>
+          <w:color w:val="000000"/>
+          <w:kern w:val="0"/>
+          <w14:ligatures w14:val="none"/>
+        </w:rPr>
+        <w:t xml:space="preserve"> the highest of all four models and its ROC-AUC of 0.9782 </w:t>
+      </w:r>
+      <w:r>
+        <w:rPr>
+          <w:rFonts w:ascii="Times New Roman" w:eastAsia="Times New Roman" w:hAnsi="Times New Roman" w:cs="Times New Roman"/>
+          <w:color w:val="000000"/>
+          <w:kern w:val="0"/>
+          <w14:ligatures w14:val="none"/>
+        </w:rPr>
+        <w:t>is</w:t>
+      </w:r>
+      <w:r>
+        <w:rPr>
+          <w:rFonts w:ascii="Times New Roman" w:eastAsia="Times New Roman" w:hAnsi="Times New Roman" w:cs="Times New Roman"/>
+          <w:color w:val="000000"/>
+          <w:kern w:val="0"/>
+          <w14:ligatures w14:val="none"/>
+        </w:rPr>
+        <w:t xml:space="preserve"> also the highest. These two results together mean Random Forest is the best model both at its operating point and across all possible thresholds.</w:t>
+      </w:r>
+    </w:p>
+    <w:p>
+      <w:pPr>
+        <w:spacing w:before="100" w:beforeAutospacing="1" w:after="100" w:afterAutospacing="1" w:line="240" w:lineRule="auto"/>
+        <w:outlineLvl w:val="1"/>
+        <w:rPr>
+          <w:rFonts w:ascii="Times New Roman" w:eastAsia="Times New Roman" w:hAnsi="Times New Roman" w:cs="Times New Roman"/>
+          <w:color w:val="000000"/>
+          <w:kern w:val="0"/>
+          <w14:ligatures w14:val="none"/>
+        </w:rPr>
+      </w:pPr>
+      <w:r>
+        <w:rPr>
+          <w:rFonts w:ascii="Times New Roman" w:eastAsia="Times New Roman" w:hAnsi="Times New Roman" w:cs="Times New Roman"/>
+          <w:color w:val="000000"/>
+          <w:kern w:val="0"/>
+          <w14:ligatures w14:val="none"/>
+        </w:rPr>
+        <w:t xml:space="preserve">Random Forest's precision of 0.5267 means over half its fraud alerts are genuine </w:t>
+      </w:r>
+      <w:r>
+        <w:rPr>
+          <w:rFonts w:ascii="Times New Roman" w:eastAsia="Times New Roman" w:hAnsi="Times New Roman" w:cs="Times New Roman"/>
+          <w:color w:val="000000"/>
+          <w:kern w:val="0"/>
+          <w14:ligatures w14:val="none"/>
+        </w:rPr>
+        <w:t>and</w:t>
+      </w:r>
+      <w:r>
+        <w:rPr>
+          <w:rFonts w:ascii="Times New Roman" w:eastAsia="Times New Roman" w:hAnsi="Times New Roman" w:cs="Times New Roman"/>
+          <w:color w:val="000000"/>
+          <w:kern w:val="0"/>
+          <w14:ligatures w14:val="none"/>
+        </w:rPr>
+        <w:t xml:space="preserve"> far better than Logistic Regression (0.0520), KNN (0.0710), and Decision Tree (0.0847). Combined with its recall of 0.8316, it provides the best overall balance between catching fraud and avoiding false alarms.</w:t>
+      </w:r>
+    </w:p>
+    <w:p>
+      <w:pPr>
+        <w:spacing w:before="100" w:beforeAutospacing="1" w:after="100" w:afterAutospacing="1" w:line="240" w:lineRule="auto"/>
+        <w:outlineLvl w:val="1"/>
+        <w:rPr>
+          <w:rFonts w:ascii="Times New Roman" w:eastAsia="Times New Roman" w:hAnsi="Times New Roman" w:cs="Times New Roman"/>
+          <w:color w:val="000000"/>
+          <w:kern w:val="0"/>
+          <w14:ligatures w14:val="none"/>
+        </w:rPr>
+      </w:pPr>
+      <w:r>
+        <w:rPr>
+          <w:rFonts w:ascii="Times New Roman" w:eastAsia="Times New Roman" w:hAnsi="Times New Roman" w:cs="Times New Roman"/>
+          <w:color w:val="000000"/>
+          <w:kern w:val="0"/>
+          <w14:ligatures w14:val="none"/>
+        </w:rPr>
+        <w:t xml:space="preserve">Logistic Regression is recommended as a secondary option for high-sensitivity scenarios where recall is the overriding priority </w:t>
+      </w:r>
+      <w:r>
+        <w:rPr>
+          <w:rFonts w:ascii="Times New Roman" w:eastAsia="Times New Roman" w:hAnsi="Times New Roman" w:cs="Times New Roman"/>
+          <w:color w:val="000000"/>
+          <w:kern w:val="0"/>
+          <w14:ligatures w14:val="none"/>
+        </w:rPr>
+        <w:t xml:space="preserve">and </w:t>
+      </w:r>
+      <w:r>
+        <w:rPr>
+          <w:rFonts w:ascii="Times New Roman" w:eastAsia="Times New Roman" w:hAnsi="Times New Roman" w:cs="Times New Roman"/>
+          <w:color w:val="000000"/>
+          <w:kern w:val="0"/>
+          <w14:ligatures w14:val="none"/>
+        </w:rPr>
+        <w:t>its 0.8737 recall is the highest of all models and its ROC-AUC of 0.9628 allows threshold adjustment. Decision Tree is recommended for regulatory reporting and stakeholder explanation due to its visual interpretability.</w:t>
+      </w:r>
+    </w:p>
+    <w:p>
+      <w:pPr>
+        <w:spacing w:before="100" w:beforeAutospacing="1" w:after="100" w:afterAutospacing="1" w:line="240" w:lineRule="auto"/>
+        <w:outlineLvl w:val="1"/>
+        <w:rPr>
+          <w:rFonts w:ascii="Times New Roman" w:eastAsia="Times New Roman" w:hAnsi="Times New Roman" w:cs="Times New Roman"/>
+          <w:color w:val="000000"/>
+          <w:kern w:val="0"/>
+          <w14:ligatures w14:val="none"/>
+        </w:rPr>
+      </w:pPr>
     </w:p>
     <w:p>
       <w:pPr>
@@ -6907,117 +7202,83 @@
           <w:kern w:val="0"/>
           <w14:ligatures w14:val="none"/>
         </w:rPr>
-        <w:t xml:space="preserve">We </w:t>
-      </w:r>
-      <w:r>
-        <w:rPr>
-          <w:rFonts w:ascii="Times New Roman" w:eastAsia="Times New Roman" w:hAnsi="Times New Roman" w:cs="Times New Roman"/>
-          <w:color w:val="000000"/>
-          <w:kern w:val="0"/>
-          <w14:ligatures w14:val="none"/>
-        </w:rPr>
-        <w:t xml:space="preserve">developed a complete, end-to-end machine learning </w:t>
-      </w:r>
-      <w:r>
-        <w:rPr>
-          <w:rFonts w:ascii="Times New Roman" w:eastAsia="Times New Roman" w:hAnsi="Times New Roman" w:cs="Times New Roman"/>
-          <w:color w:val="000000"/>
-          <w:kern w:val="0"/>
-          <w14:ligatures w14:val="none"/>
-        </w:rPr>
-        <w:t>project</w:t>
-      </w:r>
-      <w:r>
-        <w:rPr>
-          <w:rFonts w:ascii="Times New Roman" w:eastAsia="Times New Roman" w:hAnsi="Times New Roman" w:cs="Times New Roman"/>
-          <w:color w:val="000000"/>
-          <w:kern w:val="0"/>
-          <w14:ligatures w14:val="none"/>
-        </w:rPr>
-        <w:t xml:space="preserve"> for credit card fraud detection using real-world transaction data. We addressed the </w:t>
-      </w:r>
-      <w:r>
-        <w:rPr>
-          <w:rFonts w:ascii="Times New Roman" w:eastAsia="Times New Roman" w:hAnsi="Times New Roman" w:cs="Times New Roman"/>
-          <w:color w:val="000000"/>
-          <w:kern w:val="0"/>
-          <w14:ligatures w14:val="none"/>
-        </w:rPr>
-        <w:t>main</w:t>
-      </w:r>
-      <w:r>
-        <w:rPr>
-          <w:rFonts w:ascii="Times New Roman" w:eastAsia="Times New Roman" w:hAnsi="Times New Roman" w:cs="Times New Roman"/>
-          <w:color w:val="000000"/>
-          <w:kern w:val="0"/>
-          <w14:ligatures w14:val="none"/>
-        </w:rPr>
-        <w:t xml:space="preserve"> challenge of severe class imbalance through SMOTE oversampling, applied rigorous preprocessing including duplicate removal and feature scaling, and trained four supervised </w:t>
-      </w:r>
-      <w:r>
-        <w:rPr>
-          <w:rFonts w:ascii="Times New Roman" w:eastAsia="Times New Roman" w:hAnsi="Times New Roman" w:cs="Times New Roman"/>
-          <w:color w:val="000000"/>
-          <w:kern w:val="0"/>
-          <w14:ligatures w14:val="none"/>
-        </w:rPr>
-        <w:t>classifiers:</w:t>
-      </w:r>
-      <w:r>
-        <w:rPr>
-          <w:rFonts w:ascii="Times New Roman" w:eastAsia="Times New Roman" w:hAnsi="Times New Roman" w:cs="Times New Roman"/>
-          <w:color w:val="000000"/>
-          <w:kern w:val="0"/>
-          <w14:ligatures w14:val="none"/>
-        </w:rPr>
-        <w:t xml:space="preserve"> </w:t>
-      </w:r>
-      <w:r>
-        <w:rPr>
-          <w:rFonts w:ascii="Times New Roman" w:eastAsia="Times New Roman" w:hAnsi="Times New Roman" w:cs="Times New Roman"/>
-          <w:color w:val="000000"/>
-          <w:kern w:val="0"/>
-          <w14:ligatures w14:val="none"/>
-        </w:rPr>
-        <w:t>Logistic Regression, Decision Tree, Random Forest and K-Nearest Neighbors.</w:t>
-      </w:r>
-    </w:p>
-    <w:p>
-      <w:pPr>
-        <w:spacing w:before="100" w:beforeAutospacing="1" w:after="100" w:afterAutospacing="1" w:line="240" w:lineRule="auto"/>
-        <w:rPr>
-          <w:rFonts w:ascii="Times New Roman" w:eastAsia="Times New Roman" w:hAnsi="Times New Roman" w:cs="Times New Roman"/>
-          <w:color w:val="000000"/>
-          <w:kern w:val="0"/>
-          <w14:ligatures w14:val="none"/>
-        </w:rPr>
-      </w:pPr>
-      <w:r>
-        <w:rPr>
-          <w:rFonts w:ascii="Times New Roman" w:eastAsia="Times New Roman" w:hAnsi="Times New Roman" w:cs="Times New Roman"/>
-          <w:color w:val="000000"/>
-          <w:kern w:val="0"/>
-          <w14:ligatures w14:val="none"/>
-        </w:rPr>
-        <w:t>All models were evaluated using Precision, Recall, F1-Score</w:t>
-      </w:r>
-      <w:r>
-        <w:rPr>
-          <w:rFonts w:ascii="Times New Roman" w:eastAsia="Times New Roman" w:hAnsi="Times New Roman" w:cs="Times New Roman"/>
-          <w:color w:val="000000"/>
-          <w:kern w:val="0"/>
-          <w14:ligatures w14:val="none"/>
-        </w:rPr>
-        <w:t xml:space="preserve"> </w:t>
-      </w:r>
-      <w:r>
-        <w:rPr>
-          <w:rFonts w:ascii="Times New Roman" w:eastAsia="Times New Roman" w:hAnsi="Times New Roman" w:cs="Times New Roman"/>
-          <w:color w:val="000000"/>
-          <w:kern w:val="0"/>
-          <w14:ligatures w14:val="none"/>
-        </w:rPr>
-        <w:t>and ROC-AUC rather than accuracy, reflecting the unsuitability of accuracy as a metric for imbalanced classification problems. A model that always predicts "legitimate" would achieve 99.83% accuracy while catching zero fraud</w:t>
+        <w:t xml:space="preserve">We developed a complete, end-to-end machine learning pipeline for credit card fraud detection using real-world transaction data. We addressed the core challenge of severe class imbalance through a carefully ordered preprocessing pipeline: clean, split, scale, then SMOTE </w:t>
+      </w:r>
+      <w:r>
+        <w:rPr>
+          <w:rFonts w:ascii="Times New Roman" w:eastAsia="Times New Roman" w:hAnsi="Times New Roman" w:cs="Times New Roman"/>
+          <w:color w:val="000000"/>
+          <w:kern w:val="0"/>
+          <w14:ligatures w14:val="none"/>
+        </w:rPr>
+        <w:t xml:space="preserve">with </w:t>
+      </w:r>
+      <w:r>
+        <w:rPr>
+          <w:rFonts w:ascii="Times New Roman" w:eastAsia="Times New Roman" w:hAnsi="Times New Roman" w:cs="Times New Roman"/>
+          <w:color w:val="000000"/>
+          <w:kern w:val="0"/>
+          <w14:ligatures w14:val="none"/>
+        </w:rPr>
+        <w:t xml:space="preserve"> each step in that specific order to prevent data leakage.</w:t>
+      </w:r>
+    </w:p>
+    <w:p>
+      <w:pPr>
+        <w:spacing w:before="100" w:beforeAutospacing="1" w:after="100" w:afterAutospacing="1" w:line="240" w:lineRule="auto"/>
+        <w:rPr>
+          <w:rFonts w:ascii="Times New Roman" w:eastAsia="Times New Roman" w:hAnsi="Times New Roman" w:cs="Times New Roman"/>
+          <w:color w:val="000000"/>
+          <w:kern w:val="0"/>
+          <w14:ligatures w14:val="none"/>
+        </w:rPr>
+      </w:pPr>
+      <w:r>
+        <w:rPr>
+          <w:rFonts w:ascii="Times New Roman" w:eastAsia="Times New Roman" w:hAnsi="Times New Roman" w:cs="Times New Roman"/>
+          <w:color w:val="000000"/>
+          <w:kern w:val="0"/>
+          <w14:ligatures w14:val="none"/>
+        </w:rPr>
+        <w:t xml:space="preserve">All four models were evaluated using Precision, Recall, F1-Score, and ROC-AUC rather than accuracy. We provided visual proof through a 7-chart analysis that accuracy is meaningless on this dataset </w:t>
+      </w:r>
+      <w:r>
+        <w:rPr>
+          <w:rFonts w:ascii="Times New Roman" w:eastAsia="Times New Roman" w:hAnsi="Times New Roman" w:cs="Times New Roman"/>
+          <w:color w:val="000000"/>
+          <w:kern w:val="0"/>
+          <w14:ligatures w14:val="none"/>
+        </w:rPr>
+        <w:t xml:space="preserve">with </w:t>
+      </w:r>
+      <w:r>
+        <w:rPr>
+          <w:rFonts w:ascii="Times New Roman" w:eastAsia="Times New Roman" w:hAnsi="Times New Roman" w:cs="Times New Roman"/>
+          <w:color w:val="000000"/>
+          <w:kern w:val="0"/>
+          <w14:ligatures w14:val="none"/>
+        </w:rPr>
+        <w:t>a dummy model predicting "legitimate" every time scores 0.9983 accuracy but 0.0000 F1-Score. F1-Score had the largest spread between models (0.547) of any metric, confirming it as the most discriminating and honest measure of model quality for this problem.</w:t>
+      </w:r>
+    </w:p>
+    <w:p>
+      <w:pPr>
+        <w:spacing w:before="100" w:beforeAutospacing="1" w:after="100" w:afterAutospacing="1" w:line="240" w:lineRule="auto"/>
+        <w:rPr>
+          <w:rFonts w:ascii="Times New Roman" w:eastAsia="Times New Roman" w:hAnsi="Times New Roman" w:cs="Times New Roman"/>
+          <w:color w:val="000000"/>
+          <w:kern w:val="0"/>
+          <w14:ligatures w14:val="none"/>
+        </w:rPr>
+      </w:pPr>
+      <w:r>
+        <w:rPr>
+          <w:rFonts w:ascii="Times New Roman" w:eastAsia="Times New Roman" w:hAnsi="Times New Roman" w:cs="Times New Roman"/>
+          <w:color w:val="000000"/>
+          <w:kern w:val="0"/>
+          <w14:ligatures w14:val="none"/>
+        </w:rPr>
+        <w:t>Random Forest emerged as the recommended primary model with the highest F1-Score (0.6449) and highest ROC-AUC (0.9782)</w:t>
       </w:r>
       <w:r>
         <w:rPr>
@@ -7035,66 +7296,39 @@
           <w:kern w:val="0"/>
           <w14:ligatures w14:val="none"/>
         </w:rPr>
-        <w:t>the very baseline our models must meaningfully exceed.</w:t>
-      </w:r>
-    </w:p>
-    <w:p>
-      <w:pPr>
-        <w:spacing w:before="100" w:beforeAutospacing="1" w:after="100" w:afterAutospacing="1" w:line="240" w:lineRule="auto"/>
-        <w:rPr>
-          <w:rFonts w:ascii="Times New Roman" w:eastAsia="Times New Roman" w:hAnsi="Times New Roman" w:cs="Times New Roman"/>
-          <w:color w:val="000000"/>
-          <w:kern w:val="0"/>
-          <w14:ligatures w14:val="none"/>
-        </w:rPr>
-      </w:pPr>
-      <w:r>
-        <w:rPr>
-          <w:rFonts w:ascii="Times New Roman" w:eastAsia="Times New Roman" w:hAnsi="Times New Roman" w:cs="Times New Roman"/>
-          <w:color w:val="000000"/>
-          <w:kern w:val="0"/>
-          <w14:ligatures w14:val="none"/>
-        </w:rPr>
-        <w:t>KNN emerged as the recommended model with the highest F1-Score (0.8171) and exceptional Precision (0.9710), making it the most operationally practical choice for real-world deployment. Random Forest led in ROC-AUC (0.9812) and serves as the best option when threshold tuning is needed to prioritize recall in high-risk scenarios. Logistic Regression provides the highest recall (0.8737) and is valuable as a high-sensitivity first-stage filter. Decision Tree, while lowest in performance metrics, provides unmatched interpretability through its visual tree structure, making it indispensable for regulatory explanation and stakeholder communication.</w:t>
-      </w:r>
-    </w:p>
-    <w:p>
-      <w:pPr>
-        <w:spacing w:before="100" w:beforeAutospacing="1" w:after="100" w:afterAutospacing="1" w:line="240" w:lineRule="auto"/>
-        <w:rPr>
-          <w:rFonts w:ascii="Times New Roman" w:eastAsia="Times New Roman" w:hAnsi="Times New Roman" w:cs="Times New Roman"/>
-          <w:color w:val="000000"/>
-          <w:kern w:val="0"/>
-          <w14:ligatures w14:val="none"/>
-        </w:rPr>
-      </w:pPr>
-      <w:r>
-        <w:rPr>
-          <w:rFonts w:ascii="Times New Roman" w:eastAsia="Times New Roman" w:hAnsi="Times New Roman" w:cs="Times New Roman"/>
-          <w:color w:val="000000"/>
-          <w:kern w:val="0"/>
-          <w14:ligatures w14:val="none"/>
-        </w:rPr>
-        <w:t>Key lessons from this project include the critical importance of evaluation metric selection in imbalanced settings, the value of SMOTE for preserving majority class information while balancing training data, and the insight that no single model is universally best</w:t>
-      </w:r>
-      <w:r>
-        <w:rPr>
-          <w:rFonts w:ascii="Times New Roman" w:eastAsia="Times New Roman" w:hAnsi="Times New Roman" w:cs="Times New Roman"/>
-          <w:color w:val="000000"/>
-          <w:kern w:val="0"/>
-          <w14:ligatures w14:val="none"/>
-        </w:rPr>
-        <w:t>. T</w:t>
-      </w:r>
-      <w:r>
-        <w:rPr>
-          <w:rFonts w:ascii="Times New Roman" w:eastAsia="Times New Roman" w:hAnsi="Times New Roman" w:cs="Times New Roman"/>
-          <w:color w:val="000000"/>
-          <w:kern w:val="0"/>
-          <w14:ligatures w14:val="none"/>
-        </w:rPr>
-        <w:t>he optimal choice depends on the specific cost structure and operational constraints of the deployment environment.</w:t>
-      </w:r>
+        <w:t>dominating on both key metrics simultaneously. Its precision of 0.5267 means over half its alerts are genuine fraud, making it far more operationally practical than Logistic Regression or KNN. Random Forest led in ROC-AUC and serves as the best option when threshold tuning is needed for different deployment scenarios. Logistic Regression provides the highest recall (0.8737) and is valuable as a high-sensitivity first-stage filter. Decision Tree provides unmatched interpretability through its visual tree structure.</w:t>
+      </w:r>
+    </w:p>
+    <w:p>
+      <w:pPr>
+        <w:spacing w:before="100" w:beforeAutospacing="1" w:after="100" w:afterAutospacing="1" w:line="240" w:lineRule="auto"/>
+        <w:rPr>
+          <w:rFonts w:ascii="Times New Roman" w:eastAsia="Times New Roman" w:hAnsi="Times New Roman" w:cs="Times New Roman"/>
+          <w:color w:val="000000"/>
+          <w:kern w:val="0"/>
+          <w14:ligatures w14:val="none"/>
+        </w:rPr>
+      </w:pPr>
+      <w:r>
+        <w:rPr>
+          <w:rFonts w:ascii="Times New Roman" w:eastAsia="Times New Roman" w:hAnsi="Times New Roman" w:cs="Times New Roman"/>
+          <w:color w:val="000000"/>
+          <w:kern w:val="0"/>
+          <w14:ligatures w14:val="none"/>
+        </w:rPr>
+        <w:t>The addition of GridSearchCV across all four models was a significant improvement. Systematic hyperparameter tuning through cross-validation, rather than fixed parameters, produced better-justified and more reproducible results across all models.</w:t>
+      </w:r>
+    </w:p>
+    <w:p>
+      <w:pPr>
+        <w:spacing w:before="100" w:beforeAutospacing="1" w:after="100" w:afterAutospacing="1" w:line="240" w:lineRule="auto"/>
+        <w:rPr>
+          <w:rFonts w:ascii="Times New Roman" w:eastAsia="Times New Roman" w:hAnsi="Times New Roman" w:cs="Times New Roman"/>
+          <w:color w:val="000000"/>
+          <w:kern w:val="0"/>
+          <w14:ligatures w14:val="none"/>
+        </w:rPr>
+      </w:pPr>
     </w:p>
     <w:p>
       <w:pPr>
@@ -7114,7 +7348,63 @@
           <w14:ligatures w14:val="none"/>
         </w:rPr>
         <w:lastRenderedPageBreak/>
-        <w:t>If we were to extend this work, we'd explore more advanced techniques like XGBoost or neural networks, try more sophisticated threshold optimization strategies and look at whether combining models in an ensemble pipeline (using LR as a filter, KNN as a classifier) could push performance even further. But as a foundation, we're satisfied that this pipeline is solid, well-justified, and produces genuinely useful results.</w:t>
+        <w:t xml:space="preserve">The biggest takeaway from this project is that metric selection is as important as model selection. Accuracy is genuinely meaningless when data is this imbalanced. F1-Score forces a balance between catching fraud and avoiding false alarms </w:t>
+      </w:r>
+      <w:r>
+        <w:rPr>
+          <w:rFonts w:ascii="Times New Roman" w:eastAsia="Times New Roman" w:hAnsi="Times New Roman" w:cs="Times New Roman"/>
+          <w:color w:val="000000"/>
+          <w:kern w:val="0"/>
+          <w14:ligatures w14:val="none"/>
+        </w:rPr>
+        <w:t xml:space="preserve">which </w:t>
+      </w:r>
+      <w:r>
+        <w:rPr>
+          <w:rFonts w:ascii="Times New Roman" w:eastAsia="Times New Roman" w:hAnsi="Times New Roman" w:cs="Times New Roman"/>
+          <w:color w:val="000000"/>
+          <w:kern w:val="0"/>
+          <w14:ligatures w14:val="none"/>
+        </w:rPr>
+        <w:t>reflect</w:t>
+      </w:r>
+      <w:r>
+        <w:rPr>
+          <w:rFonts w:ascii="Times New Roman" w:eastAsia="Times New Roman" w:hAnsi="Times New Roman" w:cs="Times New Roman"/>
+          <w:color w:val="000000"/>
+          <w:kern w:val="0"/>
+          <w14:ligatures w14:val="none"/>
+        </w:rPr>
+        <w:t>s</w:t>
+      </w:r>
+      <w:r>
+        <w:rPr>
+          <w:rFonts w:ascii="Times New Roman" w:eastAsia="Times New Roman" w:hAnsi="Times New Roman" w:cs="Times New Roman"/>
+          <w:color w:val="000000"/>
+          <w:kern w:val="0"/>
+          <w14:ligatures w14:val="none"/>
+        </w:rPr>
+        <w:t xml:space="preserve"> the real cost structure of fraud detection where both types of errors matter.</w:t>
+      </w:r>
+    </w:p>
+    <w:p>
+      <w:pPr>
+        <w:spacing w:before="100" w:beforeAutospacing="1" w:after="100" w:afterAutospacing="1" w:line="240" w:lineRule="auto"/>
+        <w:rPr>
+          <w:rFonts w:ascii="Times New Roman" w:eastAsia="Times New Roman" w:hAnsi="Times New Roman" w:cs="Times New Roman"/>
+          <w:color w:val="000000"/>
+          <w:kern w:val="0"/>
+          <w14:ligatures w14:val="none"/>
+        </w:rPr>
+      </w:pPr>
+      <w:r>
+        <w:rPr>
+          <w:rFonts w:ascii="Times New Roman" w:eastAsia="Times New Roman" w:hAnsi="Times New Roman" w:cs="Times New Roman"/>
+          <w:color w:val="000000"/>
+          <w:kern w:val="0"/>
+          <w14:ligatures w14:val="none"/>
+        </w:rPr>
+        <w:t>If we were to extend this work, we would explore more advanced techniques like XGBoost or neural networks, try more sophisticated threshold optimization strategies, and look at whether combining models in a pipeline (using Logistic Regression as a first-pass filter, KNN as a precision classifier) could push performance even further.</w:t>
       </w:r>
     </w:p>
     <w:p>
@@ -7132,7 +7422,7 @@
           <w:noProof/>
           <w:kern w:val="0"/>
         </w:rPr>
-        <w:pict w14:anchorId="418DCEBE">
+        <w:pict w14:anchorId="159A291B">
           <v:rect id="_x0000_i1026" alt="" style="width:468pt;height:.05pt;mso-width-percent:0;mso-height-percent:0;mso-width-percent:0;mso-height-percent:0" o:hralign="center" o:hrstd="t" o:hr="t" fillcolor="#a0a0a0" stroked="f"/>
         </w:pict>
       </w:r>
@@ -7511,7 +7801,7 @@
         <w:rPr>
           <w:noProof/>
         </w:rPr>
-        <w:pict w14:anchorId="2AEA0E49">
+        <w:pict w14:anchorId="67DBBACF">
           <v:rect id="_x0000_i1025" alt="" style="width:468pt;height:.05pt;mso-width-percent:0;mso-height-percent:0;mso-width-percent:0;mso-height-percent:0" o:hralign="center" o:hrstd="t" o:hr="t" fillcolor="#a0a0a0" stroked="f"/>
         </w:pict>
       </w:r>
@@ -7569,7 +7859,7 @@
           <w14:ligatures w14:val="none"/>
         </w:rPr>
       </w:pPr>
-      <w:hyperlink r:id="rId20" w:history="1">
+      <w:hyperlink r:id="rId22" w:history="1">
         <w:r>
           <w:rPr>
             <w:rStyle w:val="Hyperlink"/>
@@ -8404,7 +8694,7 @@
   <w:abstractNum w:abstractNumId="6" w15:restartNumberingAfterBreak="0">
     <w:nsid w:val="36690E48"/>
     <w:multiLevelType w:val="multilevel"/>
-    <w:tmpl w:val="2F683454"/>
+    <w:tmpl w:val="029EE5BA"/>
     <w:lvl w:ilvl="0">
       <w:start w:val="1"/>
       <w:numFmt w:val="bullet"/>
@@ -8421,20 +8711,17 @@
         <w:sz w:val="20"/>
       </w:rPr>
     </w:lvl>
-    <w:lvl w:ilvl="1" w:tentative="1">
-      <w:start w:val="1"/>
-      <w:numFmt w:val="bullet"/>
-      <w:lvlText w:val="o"/>
-      <w:lvlJc w:val="left"/>
-      <w:pPr>
-        <w:tabs>
-          <w:tab w:val="num" w:pos="1440"/>
-        </w:tabs>
+    <w:lvl w:ilvl="1">
+      <w:start w:val="1"/>
+      <w:numFmt w:val="decimal"/>
+      <w:lvlText w:val="%2."/>
+      <w:lvlJc w:val="left"/>
+      <w:pPr>
         <w:ind w:left="1440" w:hanging="360"/>
       </w:pPr>
       <w:rPr>
-        <w:rFonts w:ascii="Courier New" w:hAnsi="Courier New" w:hint="default"/>
-        <w:sz w:val="20"/>
+        <w:rFonts w:hint="default"/>
+        <w:b/>
       </w:rPr>
     </w:lvl>
     <w:lvl w:ilvl="2" w:tentative="1">
@@ -9855,6 +10142,7 @@
   <w:style w:type="paragraph" w:default="1" w:styleId="Normal">
     <w:name w:val="Normal"/>
     <w:qFormat/>
+    <w:rsid w:val="00CF7EAB"/>
   </w:style>
   <w:style w:type="paragraph" w:styleId="Heading1">
     <w:name w:val="heading 1"/>

</xml_diff>